<commit_message>
Day 3 Exam Break
Friday Day 3 break 11:00
</commit_message>
<xml_diff>
--- a/Task 1/Task 1b/Task1_DesignDocs_VisualDesigns_LL-000020914_Naser_A.docx
+++ b/Task 1/Task 1b/Task1_DesignDocs_VisualDesigns_LL-000020914_Naser_A.docx
@@ -401,19 +401,517 @@
           </w:r>
         </w:p>
         <w:p>
-          <w:fldSimple w:instr=" TOC \o &quot;1-3&quot; \h \z \u ">
-            <w:r>
-              <w:rPr>
-                <w:b/>
-                <w:bCs/>
+          <w:pPr>
+            <w:pStyle w:val="TOC1"/>
+            <w:tabs>
+              <w:tab w:val="right" w:leader="dot" w:pos="10456"/>
+            </w:tabs>
+            <w:rPr>
+              <w:rFonts w:eastAsiaTheme="minorEastAsia"/>
+              <w:noProof/>
+              <w:lang w:eastAsia="en-GB"/>
+            </w:rPr>
+          </w:pPr>
+          <w:r>
+            <w:fldChar w:fldCharType="begin"/>
+          </w:r>
+          <w:r>
+            <w:instrText xml:space="preserve"> TOC \o "1-3" \h \z \u </w:instrText>
+          </w:r>
+          <w:r>
+            <w:fldChar w:fldCharType="separate"/>
+          </w:r>
+          <w:hyperlink w:anchor="_Toc224291313" w:history="1">
+            <w:r>
+              <w:rPr>
+                <w:rStyle w:val="Hyperlink"/>
                 <w:noProof/>
               </w:rPr>
-              <w:t>No table of contents entries found.</w:t>
-            </w:r>
-          </w:fldSimple>
+              <w:t>Site Map</w:t>
+            </w:r>
+            <w:r>
+              <w:rPr>
+                <w:noProof/>
+                <w:webHidden/>
+              </w:rPr>
+              <w:tab/>
+            </w:r>
+            <w:r>
+              <w:rPr>
+                <w:noProof/>
+                <w:webHidden/>
+              </w:rPr>
+              <w:fldChar w:fldCharType="begin"/>
+            </w:r>
+            <w:r>
+              <w:rPr>
+                <w:noProof/>
+                <w:webHidden/>
+              </w:rPr>
+              <w:instrText xml:space="preserve"> PAGEREF _Toc224291313 \h </w:instrText>
+            </w:r>
+            <w:r>
+              <w:rPr>
+                <w:noProof/>
+                <w:webHidden/>
+              </w:rPr>
+            </w:r>
+            <w:r>
+              <w:rPr>
+                <w:noProof/>
+                <w:webHidden/>
+              </w:rPr>
+              <w:fldChar w:fldCharType="separate"/>
+            </w:r>
+            <w:r>
+              <w:rPr>
+                <w:noProof/>
+                <w:webHidden/>
+              </w:rPr>
+              <w:t>2</w:t>
+            </w:r>
+            <w:r>
+              <w:rPr>
+                <w:noProof/>
+                <w:webHidden/>
+              </w:rPr>
+              <w:fldChar w:fldCharType="end"/>
+            </w:r>
+          </w:hyperlink>
+        </w:p>
+        <w:p>
+          <w:pPr>
+            <w:pStyle w:val="TOC1"/>
+            <w:tabs>
+              <w:tab w:val="right" w:leader="dot" w:pos="10456"/>
+            </w:tabs>
+            <w:rPr>
+              <w:rFonts w:eastAsiaTheme="minorEastAsia"/>
+              <w:noProof/>
+              <w:lang w:eastAsia="en-GB"/>
+            </w:rPr>
+          </w:pPr>
+          <w:hyperlink w:anchor="_Toc224291314" w:history="1">
+            <w:r>
+              <w:rPr>
+                <w:rStyle w:val="Hyperlink"/>
+                <w:noProof/>
+              </w:rPr>
+              <w:t>Wireframe Designs</w:t>
+            </w:r>
+            <w:r>
+              <w:rPr>
+                <w:noProof/>
+                <w:webHidden/>
+              </w:rPr>
+              <w:tab/>
+            </w:r>
+            <w:r>
+              <w:rPr>
+                <w:noProof/>
+                <w:webHidden/>
+              </w:rPr>
+              <w:fldChar w:fldCharType="begin"/>
+            </w:r>
+            <w:r>
+              <w:rPr>
+                <w:noProof/>
+                <w:webHidden/>
+              </w:rPr>
+              <w:instrText xml:space="preserve"> PAGEREF _Toc224291314 \h </w:instrText>
+            </w:r>
+            <w:r>
+              <w:rPr>
+                <w:noProof/>
+                <w:webHidden/>
+              </w:rPr>
+            </w:r>
+            <w:r>
+              <w:rPr>
+                <w:noProof/>
+                <w:webHidden/>
+              </w:rPr>
+              <w:fldChar w:fldCharType="separate"/>
+            </w:r>
+            <w:r>
+              <w:rPr>
+                <w:noProof/>
+                <w:webHidden/>
+              </w:rPr>
+              <w:t>2</w:t>
+            </w:r>
+            <w:r>
+              <w:rPr>
+                <w:noProof/>
+                <w:webHidden/>
+              </w:rPr>
+              <w:fldChar w:fldCharType="end"/>
+            </w:r>
+          </w:hyperlink>
+        </w:p>
+        <w:p>
+          <w:pPr>
+            <w:pStyle w:val="TOC1"/>
+            <w:tabs>
+              <w:tab w:val="right" w:leader="dot" w:pos="10456"/>
+            </w:tabs>
+            <w:rPr>
+              <w:rFonts w:eastAsiaTheme="minorEastAsia"/>
+              <w:noProof/>
+              <w:lang w:eastAsia="en-GB"/>
+            </w:rPr>
+          </w:pPr>
+          <w:hyperlink w:anchor="_Toc224291315" w:history="1">
+            <w:r>
+              <w:rPr>
+                <w:rStyle w:val="Hyperlink"/>
+                <w:noProof/>
+              </w:rPr>
+              <w:t>Algorithm Designs</w:t>
+            </w:r>
+            <w:r>
+              <w:rPr>
+                <w:noProof/>
+                <w:webHidden/>
+              </w:rPr>
+              <w:tab/>
+            </w:r>
+            <w:r>
+              <w:rPr>
+                <w:noProof/>
+                <w:webHidden/>
+              </w:rPr>
+              <w:fldChar w:fldCharType="begin"/>
+            </w:r>
+            <w:r>
+              <w:rPr>
+                <w:noProof/>
+                <w:webHidden/>
+              </w:rPr>
+              <w:instrText xml:space="preserve"> PAGEREF _Toc224291315 \h </w:instrText>
+            </w:r>
+            <w:r>
+              <w:rPr>
+                <w:noProof/>
+                <w:webHidden/>
+              </w:rPr>
+            </w:r>
+            <w:r>
+              <w:rPr>
+                <w:noProof/>
+                <w:webHidden/>
+              </w:rPr>
+              <w:fldChar w:fldCharType="separate"/>
+            </w:r>
+            <w:r>
+              <w:rPr>
+                <w:noProof/>
+                <w:webHidden/>
+              </w:rPr>
+              <w:t>2</w:t>
+            </w:r>
+            <w:r>
+              <w:rPr>
+                <w:noProof/>
+                <w:webHidden/>
+              </w:rPr>
+              <w:fldChar w:fldCharType="end"/>
+            </w:r>
+          </w:hyperlink>
+        </w:p>
+        <w:p>
+          <w:pPr>
+            <w:pStyle w:val="TOC1"/>
+            <w:tabs>
+              <w:tab w:val="right" w:leader="dot" w:pos="10456"/>
+            </w:tabs>
+            <w:rPr>
+              <w:rFonts w:eastAsiaTheme="minorEastAsia"/>
+              <w:noProof/>
+              <w:lang w:eastAsia="en-GB"/>
+            </w:rPr>
+          </w:pPr>
+          <w:hyperlink w:anchor="_Toc224291316" w:history="1">
+            <w:r>
+              <w:rPr>
+                <w:rStyle w:val="Hyperlink"/>
+                <w:noProof/>
+              </w:rPr>
+              <w:t>Database Diagram Design</w:t>
+            </w:r>
+            <w:r>
+              <w:rPr>
+                <w:noProof/>
+                <w:webHidden/>
+              </w:rPr>
+              <w:tab/>
+            </w:r>
+            <w:r>
+              <w:rPr>
+                <w:noProof/>
+                <w:webHidden/>
+              </w:rPr>
+              <w:fldChar w:fldCharType="begin"/>
+            </w:r>
+            <w:r>
+              <w:rPr>
+                <w:noProof/>
+                <w:webHidden/>
+              </w:rPr>
+              <w:instrText xml:space="preserve"> PAGEREF _Toc224291316 \h </w:instrText>
+            </w:r>
+            <w:r>
+              <w:rPr>
+                <w:noProof/>
+                <w:webHidden/>
+              </w:rPr>
+            </w:r>
+            <w:r>
+              <w:rPr>
+                <w:noProof/>
+                <w:webHidden/>
+              </w:rPr>
+              <w:fldChar w:fldCharType="separate"/>
+            </w:r>
+            <w:r>
+              <w:rPr>
+                <w:noProof/>
+                <w:webHidden/>
+              </w:rPr>
+              <w:t>2</w:t>
+            </w:r>
+            <w:r>
+              <w:rPr>
+                <w:noProof/>
+                <w:webHidden/>
+              </w:rPr>
+              <w:fldChar w:fldCharType="end"/>
+            </w:r>
+          </w:hyperlink>
+        </w:p>
+        <w:p>
+          <w:pPr>
+            <w:pStyle w:val="TOC1"/>
+            <w:tabs>
+              <w:tab w:val="right" w:leader="dot" w:pos="10456"/>
+            </w:tabs>
+            <w:rPr>
+              <w:rFonts w:eastAsiaTheme="minorEastAsia"/>
+              <w:noProof/>
+              <w:lang w:eastAsia="en-GB"/>
+            </w:rPr>
+          </w:pPr>
+          <w:hyperlink w:anchor="_Toc224291317" w:history="1">
+            <w:r>
+              <w:rPr>
+                <w:rStyle w:val="Hyperlink"/>
+                <w:noProof/>
+              </w:rPr>
+              <w:t>Data Dictionary</w:t>
+            </w:r>
+            <w:r>
+              <w:rPr>
+                <w:noProof/>
+                <w:webHidden/>
+              </w:rPr>
+              <w:tab/>
+            </w:r>
+            <w:r>
+              <w:rPr>
+                <w:noProof/>
+                <w:webHidden/>
+              </w:rPr>
+              <w:fldChar w:fldCharType="begin"/>
+            </w:r>
+            <w:r>
+              <w:rPr>
+                <w:noProof/>
+                <w:webHidden/>
+              </w:rPr>
+              <w:instrText xml:space="preserve"> PAGEREF _Toc224291317 \h </w:instrText>
+            </w:r>
+            <w:r>
+              <w:rPr>
+                <w:noProof/>
+                <w:webHidden/>
+              </w:rPr>
+            </w:r>
+            <w:r>
+              <w:rPr>
+                <w:noProof/>
+                <w:webHidden/>
+              </w:rPr>
+              <w:fldChar w:fldCharType="separate"/>
+            </w:r>
+            <w:r>
+              <w:rPr>
+                <w:noProof/>
+                <w:webHidden/>
+              </w:rPr>
+              <w:t>2</w:t>
+            </w:r>
+            <w:r>
+              <w:rPr>
+                <w:noProof/>
+                <w:webHidden/>
+              </w:rPr>
+              <w:fldChar w:fldCharType="end"/>
+            </w:r>
+          </w:hyperlink>
+        </w:p>
+        <w:p>
+          <w:pPr>
+            <w:pStyle w:val="TOC2"/>
+            <w:tabs>
+              <w:tab w:val="right" w:leader="dot" w:pos="10456"/>
+            </w:tabs>
+            <w:rPr>
+              <w:rFonts w:eastAsiaTheme="minorEastAsia"/>
+              <w:noProof/>
+              <w:lang w:eastAsia="en-GB"/>
+            </w:rPr>
+          </w:pPr>
+          <w:hyperlink w:anchor="_Toc224291318" w:history="1">
+            <w:r>
+              <w:rPr>
+                <w:rStyle w:val="Hyperlink"/>
+                <w:noProof/>
+              </w:rPr>
+              <w:t>MVC System Data Dictionary</w:t>
+            </w:r>
+            <w:r>
+              <w:rPr>
+                <w:noProof/>
+                <w:webHidden/>
+              </w:rPr>
+              <w:tab/>
+            </w:r>
+            <w:r>
+              <w:rPr>
+                <w:noProof/>
+                <w:webHidden/>
+              </w:rPr>
+              <w:fldChar w:fldCharType="begin"/>
+            </w:r>
+            <w:r>
+              <w:rPr>
+                <w:noProof/>
+                <w:webHidden/>
+              </w:rPr>
+              <w:instrText xml:space="preserve"> PAGEREF _Toc224291318 \h </w:instrText>
+            </w:r>
+            <w:r>
+              <w:rPr>
+                <w:noProof/>
+                <w:webHidden/>
+              </w:rPr>
+            </w:r>
+            <w:r>
+              <w:rPr>
+                <w:noProof/>
+                <w:webHidden/>
+              </w:rPr>
+              <w:fldChar w:fldCharType="separate"/>
+            </w:r>
+            <w:r>
+              <w:rPr>
+                <w:noProof/>
+                <w:webHidden/>
+              </w:rPr>
+              <w:t>2</w:t>
+            </w:r>
+            <w:r>
+              <w:rPr>
+                <w:noProof/>
+                <w:webHidden/>
+              </w:rPr>
+              <w:fldChar w:fldCharType="end"/>
+            </w:r>
+          </w:hyperlink>
+        </w:p>
+        <w:p>
+          <w:pPr>
+            <w:pStyle w:val="TOC2"/>
+            <w:tabs>
+              <w:tab w:val="right" w:leader="dot" w:pos="10456"/>
+            </w:tabs>
+            <w:rPr>
+              <w:rFonts w:eastAsiaTheme="minorEastAsia"/>
+              <w:noProof/>
+              <w:lang w:eastAsia="en-GB"/>
+            </w:rPr>
+          </w:pPr>
+          <w:hyperlink w:anchor="_Toc224291319" w:history="1">
+            <w:r>
+              <w:rPr>
+                <w:rStyle w:val="Hyperlink"/>
+                <w:noProof/>
+              </w:rPr>
+              <w:t>Greenfield Local Hub Data Dictionary</w:t>
+            </w:r>
+            <w:r>
+              <w:rPr>
+                <w:noProof/>
+                <w:webHidden/>
+              </w:rPr>
+              <w:tab/>
+            </w:r>
+            <w:r>
+              <w:rPr>
+                <w:noProof/>
+                <w:webHidden/>
+              </w:rPr>
+              <w:fldChar w:fldCharType="begin"/>
+            </w:r>
+            <w:r>
+              <w:rPr>
+                <w:noProof/>
+                <w:webHidden/>
+              </w:rPr>
+              <w:instrText xml:space="preserve"> PAGEREF _Toc224291319 \h </w:instrText>
+            </w:r>
+            <w:r>
+              <w:rPr>
+                <w:noProof/>
+                <w:webHidden/>
+              </w:rPr>
+            </w:r>
+            <w:r>
+              <w:rPr>
+                <w:noProof/>
+                <w:webHidden/>
+              </w:rPr>
+              <w:fldChar w:fldCharType="separate"/>
+            </w:r>
+            <w:r>
+              <w:rPr>
+                <w:noProof/>
+                <w:webHidden/>
+              </w:rPr>
+              <w:t>4</w:t>
+            </w:r>
+            <w:r>
+              <w:rPr>
+                <w:noProof/>
+                <w:webHidden/>
+              </w:rPr>
+              <w:fldChar w:fldCharType="end"/>
+            </w:r>
+          </w:hyperlink>
+        </w:p>
+        <w:p>
+          <w:r>
+            <w:rPr>
+              <w:b/>
+              <w:bCs/>
+            </w:rPr>
+            <w:fldChar w:fldCharType="end"/>
+          </w:r>
         </w:p>
       </w:sdtContent>
     </w:sdt>
+    <w:p/>
+    <w:p/>
     <w:p/>
     <w:p/>
     <w:p/>
@@ -447,8 +945,48 @@
       <w:pPr>
         <w:pStyle w:val="Heading1"/>
       </w:pPr>
+      <w:bookmarkStart w:id="0" w:name="_Toc224291313"/>
       <w:r>
         <w:t>Site Map</w:t>
+      </w:r>
+      <w:bookmarkEnd w:id="0"/>
+    </w:p>
+    <w:p/>
+    <w:p/>
+    <w:p/>
+    <w:p>
+      <w:pPr>
+        <w:pStyle w:val="Heading1"/>
+      </w:pPr>
+      <w:bookmarkStart w:id="1" w:name="_Toc224291314"/>
+      <w:r>
+        <w:t>Wireframe Designs</w:t>
+      </w:r>
+      <w:bookmarkEnd w:id="1"/>
+    </w:p>
+    <w:p/>
+    <w:p/>
+    <w:p/>
+    <w:p>
+      <w:pPr>
+        <w:pStyle w:val="Heading1"/>
+      </w:pPr>
+      <w:bookmarkStart w:id="2" w:name="_Toc224291315"/>
+      <w:r>
+        <w:t>Algorithm Designs</w:t>
+      </w:r>
+      <w:bookmarkEnd w:id="2"/>
+      <w:r>
+        <w:t xml:space="preserve"> (Flowcharts)</w:t>
+      </w:r>
+    </w:p>
+    <w:p/>
+    <w:p>
+      <w:pPr>
+        <w:pStyle w:val="Subtitle"/>
+      </w:pPr>
+      <w:r>
+        <w:t>Register Flowchart</w:t>
       </w:r>
     </w:p>
     <w:p/>
@@ -458,28 +996,7 @@
       <w:pPr>
         <w:pStyle w:val="Heading1"/>
       </w:pPr>
-      <w:r>
-        <w:t>Wireframe Designs</w:t>
-      </w:r>
-    </w:p>
-    <w:p/>
-    <w:p/>
-    <w:p/>
-    <w:p>
-      <w:pPr>
-        <w:pStyle w:val="Heading1"/>
-      </w:pPr>
-      <w:r>
-        <w:t>Algorithm Designs</w:t>
-      </w:r>
-    </w:p>
-    <w:p/>
-    <w:p/>
-    <w:p/>
-    <w:p>
-      <w:pPr>
-        <w:pStyle w:val="Heading1"/>
-      </w:pPr>
+      <w:bookmarkStart w:id="3" w:name="_Toc224291316"/>
       <w:r>
         <w:t xml:space="preserve">Database </w:t>
       </w:r>
@@ -489,6 +1006,7 @@
       <w:r>
         <w:t>Design</w:t>
       </w:r>
+      <w:bookmarkEnd w:id="3"/>
     </w:p>
     <w:p/>
     <w:p/>
@@ -497,17 +1015,24 @@
       <w:pPr>
         <w:pStyle w:val="Heading1"/>
       </w:pPr>
+      <w:bookmarkStart w:id="4" w:name="_Toc224291317"/>
       <w:r>
         <w:t>Data Dictionary</w:t>
       </w:r>
+      <w:bookmarkEnd w:id="4"/>
     </w:p>
     <w:p/>
     <w:p>
       <w:pPr>
         <w:pStyle w:val="Heading2"/>
       </w:pPr>
+      <w:bookmarkStart w:id="5" w:name="_Toc224291318"/>
       <w:r>
-        <w:t xml:space="preserve">MVC System Data Dictionary </w:t>
+        <w:t>MVC System Data Dictionary</w:t>
+      </w:r>
+      <w:bookmarkEnd w:id="5"/>
+      <w:r>
+        <w:t xml:space="preserve"> </w:t>
       </w:r>
     </w:p>
     <w:p/>
@@ -526,9 +1051,9 @@
         <w:tblLook w:val="04A0" w:firstRow="1" w:lastRow="0" w:firstColumn="1" w:lastColumn="0" w:noHBand="0" w:noVBand="1"/>
       </w:tblPr>
       <w:tblGrid>
-        <w:gridCol w:w="3065"/>
-        <w:gridCol w:w="1058"/>
-        <w:gridCol w:w="3568"/>
+        <w:gridCol w:w="2466"/>
+        <w:gridCol w:w="1197"/>
+        <w:gridCol w:w="4028"/>
         <w:gridCol w:w="770"/>
         <w:gridCol w:w="874"/>
         <w:gridCol w:w="1150"/>
@@ -536,7 +1061,7 @@
       <w:tr>
         <w:tc>
           <w:tcPr>
-            <w:tcW w:w="3065" w:type="dxa"/>
+            <w:tcW w:w="2405" w:type="dxa"/>
             <w:shd w:val="clear" w:color="auto" w:fill="323E4F" w:themeFill="text2" w:themeFillShade="BF"/>
           </w:tcPr>
           <w:p>
@@ -559,7 +1084,7 @@
         </w:tc>
         <w:tc>
           <w:tcPr>
-            <w:tcW w:w="1058" w:type="dxa"/>
+            <w:tcW w:w="1200" w:type="dxa"/>
             <w:shd w:val="clear" w:color="auto" w:fill="323E4F" w:themeFill="text2" w:themeFillShade="BF"/>
           </w:tcPr>
           <w:p>
@@ -582,7 +1107,7 @@
         </w:tc>
         <w:tc>
           <w:tcPr>
-            <w:tcW w:w="3568" w:type="dxa"/>
+            <w:tcW w:w="4086" w:type="dxa"/>
             <w:shd w:val="clear" w:color="auto" w:fill="323E4F" w:themeFill="text2" w:themeFillShade="BF"/>
           </w:tcPr>
           <w:p>
@@ -676,7 +1201,7 @@
       <w:tr>
         <w:tc>
           <w:tcPr>
-            <w:tcW w:w="3065" w:type="dxa"/>
+            <w:tcW w:w="2405" w:type="dxa"/>
           </w:tcPr>
           <w:p>
             <w:r>
@@ -686,7 +1211,7 @@
         </w:tc>
         <w:tc>
           <w:tcPr>
-            <w:tcW w:w="1058" w:type="dxa"/>
+            <w:tcW w:w="1200" w:type="dxa"/>
           </w:tcPr>
           <w:p>
             <w:r>
@@ -696,7 +1221,7 @@
         </w:tc>
         <w:tc>
           <w:tcPr>
-            <w:tcW w:w="3568" w:type="dxa"/>
+            <w:tcW w:w="4086" w:type="dxa"/>
           </w:tcPr>
           <w:p>
             <w:r>
@@ -738,7 +1263,7 @@
       <w:tr>
         <w:tc>
           <w:tcPr>
-            <w:tcW w:w="3065" w:type="dxa"/>
+            <w:tcW w:w="2405" w:type="dxa"/>
           </w:tcPr>
           <w:p>
             <w:r>
@@ -748,7 +1273,7 @@
         </w:tc>
         <w:tc>
           <w:tcPr>
-            <w:tcW w:w="1058" w:type="dxa"/>
+            <w:tcW w:w="1200" w:type="dxa"/>
           </w:tcPr>
           <w:p>
             <w:r>
@@ -758,7 +1283,7 @@
         </w:tc>
         <w:tc>
           <w:tcPr>
-            <w:tcW w:w="3568" w:type="dxa"/>
+            <w:tcW w:w="4086" w:type="dxa"/>
           </w:tcPr>
           <w:p>
             <w:r>
@@ -785,7 +1310,7 @@
           </w:tcPr>
           <w:p>
             <w:r>
-              <w:t>Default</w:t>
+              <w:t>256</w:t>
             </w:r>
           </w:p>
         </w:tc>
@@ -803,7 +1328,7 @@
       <w:tr>
         <w:tc>
           <w:tcPr>
-            <w:tcW w:w="3065" w:type="dxa"/>
+            <w:tcW w:w="2405" w:type="dxa"/>
           </w:tcPr>
           <w:p>
             <w:r>
@@ -813,7 +1338,7 @@
         </w:tc>
         <w:tc>
           <w:tcPr>
-            <w:tcW w:w="1058" w:type="dxa"/>
+            <w:tcW w:w="1200" w:type="dxa"/>
           </w:tcPr>
           <w:p>
             <w:r>
@@ -823,7 +1348,7 @@
         </w:tc>
         <w:tc>
           <w:tcPr>
-            <w:tcW w:w="3568" w:type="dxa"/>
+            <w:tcW w:w="4086" w:type="dxa"/>
           </w:tcPr>
           <w:p>
             <w:r>
@@ -853,7 +1378,7 @@
           </w:tcPr>
           <w:p>
             <w:r>
-              <w:t>Default</w:t>
+              <w:t>256</w:t>
             </w:r>
           </w:p>
         </w:tc>
@@ -871,7 +1396,7 @@
       <w:tr>
         <w:tc>
           <w:tcPr>
-            <w:tcW w:w="3065" w:type="dxa"/>
+            <w:tcW w:w="2405" w:type="dxa"/>
           </w:tcPr>
           <w:p>
             <w:r>
@@ -881,7 +1406,7 @@
         </w:tc>
         <w:tc>
           <w:tcPr>
-            <w:tcW w:w="1058" w:type="dxa"/>
+            <w:tcW w:w="1200" w:type="dxa"/>
           </w:tcPr>
           <w:p>
             <w:r>
@@ -891,7 +1416,7 @@
         </w:tc>
         <w:tc>
           <w:tcPr>
-            <w:tcW w:w="3568" w:type="dxa"/>
+            <w:tcW w:w="4086" w:type="dxa"/>
           </w:tcPr>
           <w:p>
             <w:r>
@@ -918,7 +1443,7 @@
           </w:tcPr>
           <w:p>
             <w:r>
-              <w:t>Default</w:t>
+              <w:t>256</w:t>
             </w:r>
           </w:p>
         </w:tc>
@@ -936,7 +1461,7 @@
       <w:tr>
         <w:tc>
           <w:tcPr>
-            <w:tcW w:w="3065" w:type="dxa"/>
+            <w:tcW w:w="2405" w:type="dxa"/>
           </w:tcPr>
           <w:p>
             <w:r>
@@ -946,7 +1471,7 @@
         </w:tc>
         <w:tc>
           <w:tcPr>
-            <w:tcW w:w="1058" w:type="dxa"/>
+            <w:tcW w:w="1200" w:type="dxa"/>
           </w:tcPr>
           <w:p>
             <w:r>
@@ -956,7 +1481,7 @@
         </w:tc>
         <w:tc>
           <w:tcPr>
-            <w:tcW w:w="3568" w:type="dxa"/>
+            <w:tcW w:w="4086" w:type="dxa"/>
           </w:tcPr>
           <w:p>
             <w:r>
@@ -986,7 +1511,7 @@
           </w:tcPr>
           <w:p>
             <w:r>
-              <w:t>Default</w:t>
+              <w:t>256</w:t>
             </w:r>
           </w:p>
         </w:tc>
@@ -1004,7 +1529,7 @@
       <w:tr>
         <w:tc>
           <w:tcPr>
-            <w:tcW w:w="3065" w:type="dxa"/>
+            <w:tcW w:w="2405" w:type="dxa"/>
           </w:tcPr>
           <w:p>
             <w:r>
@@ -1014,7 +1539,7 @@
         </w:tc>
         <w:tc>
           <w:tcPr>
-            <w:tcW w:w="1058" w:type="dxa"/>
+            <w:tcW w:w="1200" w:type="dxa"/>
           </w:tcPr>
           <w:p>
             <w:r>
@@ -1024,7 +1549,7 @@
         </w:tc>
         <w:tc>
           <w:tcPr>
-            <w:tcW w:w="3568" w:type="dxa"/>
+            <w:tcW w:w="4086" w:type="dxa"/>
           </w:tcPr>
           <w:p>
             <w:r>
@@ -1069,7 +1594,7 @@
       <w:tr>
         <w:tc>
           <w:tcPr>
-            <w:tcW w:w="3065" w:type="dxa"/>
+            <w:tcW w:w="2405" w:type="dxa"/>
           </w:tcPr>
           <w:p>
             <w:r>
@@ -1079,7 +1604,7 @@
         </w:tc>
         <w:tc>
           <w:tcPr>
-            <w:tcW w:w="1058" w:type="dxa"/>
+            <w:tcW w:w="1200" w:type="dxa"/>
           </w:tcPr>
           <w:p>
             <w:r>
@@ -1089,7 +1614,7 @@
         </w:tc>
         <w:tc>
           <w:tcPr>
-            <w:tcW w:w="3568" w:type="dxa"/>
+            <w:tcW w:w="4086" w:type="dxa"/>
           </w:tcPr>
           <w:p>
             <w:r>
@@ -1113,7 +1638,7 @@
           </w:tcPr>
           <w:p>
             <w:r>
-              <w:t>Default</w:t>
+              <w:t>MAX</w:t>
             </w:r>
           </w:p>
         </w:tc>
@@ -1131,7 +1656,7 @@
       <w:tr>
         <w:tc>
           <w:tcPr>
-            <w:tcW w:w="3065" w:type="dxa"/>
+            <w:tcW w:w="2405" w:type="dxa"/>
           </w:tcPr>
           <w:p>
             <w:r>
@@ -1141,7 +1666,7 @@
         </w:tc>
         <w:tc>
           <w:tcPr>
-            <w:tcW w:w="1058" w:type="dxa"/>
+            <w:tcW w:w="1200" w:type="dxa"/>
           </w:tcPr>
           <w:p>
             <w:r>
@@ -1151,7 +1676,7 @@
         </w:tc>
         <w:tc>
           <w:tcPr>
-            <w:tcW w:w="3568" w:type="dxa"/>
+            <w:tcW w:w="4086" w:type="dxa"/>
           </w:tcPr>
           <w:p>
             <w:r>
@@ -1175,7 +1700,7 @@
           </w:tcPr>
           <w:p>
             <w:r>
-              <w:t>Default</w:t>
+              <w:t>MAX</w:t>
             </w:r>
           </w:p>
         </w:tc>
@@ -1193,17 +1718,18 @@
       <w:tr>
         <w:tc>
           <w:tcPr>
-            <w:tcW w:w="3065" w:type="dxa"/>
-          </w:tcPr>
-          <w:p>
-            <w:r>
+            <w:tcW w:w="2405" w:type="dxa"/>
+          </w:tcPr>
+          <w:p>
+            <w:r>
+              <w:lastRenderedPageBreak/>
               <w:t>ConcurrencyStamp</w:t>
             </w:r>
           </w:p>
         </w:tc>
         <w:tc>
           <w:tcPr>
-            <w:tcW w:w="1058" w:type="dxa"/>
+            <w:tcW w:w="1200" w:type="dxa"/>
           </w:tcPr>
           <w:p>
             <w:r>
@@ -1213,19 +1739,11 @@
         </w:tc>
         <w:tc>
           <w:tcPr>
-            <w:tcW w:w="3568" w:type="dxa"/>
-          </w:tcPr>
-          <w:p>
-            <w:r>
-              <w:t xml:space="preserve">Stops two users from overwriting </w:t>
-            </w:r>
-            <w:proofErr w:type="spellStart"/>
-            <w:r>
-              <w:t>each others</w:t>
-            </w:r>
-            <w:proofErr w:type="spellEnd"/>
-            <w:r>
-              <w:t xml:space="preserve"> profile changes</w:t>
+            <w:tcW w:w="4086" w:type="dxa"/>
+          </w:tcPr>
+          <w:p>
+            <w:r>
+              <w:t>Checks if the user data has changed before saving.</w:t>
             </w:r>
           </w:p>
         </w:tc>
@@ -1245,7 +1763,7 @@
           </w:tcPr>
           <w:p>
             <w:r>
-              <w:t>Default</w:t>
+              <w:t>MAX</w:t>
             </w:r>
           </w:p>
         </w:tc>
@@ -1263,7 +1781,7 @@
       <w:tr>
         <w:tc>
           <w:tcPr>
-            <w:tcW w:w="3065" w:type="dxa"/>
+            <w:tcW w:w="2405" w:type="dxa"/>
           </w:tcPr>
           <w:p>
             <w:r>
@@ -1273,7 +1791,7 @@
         </w:tc>
         <w:tc>
           <w:tcPr>
-            <w:tcW w:w="1058" w:type="dxa"/>
+            <w:tcW w:w="1200" w:type="dxa"/>
           </w:tcPr>
           <w:p>
             <w:r>
@@ -1283,7 +1801,7 @@
         </w:tc>
         <w:tc>
           <w:tcPr>
-            <w:tcW w:w="3568" w:type="dxa"/>
+            <w:tcW w:w="4086" w:type="dxa"/>
           </w:tcPr>
           <w:p>
             <w:r>
@@ -1307,7 +1825,7 @@
           </w:tcPr>
           <w:p>
             <w:r>
-              <w:t>Default</w:t>
+              <w:t>MAX</w:t>
             </w:r>
           </w:p>
         </w:tc>
@@ -1325,7 +1843,7 @@
       <w:tr>
         <w:tc>
           <w:tcPr>
-            <w:tcW w:w="3065" w:type="dxa"/>
+            <w:tcW w:w="2405" w:type="dxa"/>
           </w:tcPr>
           <w:p>
             <w:r>
@@ -1335,7 +1853,7 @@
         </w:tc>
         <w:tc>
           <w:tcPr>
-            <w:tcW w:w="1058" w:type="dxa"/>
+            <w:tcW w:w="1200" w:type="dxa"/>
           </w:tcPr>
           <w:p>
             <w:r>
@@ -1345,7 +1863,7 @@
         </w:tc>
         <w:tc>
           <w:tcPr>
-            <w:tcW w:w="3568" w:type="dxa"/>
+            <w:tcW w:w="4086" w:type="dxa"/>
           </w:tcPr>
           <w:p>
             <w:r>
@@ -1390,7 +1908,7 @@
       <w:tr>
         <w:tc>
           <w:tcPr>
-            <w:tcW w:w="3065" w:type="dxa"/>
+            <w:tcW w:w="2405" w:type="dxa"/>
           </w:tcPr>
           <w:p>
             <w:r>
@@ -1400,7 +1918,7 @@
         </w:tc>
         <w:tc>
           <w:tcPr>
-            <w:tcW w:w="1058" w:type="dxa"/>
+            <w:tcW w:w="1200" w:type="dxa"/>
           </w:tcPr>
           <w:p>
             <w:r>
@@ -1410,7 +1928,7 @@
         </w:tc>
         <w:tc>
           <w:tcPr>
-            <w:tcW w:w="3568" w:type="dxa"/>
+            <w:tcW w:w="4086" w:type="dxa"/>
           </w:tcPr>
           <w:p>
             <w:r>
@@ -1455,7 +1973,7 @@
       <w:tr>
         <w:tc>
           <w:tcPr>
-            <w:tcW w:w="3065" w:type="dxa"/>
+            <w:tcW w:w="2405" w:type="dxa"/>
           </w:tcPr>
           <w:p>
             <w:r>
@@ -1465,7 +1983,7 @@
         </w:tc>
         <w:tc>
           <w:tcPr>
-            <w:tcW w:w="1058" w:type="dxa"/>
+            <w:tcW w:w="1200" w:type="dxa"/>
           </w:tcPr>
           <w:p>
             <w:r>
@@ -1475,7 +1993,7 @@
         </w:tc>
         <w:tc>
           <w:tcPr>
-            <w:tcW w:w="3568" w:type="dxa"/>
+            <w:tcW w:w="4086" w:type="dxa"/>
           </w:tcPr>
           <w:p>
             <w:r>
@@ -1524,7 +2042,7 @@
       <w:tr>
         <w:tc>
           <w:tcPr>
-            <w:tcW w:w="3065" w:type="dxa"/>
+            <w:tcW w:w="2405" w:type="dxa"/>
           </w:tcPr>
           <w:p>
             <w:r>
@@ -1534,7 +2052,7 @@
         </w:tc>
         <w:tc>
           <w:tcPr>
-            <w:tcW w:w="1058" w:type="dxa"/>
+            <w:tcW w:w="1200" w:type="dxa"/>
           </w:tcPr>
           <w:p>
             <w:r>
@@ -1544,7 +2062,7 @@
         </w:tc>
         <w:tc>
           <w:tcPr>
-            <w:tcW w:w="3568" w:type="dxa"/>
+            <w:tcW w:w="4086" w:type="dxa"/>
           </w:tcPr>
           <w:p>
             <w:r>
@@ -1589,7 +2107,7 @@
       <w:tr>
         <w:tc>
           <w:tcPr>
-            <w:tcW w:w="3065" w:type="dxa"/>
+            <w:tcW w:w="2405" w:type="dxa"/>
           </w:tcPr>
           <w:p>
             <w:r>
@@ -1599,7 +2117,7 @@
         </w:tc>
         <w:tc>
           <w:tcPr>
-            <w:tcW w:w="1058" w:type="dxa"/>
+            <w:tcW w:w="1200" w:type="dxa"/>
           </w:tcPr>
           <w:p>
             <w:r>
@@ -1609,7 +2127,7 @@
         </w:tc>
         <w:tc>
           <w:tcPr>
-            <w:tcW w:w="3568" w:type="dxa"/>
+            <w:tcW w:w="4086" w:type="dxa"/>
           </w:tcPr>
           <w:p>
             <w:r>
@@ -1930,7 +2448,7 @@
           </w:tcPr>
           <w:p>
             <w:r>
-              <w:t>Default</w:t>
+              <w:t>256</w:t>
             </w:r>
           </w:p>
         </w:tc>
@@ -1998,7 +2516,7 @@
           </w:tcPr>
           <w:p>
             <w:r>
-              <w:t>Default</w:t>
+              <w:t>256</w:t>
             </w:r>
           </w:p>
         </w:tc>
@@ -2020,7 +2538,6 @@
           </w:tcPr>
           <w:p>
             <w:r>
-              <w:lastRenderedPageBreak/>
               <w:t>ConcurrencyStamp</w:t>
             </w:r>
           </w:p>
@@ -2041,7 +2558,7 @@
           </w:tcPr>
           <w:p>
             <w:r>
-              <w:t>Stops two admins from editing the same role at the same time</w:t>
+              <w:t>Checks if the role data has changed before saving</w:t>
             </w:r>
           </w:p>
         </w:tc>
@@ -2061,7 +2578,7 @@
           </w:tcPr>
           <w:p>
             <w:r>
-              <w:t>Default</w:t>
+              <w:t>Max</w:t>
             </w:r>
           </w:p>
         </w:tc>
@@ -2270,7 +2787,7 @@
           </w:tcPr>
           <w:p>
             <w:r>
-              <w:t>Foreign key to AspNetUsers</w:t>
+              <w:t>Links the role task to a specific user</w:t>
             </w:r>
           </w:p>
         </w:tc>
@@ -2289,7 +2806,7 @@
               <w:t>(Composite)</w:t>
             </w:r>
             <w:r>
-              <w:t>, FK (&gt; AspNetUsers.Id)</w:t>
+              <w:t>, FK</w:t>
             </w:r>
           </w:p>
         </w:tc>
@@ -2341,7 +2858,16 @@
           </w:tcPr>
           <w:p>
             <w:r>
-              <w:t>Foreign key to AspNetRoles</w:t>
+              <w:t xml:space="preserve">Links the role </w:t>
+            </w:r>
+            <w:r>
+              <w:t>task</w:t>
+            </w:r>
+            <w:r>
+              <w:t xml:space="preserve"> to a specific </w:t>
+            </w:r>
+            <w:r>
+              <w:t>role</w:t>
             </w:r>
           </w:p>
         </w:tc>
@@ -2357,16 +2883,7 @@
               <w:t xml:space="preserve"> </w:t>
             </w:r>
             <w:r>
-              <w:t>(Composite)</w:t>
-            </w:r>
-            <w:r>
-              <w:t>, FK (&gt; AspNet</w:t>
-            </w:r>
-            <w:r>
-              <w:t>Roles</w:t>
-            </w:r>
-            <w:r>
-              <w:t>.Id)</w:t>
+              <w:t>(Composite), FK</w:t>
             </w:r>
           </w:p>
         </w:tc>
@@ -2582,7 +3099,7 @@
           </w:tcPr>
           <w:p>
             <w:r>
-              <w:t>Primary identifier</w:t>
+              <w:t>A unique identifier for each user claim</w:t>
             </w:r>
           </w:p>
         </w:tc>
@@ -2647,7 +3164,7 @@
           </w:tcPr>
           <w:p>
             <w:r>
-              <w:t>Foreign key to AspNetUsers</w:t>
+              <w:t>Links claim to a specific user</w:t>
             </w:r>
           </w:p>
         </w:tc>
@@ -2657,16 +3174,7 @@
           </w:tcPr>
           <w:p>
             <w:r>
-              <w:t>PK</w:t>
-            </w:r>
-            <w:r>
-              <w:t xml:space="preserve"> </w:t>
-            </w:r>
-            <w:r>
-              <w:t>(Composite)</w:t>
-            </w:r>
-            <w:r>
-              <w:t>, FK (&gt; AspNetUsers.Id)</w:t>
+              <w:t>FK</w:t>
             </w:r>
           </w:p>
         </w:tc>
@@ -2738,7 +3246,7 @@
           </w:tcPr>
           <w:p>
             <w:r>
-              <w:t>Default</w:t>
+              <w:t>MAX</w:t>
             </w:r>
           </w:p>
         </w:tc>
@@ -2800,7 +3308,7 @@
           </w:tcPr>
           <w:p>
             <w:r>
-              <w:t>Default</w:t>
+              <w:t>MAX</w:t>
             </w:r>
           </w:p>
         </w:tc>
@@ -3006,7 +3514,7 @@
           </w:tcPr>
           <w:p>
             <w:r>
-              <w:t>Primary identifier</w:t>
+              <w:t>A unique identifier for each role claim</w:t>
             </w:r>
           </w:p>
         </w:tc>
@@ -3068,7 +3576,7 @@
           </w:tcPr>
           <w:p>
             <w:r>
-              <w:t>Foreign key to AspNetRoles</w:t>
+              <w:t>Links claim to a specific role</w:t>
             </w:r>
           </w:p>
         </w:tc>
@@ -3078,13 +3586,7 @@
           </w:tcPr>
           <w:p>
             <w:r>
-              <w:t>FK (&gt; AspNet</w:t>
-            </w:r>
-            <w:r>
-              <w:t>Roles</w:t>
-            </w:r>
-            <w:r>
-              <w:t>.Id</w:t>
+              <w:t xml:space="preserve">FK </w:t>
             </w:r>
           </w:p>
         </w:tc>
@@ -3156,7 +3658,7 @@
           </w:tcPr>
           <w:p>
             <w:r>
-              <w:t>Default</w:t>
+              <w:t>MAX</w:t>
             </w:r>
           </w:p>
         </w:tc>
@@ -3218,7 +3720,7 @@
           </w:tcPr>
           <w:p>
             <w:r>
-              <w:t>Default</w:t>
+              <w:t>MAX</w:t>
             </w:r>
           </w:p>
         </w:tc>
@@ -3252,9 +3754,9 @@
       <w:tblGrid>
         <w:gridCol w:w="2150"/>
         <w:gridCol w:w="1058"/>
-        <w:gridCol w:w="2952"/>
-        <w:gridCol w:w="2301"/>
-        <w:gridCol w:w="874"/>
+        <w:gridCol w:w="3118"/>
+        <w:gridCol w:w="2363"/>
+        <w:gridCol w:w="646"/>
         <w:gridCol w:w="1150"/>
       </w:tblGrid>
       <w:tr>
@@ -3424,7 +3926,7 @@
           </w:tcPr>
           <w:p>
             <w:r>
-              <w:t>External login provider</w:t>
+              <w:t>Identifies the external login service like Google</w:t>
             </w:r>
           </w:p>
         </w:tc>
@@ -3450,7 +3952,7 @@
           </w:tcPr>
           <w:p>
             <w:r>
-              <w:t>Default</w:t>
+              <w:t>128</w:t>
             </w:r>
           </w:p>
         </w:tc>
@@ -3492,7 +3994,10 @@
           </w:tcPr>
           <w:p>
             <w:r>
-              <w:t>Key from external provider</w:t>
+              <w:t xml:space="preserve">Stores the </w:t>
+            </w:r>
+            <w:r>
+              <w:t>unique ID from the external provider for this user</w:t>
             </w:r>
           </w:p>
         </w:tc>
@@ -3512,7 +4017,7 @@
           </w:tcPr>
           <w:p>
             <w:r>
-              <w:t>Default</w:t>
+              <w:t>128</w:t>
             </w:r>
           </w:p>
         </w:tc>
@@ -3554,7 +4059,13 @@
           </w:tcPr>
           <w:p>
             <w:r>
-              <w:t>Shows the name of the provider</w:t>
+              <w:t xml:space="preserve">Shows </w:t>
+            </w:r>
+            <w:r>
+              <w:t xml:space="preserve">name for the login </w:t>
+            </w:r>
+            <w:r>
+              <w:t>provider</w:t>
             </w:r>
           </w:p>
         </w:tc>
@@ -3574,7 +4085,7 @@
           </w:tcPr>
           <w:p>
             <w:r>
-              <w:t>Default</w:t>
+              <w:t>MAX</w:t>
             </w:r>
           </w:p>
         </w:tc>
@@ -3616,7 +4127,7 @@
           </w:tcPr>
           <w:p>
             <w:r>
-              <w:t>Foreign key to AspNetUsers</w:t>
+              <w:t>Links the external login to a specific user</w:t>
             </w:r>
           </w:p>
         </w:tc>
@@ -3626,7 +4137,7 @@
           </w:tcPr>
           <w:p>
             <w:r>
-              <w:t>FK (&gt; AspNetUsers.Id)</w:t>
+              <w:t>FK</w:t>
             </w:r>
           </w:p>
         </w:tc>
@@ -3658,6 +4169,7 @@
         <w:pStyle w:val="Subtitle"/>
       </w:pPr>
       <w:r>
+        <w:lastRenderedPageBreak/>
         <w:t>AspNetUserTokens</w:t>
       </w:r>
     </w:p>
@@ -3842,7 +4354,7 @@
           </w:tcPr>
           <w:p>
             <w:r>
-              <w:t>Foreign key to AspNetUsers</w:t>
+              <w:t>Links the token to a specific user</w:t>
             </w:r>
           </w:p>
         </w:tc>
@@ -3858,7 +4370,7 @@
               <w:t xml:space="preserve">), </w:t>
             </w:r>
             <w:r>
-              <w:t>FK (&gt; AspNetUsers.Id)</w:t>
+              <w:t>FK</w:t>
             </w:r>
           </w:p>
         </w:tc>
@@ -3910,7 +4422,7 @@
           </w:tcPr>
           <w:p>
             <w:r>
-              <w:t>External login provider</w:t>
+              <w:t>Identifies which provider the token belongs to</w:t>
             </w:r>
           </w:p>
         </w:tc>
@@ -3972,7 +4484,10 @@
           </w:tcPr>
           <w:p>
             <w:r>
-              <w:t>The tokens name</w:t>
+              <w:t xml:space="preserve">The </w:t>
+            </w:r>
+            <w:r>
+              <w:t>name of the token</w:t>
             </w:r>
           </w:p>
         </w:tc>
@@ -4071,6 +4586,17 @@
       </w:tr>
     </w:tbl>
     <w:p/>
+    <w:p>
+      <w:r>
+        <w:t>__</w:t>
+      </w:r>
+      <w:r>
+        <w:rPr>
+          <w:rStyle w:val="SubtitleChar"/>
+        </w:rPr>
+        <w:t>EFMigrationsHistory</w:t>
+      </w:r>
+    </w:p>
     <w:tbl>
       <w:tblPr>
         <w:tblStyle w:val="TableGrid"/>
@@ -4231,11 +4757,9 @@
             <w:tcW w:w="3256" w:type="dxa"/>
           </w:tcPr>
           <w:p>
-            <w:proofErr w:type="spellStart"/>
             <w:r>
               <w:t>MigrationId</w:t>
             </w:r>
-            <w:proofErr w:type="spellEnd"/>
           </w:p>
         </w:tc>
         <w:tc>
@@ -4298,11 +4822,9 @@
             <w:tcW w:w="3256" w:type="dxa"/>
           </w:tcPr>
           <w:p>
-            <w:proofErr w:type="spellStart"/>
             <w:r>
               <w:t>ProductVersion</w:t>
             </w:r>
-            <w:proofErr w:type="spellEnd"/>
           </w:p>
         </w:tc>
         <w:tc>
@@ -4367,9 +4889,11 @@
       <w:pPr>
         <w:pStyle w:val="Heading2"/>
       </w:pPr>
+      <w:bookmarkStart w:id="6" w:name="_Toc224291319"/>
       <w:r>
         <w:t>Greenfield Local Hub Data Dictionary</w:t>
       </w:r>
+      <w:bookmarkEnd w:id="6"/>
     </w:p>
     <w:sectPr>
       <w:pgSz w:w="11906" w:h="16838"/>
@@ -4828,7 +5352,6 @@
   <w:style w:type="character" w:default="1" w:styleId="DefaultParagraphFont">
     <w:name w:val="Default Paragraph Font"/>
     <w:uiPriority w:val="1"/>
-    <w:semiHidden/>
     <w:unhideWhenUsed/>
   </w:style>
   <w:style w:type="table" w:default="1" w:styleId="TableNormal">
@@ -5002,6 +5525,42 @@
       <w:szCs w:val="56"/>
     </w:rPr>
   </w:style>
+  <w:style w:type="paragraph" w:styleId="TOC1">
+    <w:name w:val="toc 1"/>
+    <w:basedOn w:val="Normal"/>
+    <w:next w:val="Normal"/>
+    <w:autoRedefine/>
+    <w:uiPriority w:val="39"/>
+    <w:unhideWhenUsed/>
+    <w:rsid w:val="00315D96"/>
+    <w:pPr>
+      <w:spacing w:after="100"/>
+    </w:pPr>
+  </w:style>
+  <w:style w:type="paragraph" w:styleId="TOC2">
+    <w:name w:val="toc 2"/>
+    <w:basedOn w:val="Normal"/>
+    <w:next w:val="Normal"/>
+    <w:autoRedefine/>
+    <w:uiPriority w:val="39"/>
+    <w:unhideWhenUsed/>
+    <w:rsid w:val="00315D96"/>
+    <w:pPr>
+      <w:spacing w:after="100"/>
+      <w:ind w:left="220"/>
+    </w:pPr>
+  </w:style>
+  <w:style w:type="character" w:styleId="Hyperlink">
+    <w:name w:val="Hyperlink"/>
+    <w:basedOn w:val="DefaultParagraphFont"/>
+    <w:uiPriority w:val="99"/>
+    <w:unhideWhenUsed/>
+    <w:rsid w:val="00315D96"/>
+    <w:rPr>
+      <w:color w:val="0563C1" w:themeColor="hyperlink"/>
+      <w:u w:val="single"/>
+    </w:rPr>
+  </w:style>
 </w:styles>
 </file>
 
@@ -5119,7 +5678,7 @@
   <w:rsids>
     <w:rsidRoot w:val="00033BC2"/>
     <w:rsid w:val="00033BC2"/>
-    <w:rsid w:val="002046F9"/>
+    <w:rsid w:val="00700F9E"/>
   </w:rsids>
   <m:mathPr>
     <m:mathFont m:val="Cambria Math"/>

</xml_diff>

<commit_message>
Day 4 Exam Finished
Exam finished monday 16 march 16:10
</commit_message>
<xml_diff>
--- a/Task 1/Task 1b/Task1_DesignDocs_VisualDesigns_LL-000020914_Naser_A.docx
+++ b/Task 1/Task 1b/Task1_DesignDocs_VisualDesigns_LL-000020914_Naser_A.docx
@@ -5,7 +5,9 @@
     <w:sdt>
       <w:sdtPr>
         <w:rPr>
+          <w:rFonts w:eastAsiaTheme="minorHAnsi"/>
           <w:color w:val="4472C4" w:themeColor="accent1"/>
+          <w:lang w:eastAsia="en-US"/>
         </w:rPr>
         <w:id w:val="-208737955"/>
         <w:docPartObj>
@@ -15,9 +17,7 @@
       </w:sdtPr>
       <w:sdtEndPr>
         <w:rPr>
-          <w:rFonts w:eastAsiaTheme="minorHAnsi"/>
           <w:color w:val="auto"/>
-          <w:lang w:eastAsia="en-US"/>
         </w:rPr>
       </w:sdtEndPr>
       <w:sdtContent>
@@ -51,7 +51,7 @@
                         <pic:cNvPicPr/>
                       </pic:nvPicPr>
                       <pic:blipFill>
-                        <a:blip r:embed="rId5" cstate="print">
+                        <a:blip r:embed="rId7" cstate="print">
                           <a:duotone>
                             <a:schemeClr val="accent1">
                               <a:shade val="45000"/>
@@ -160,6 +160,7 @@
             <w:dataBinding w:prefixMappings="xmlns:ns0='http://purl.org/dc/elements/1.1/' xmlns:ns1='http://schemas.openxmlformats.org/package/2006/metadata/core-properties' " w:xpath="/ns1:coreProperties[1]/ns0:subject[1]" w:storeItemID="{6C3C8BC8-F283-45AE-878A-BAB7291924A1}"/>
             <w:text/>
           </w:sdtPr>
+          <w:sdtEndPr/>
           <w:sdtContent>
             <w:p>
               <w:pPr>
@@ -331,7 +332,7 @@
                         <pic:cNvPicPr/>
                       </pic:nvPicPr>
                       <pic:blipFill>
-                        <a:blip r:embed="rId6" cstate="print">
+                        <a:blip r:embed="rId8" cstate="print">
                           <a:duotone>
                             <a:schemeClr val="accent1">
                               <a:shade val="45000"/>
@@ -374,6 +375,13 @@
     </w:sdt>
     <w:sdt>
       <w:sdtPr>
+        <w:rPr>
+          <w:rFonts w:asciiTheme="minorHAnsi" w:eastAsiaTheme="minorHAnsi" w:hAnsiTheme="minorHAnsi" w:cstheme="minorBidi"/>
+          <w:color w:val="auto"/>
+          <w:sz w:val="22"/>
+          <w:szCs w:val="22"/>
+          <w:lang w:eastAsia="en-US"/>
+        </w:rPr>
         <w:id w:val="-1043285223"/>
         <w:docPartObj>
           <w:docPartGallery w:val="Table of Contents"/>
@@ -382,13 +390,8 @@
       </w:sdtPr>
       <w:sdtEndPr>
         <w:rPr>
-          <w:rFonts w:asciiTheme="minorHAnsi" w:eastAsiaTheme="minorHAnsi" w:hAnsiTheme="minorHAnsi" w:cstheme="minorBidi"/>
           <w:b/>
           <w:bCs/>
-          <w:color w:val="auto"/>
-          <w:sz w:val="22"/>
-          <w:szCs w:val="22"/>
-          <w:lang w:eastAsia="en-US"/>
         </w:rPr>
       </w:sdtEndPr>
       <w:sdtContent>
@@ -421,7 +424,7 @@
           <w:r>
             <w:fldChar w:fldCharType="separate"/>
           </w:r>
-          <w:hyperlink w:anchor="_Toc224291313" w:history="1">
+          <w:hyperlink w:anchor="_Toc224568265" w:history="1">
             <w:r>
               <w:rPr>
                 <w:rStyle w:val="Hyperlink"/>
@@ -448,7 +451,7 @@
                 <w:noProof/>
                 <w:webHidden/>
               </w:rPr>
-              <w:instrText xml:space="preserve"> PAGEREF _Toc224291313 \h </w:instrText>
+              <w:instrText xml:space="preserve"> PAGEREF _Toc224568265 \h </w:instrText>
             </w:r>
             <w:r>
               <w:rPr>
@@ -491,7 +494,7 @@
               <w:lang w:eastAsia="en-GB"/>
             </w:rPr>
           </w:pPr>
-          <w:hyperlink w:anchor="_Toc224291314" w:history="1">
+          <w:hyperlink w:anchor="_Toc224568266" w:history="1">
             <w:r>
               <w:rPr>
                 <w:rStyle w:val="Hyperlink"/>
@@ -518,7 +521,7 @@
                 <w:noProof/>
                 <w:webHidden/>
               </w:rPr>
-              <w:instrText xml:space="preserve"> PAGEREF _Toc224291314 \h </w:instrText>
+              <w:instrText xml:space="preserve"> PAGEREF _Toc224568266 \h </w:instrText>
             </w:r>
             <w:r>
               <w:rPr>
@@ -538,7 +541,7 @@
                 <w:noProof/>
                 <w:webHidden/>
               </w:rPr>
-              <w:t>2</w:t>
+              <w:t>3</w:t>
             </w:r>
             <w:r>
               <w:rPr>
@@ -561,13 +564,13 @@
               <w:lang w:eastAsia="en-GB"/>
             </w:rPr>
           </w:pPr>
-          <w:hyperlink w:anchor="_Toc224291315" w:history="1">
+          <w:hyperlink w:anchor="_Toc224568267" w:history="1">
             <w:r>
               <w:rPr>
                 <w:rStyle w:val="Hyperlink"/>
                 <w:noProof/>
               </w:rPr>
-              <w:t>Algorithm Designs</w:t>
+              <w:t>Algorithm Designs (Flowcharts)</w:t>
             </w:r>
             <w:r>
               <w:rPr>
@@ -588,7 +591,7 @@
                 <w:noProof/>
                 <w:webHidden/>
               </w:rPr>
-              <w:instrText xml:space="preserve"> PAGEREF _Toc224291315 \h </w:instrText>
+              <w:instrText xml:space="preserve"> PAGEREF _Toc224568267 \h </w:instrText>
             </w:r>
             <w:r>
               <w:rPr>
@@ -608,7 +611,7 @@
                 <w:noProof/>
                 <w:webHidden/>
               </w:rPr>
-              <w:t>2</w:t>
+              <w:t>21</w:t>
             </w:r>
             <w:r>
               <w:rPr>
@@ -631,7 +634,7 @@
               <w:lang w:eastAsia="en-GB"/>
             </w:rPr>
           </w:pPr>
-          <w:hyperlink w:anchor="_Toc224291316" w:history="1">
+          <w:hyperlink w:anchor="_Toc224568268" w:history="1">
             <w:r>
               <w:rPr>
                 <w:rStyle w:val="Hyperlink"/>
@@ -658,7 +661,7 @@
                 <w:noProof/>
                 <w:webHidden/>
               </w:rPr>
-              <w:instrText xml:space="preserve"> PAGEREF _Toc224291316 \h </w:instrText>
+              <w:instrText xml:space="preserve"> PAGEREF _Toc224568268 \h </w:instrText>
             </w:r>
             <w:r>
               <w:rPr>
@@ -678,7 +681,7 @@
                 <w:noProof/>
                 <w:webHidden/>
               </w:rPr>
-              <w:t>2</w:t>
+              <w:t>23</w:t>
             </w:r>
             <w:r>
               <w:rPr>
@@ -701,7 +704,7 @@
               <w:lang w:eastAsia="en-GB"/>
             </w:rPr>
           </w:pPr>
-          <w:hyperlink w:anchor="_Toc224291317" w:history="1">
+          <w:hyperlink w:anchor="_Toc224568269" w:history="1">
             <w:r>
               <w:rPr>
                 <w:rStyle w:val="Hyperlink"/>
@@ -728,7 +731,7 @@
                 <w:noProof/>
                 <w:webHidden/>
               </w:rPr>
-              <w:instrText xml:space="preserve"> PAGEREF _Toc224291317 \h </w:instrText>
+              <w:instrText xml:space="preserve"> PAGEREF _Toc224568269 \h </w:instrText>
             </w:r>
             <w:r>
               <w:rPr>
@@ -748,7 +751,7 @@
                 <w:noProof/>
                 <w:webHidden/>
               </w:rPr>
-              <w:t>2</w:t>
+              <w:t>23</w:t>
             </w:r>
             <w:r>
               <w:rPr>
@@ -771,7 +774,7 @@
               <w:lang w:eastAsia="en-GB"/>
             </w:rPr>
           </w:pPr>
-          <w:hyperlink w:anchor="_Toc224291318" w:history="1">
+          <w:hyperlink w:anchor="_Toc224568270" w:history="1">
             <w:r>
               <w:rPr>
                 <w:rStyle w:val="Hyperlink"/>
@@ -798,7 +801,7 @@
                 <w:noProof/>
                 <w:webHidden/>
               </w:rPr>
-              <w:instrText xml:space="preserve"> PAGEREF _Toc224291318 \h </w:instrText>
+              <w:instrText xml:space="preserve"> PAGEREF _Toc224568270 \h </w:instrText>
             </w:r>
             <w:r>
               <w:rPr>
@@ -818,7 +821,7 @@
                 <w:noProof/>
                 <w:webHidden/>
               </w:rPr>
-              <w:t>2</w:t>
+              <w:t>23</w:t>
             </w:r>
             <w:r>
               <w:rPr>
@@ -841,7 +844,7 @@
               <w:lang w:eastAsia="en-GB"/>
             </w:rPr>
           </w:pPr>
-          <w:hyperlink w:anchor="_Toc224291319" w:history="1">
+          <w:hyperlink w:anchor="_Toc224568271" w:history="1">
             <w:r>
               <w:rPr>
                 <w:rStyle w:val="Hyperlink"/>
@@ -868,7 +871,7 @@
                 <w:noProof/>
                 <w:webHidden/>
               </w:rPr>
-              <w:instrText xml:space="preserve"> PAGEREF _Toc224291319 \h </w:instrText>
+              <w:instrText xml:space="preserve"> PAGEREF _Toc224568271 \h </w:instrText>
             </w:r>
             <w:r>
               <w:rPr>
@@ -888,7 +891,77 @@
                 <w:noProof/>
                 <w:webHidden/>
               </w:rPr>
-              <w:t>4</w:t>
+              <w:t>24</w:t>
+            </w:r>
+            <w:r>
+              <w:rPr>
+                <w:noProof/>
+                <w:webHidden/>
+              </w:rPr>
+              <w:fldChar w:fldCharType="end"/>
+            </w:r>
+          </w:hyperlink>
+        </w:p>
+        <w:p>
+          <w:pPr>
+            <w:pStyle w:val="TOC1"/>
+            <w:tabs>
+              <w:tab w:val="right" w:leader="dot" w:pos="10456"/>
+            </w:tabs>
+            <w:rPr>
+              <w:rFonts w:eastAsiaTheme="minorEastAsia"/>
+              <w:noProof/>
+              <w:lang w:eastAsia="en-GB"/>
+            </w:rPr>
+          </w:pPr>
+          <w:hyperlink w:anchor="_Toc224568272" w:history="1">
+            <w:r>
+              <w:rPr>
+                <w:rStyle w:val="Hyperlink"/>
+                <w:noProof/>
+              </w:rPr>
+              <w:t>Test Strategy</w:t>
+            </w:r>
+            <w:r>
+              <w:rPr>
+                <w:noProof/>
+                <w:webHidden/>
+              </w:rPr>
+              <w:tab/>
+            </w:r>
+            <w:r>
+              <w:rPr>
+                <w:noProof/>
+                <w:webHidden/>
+              </w:rPr>
+              <w:fldChar w:fldCharType="begin"/>
+            </w:r>
+            <w:r>
+              <w:rPr>
+                <w:noProof/>
+                <w:webHidden/>
+              </w:rPr>
+              <w:instrText xml:space="preserve"> PAGEREF _Toc224568272 \h </w:instrText>
+            </w:r>
+            <w:r>
+              <w:rPr>
+                <w:noProof/>
+                <w:webHidden/>
+              </w:rPr>
+            </w:r>
+            <w:r>
+              <w:rPr>
+                <w:noProof/>
+                <w:webHidden/>
+              </w:rPr>
+              <w:fldChar w:fldCharType="separate"/>
+            </w:r>
+            <w:r>
+              <w:rPr>
+                <w:noProof/>
+                <w:webHidden/>
+              </w:rPr>
+              <w:t>25</w:t>
             </w:r>
             <w:r>
               <w:rPr>
@@ -940,9 +1013,8 @@
       <w:pPr>
         <w:pStyle w:val="Heading1"/>
       </w:pPr>
-      <w:bookmarkStart w:id="0" w:name="_Toc224291313"/>
+      <w:bookmarkStart w:id="0" w:name="_Toc224568265"/>
       <w:r>
-        <w:lastRenderedPageBreak/>
         <w:t>Site Map</w:t>
       </w:r>
       <w:bookmarkEnd w:id="0"/>
@@ -971,7 +1043,7 @@
                     </pic:cNvPicPr>
                   </pic:nvPicPr>
                   <pic:blipFill>
-                    <a:blip r:embed="rId7">
+                    <a:blip r:embed="rId9">
                       <a:extLst>
                         <a:ext uri="{28A0092B-C50C-407E-A947-70E740481C1C}">
                           <a14:useLocalDpi xmlns:a14="http://schemas.microsoft.com/office/drawing/2010/main" val="0"/>
@@ -1028,7 +1100,7 @@
       <w:pPr>
         <w:pStyle w:val="Heading1"/>
       </w:pPr>
-      <w:bookmarkStart w:id="1" w:name="_Toc224291314"/>
+      <w:bookmarkStart w:id="1" w:name="_Toc224568266"/>
       <w:r>
         <w:lastRenderedPageBreak/>
         <w:t>Wireframe Designs</w:t>
@@ -1036,23 +1108,1248 @@
       <w:bookmarkEnd w:id="1"/>
     </w:p>
     <w:p/>
-    <w:p/>
-    <w:p/>
-    <w:p/>
-    <w:p/>
-    <w:p/>
-    <w:p/>
-    <w:p/>
-    <w:p/>
-    <w:p/>
-    <w:p/>
-    <w:p/>
-    <w:p/>
-    <w:p/>
-    <w:p/>
-    <w:p/>
-    <w:p/>
-    <w:p/>
+    <w:p>
+      <w:pPr>
+        <w:pStyle w:val="Subtitle"/>
+      </w:pPr>
+      <w:r>
+        <w:t>Home Pag</w:t>
+      </w:r>
+      <w:r>
+        <w:t>e</w:t>
+      </w:r>
+    </w:p>
+    <w:p>
+      <w:pPr>
+        <w:pStyle w:val="NormalWeb"/>
+        <w:jc w:val="center"/>
+      </w:pPr>
+      <w:r>
+        <w:drawing>
+          <wp:inline distT="0" distB="0" distL="0" distR="0" wp14:anchorId="3EE82C91" wp14:editId="0153E351">
+            <wp:extent cx="4134678" cy="6897700"/>
+            <wp:effectExtent l="0" t="0" r="0" b="0"/>
+            <wp:docPr id="12" name="Picture 12"/>
+            <wp:cNvGraphicFramePr>
+              <a:graphicFrameLocks xmlns:a="http://schemas.openxmlformats.org/drawingml/2006/main" noChangeAspect="1"/>
+            </wp:cNvGraphicFramePr>
+            <a:graphic xmlns:a="http://schemas.openxmlformats.org/drawingml/2006/main">
+              <a:graphicData uri="http://schemas.openxmlformats.org/drawingml/2006/picture">
+                <pic:pic xmlns:pic="http://schemas.openxmlformats.org/drawingml/2006/picture">
+                  <pic:nvPicPr>
+                    <pic:cNvPr id="1" name=""/>
+                    <pic:cNvPicPr/>
+                  </pic:nvPicPr>
+                  <pic:blipFill>
+                    <a:blip r:embed="rId10"/>
+                    <a:stretch>
+                      <a:fillRect/>
+                    </a:stretch>
+                  </pic:blipFill>
+                  <pic:spPr>
+                    <a:xfrm>
+                      <a:off x="0" y="0"/>
+                      <a:ext cx="4138066" cy="6903351"/>
+                    </a:xfrm>
+                    <a:prstGeom prst="rect">
+                      <a:avLst/>
+                    </a:prstGeom>
+                  </pic:spPr>
+                </pic:pic>
+              </a:graphicData>
+            </a:graphic>
+          </wp:inline>
+        </w:drawing>
+      </w:r>
+    </w:p>
+    <w:p/>
+    <w:p/>
+    <w:p/>
+    <w:p/>
+    <w:p/>
+    <w:p/>
+    <w:p/>
+    <w:p>
+      <w:pPr>
+        <w:pStyle w:val="Subtitle"/>
+      </w:pPr>
+      <w:r>
+        <w:t>Shop Page</w:t>
+      </w:r>
+    </w:p>
+    <w:p/>
+    <w:p>
+      <w:pPr>
+        <w:jc w:val="center"/>
+      </w:pPr>
+      <w:r>
+        <w:drawing>
+          <wp:inline distT="0" distB="0" distL="0" distR="0" wp14:anchorId="554302C4" wp14:editId="6F9EC196">
+            <wp:extent cx="4263242" cy="4982608"/>
+            <wp:effectExtent l="0" t="0" r="4445" b="8890"/>
+            <wp:docPr id="1" name="Picture 1"/>
+            <wp:cNvGraphicFramePr>
+              <a:graphicFrameLocks xmlns:a="http://schemas.openxmlformats.org/drawingml/2006/main" noChangeAspect="1"/>
+            </wp:cNvGraphicFramePr>
+            <a:graphic xmlns:a="http://schemas.openxmlformats.org/drawingml/2006/main">
+              <a:graphicData uri="http://schemas.openxmlformats.org/drawingml/2006/picture">
+                <pic:pic xmlns:pic="http://schemas.openxmlformats.org/drawingml/2006/picture">
+                  <pic:nvPicPr>
+                    <pic:cNvPr id="1" name=""/>
+                    <pic:cNvPicPr/>
+                  </pic:nvPicPr>
+                  <pic:blipFill>
+                    <a:blip r:embed="rId11"/>
+                    <a:stretch>
+                      <a:fillRect/>
+                    </a:stretch>
+                  </pic:blipFill>
+                  <pic:spPr>
+                    <a:xfrm>
+                      <a:off x="0" y="0"/>
+                      <a:ext cx="4265648" cy="4985420"/>
+                    </a:xfrm>
+                    <a:prstGeom prst="rect">
+                      <a:avLst/>
+                    </a:prstGeom>
+                  </pic:spPr>
+                </pic:pic>
+              </a:graphicData>
+            </a:graphic>
+          </wp:inline>
+        </w:drawing>
+      </w:r>
+    </w:p>
+    <w:p/>
+    <w:p/>
+    <w:p/>
+    <w:p/>
+    <w:p/>
+    <w:p/>
+    <w:p/>
+    <w:p/>
+    <w:p/>
+    <w:p/>
+    <w:p/>
+    <w:p/>
+    <w:p/>
+    <w:p>
+      <w:pPr>
+        <w:pStyle w:val="Subtitle"/>
+      </w:pPr>
+      <w:r>
+        <w:lastRenderedPageBreak/>
+        <w:t>Specific Product Page (</w:t>
+      </w:r>
+      <w:r>
+        <w:t xml:space="preserve">Product: </w:t>
+      </w:r>
+      <w:r>
+        <w:t>Heirloom Tomatoes)</w:t>
+      </w:r>
+    </w:p>
+    <w:p/>
+    <w:p>
+      <w:pPr>
+        <w:jc w:val="center"/>
+      </w:pPr>
+      <w:r>
+        <w:drawing>
+          <wp:inline distT="0" distB="0" distL="0" distR="0" wp14:anchorId="6A47DFF7" wp14:editId="5E4DEA5F">
+            <wp:extent cx="5682343" cy="6238850"/>
+            <wp:effectExtent l="0" t="0" r="0" b="0"/>
+            <wp:docPr id="13" name="Picture 13"/>
+            <wp:cNvGraphicFramePr>
+              <a:graphicFrameLocks xmlns:a="http://schemas.openxmlformats.org/drawingml/2006/main" noChangeAspect="1"/>
+            </wp:cNvGraphicFramePr>
+            <a:graphic xmlns:a="http://schemas.openxmlformats.org/drawingml/2006/main">
+              <a:graphicData uri="http://schemas.openxmlformats.org/drawingml/2006/picture">
+                <pic:pic xmlns:pic="http://schemas.openxmlformats.org/drawingml/2006/picture">
+                  <pic:nvPicPr>
+                    <pic:cNvPr id="1" name=""/>
+                    <pic:cNvPicPr/>
+                  </pic:nvPicPr>
+                  <pic:blipFill>
+                    <a:blip r:embed="rId12"/>
+                    <a:stretch>
+                      <a:fillRect/>
+                    </a:stretch>
+                  </pic:blipFill>
+                  <pic:spPr>
+                    <a:xfrm>
+                      <a:off x="0" y="0"/>
+                      <a:ext cx="5689669" cy="6246894"/>
+                    </a:xfrm>
+                    <a:prstGeom prst="rect">
+                      <a:avLst/>
+                    </a:prstGeom>
+                  </pic:spPr>
+                </pic:pic>
+              </a:graphicData>
+            </a:graphic>
+          </wp:inline>
+        </w:drawing>
+      </w:r>
+    </w:p>
+    <w:p/>
+    <w:p/>
+    <w:p/>
+    <w:p/>
+    <w:p/>
+    <w:p/>
+    <w:p/>
+    <w:p/>
+    <w:p/>
+    <w:p/>
+    <w:p>
+      <w:pPr>
+        <w:pStyle w:val="Subtitle"/>
+      </w:pPr>
+      <w:r>
+        <w:lastRenderedPageBreak/>
+        <w:t>Producers Page</w:t>
+      </w:r>
+    </w:p>
+    <w:p/>
+    <w:p>
+      <w:pPr>
+        <w:jc w:val="center"/>
+      </w:pPr>
+      <w:r>
+        <w:drawing>
+          <wp:inline distT="0" distB="0" distL="0" distR="0" wp14:anchorId="0D4B7E81" wp14:editId="3AC4A400">
+            <wp:extent cx="5503793" cy="5569527"/>
+            <wp:effectExtent l="0" t="0" r="1905" b="0"/>
+            <wp:docPr id="14" name="Picture 14"/>
+            <wp:cNvGraphicFramePr>
+              <a:graphicFrameLocks xmlns:a="http://schemas.openxmlformats.org/drawingml/2006/main" noChangeAspect="1"/>
+            </wp:cNvGraphicFramePr>
+            <a:graphic xmlns:a="http://schemas.openxmlformats.org/drawingml/2006/main">
+              <a:graphicData uri="http://schemas.openxmlformats.org/drawingml/2006/picture">
+                <pic:pic xmlns:pic="http://schemas.openxmlformats.org/drawingml/2006/picture">
+                  <pic:nvPicPr>
+                    <pic:cNvPr id="1" name=""/>
+                    <pic:cNvPicPr/>
+                  </pic:nvPicPr>
+                  <pic:blipFill>
+                    <a:blip r:embed="rId13"/>
+                    <a:stretch>
+                      <a:fillRect/>
+                    </a:stretch>
+                  </pic:blipFill>
+                  <pic:spPr>
+                    <a:xfrm>
+                      <a:off x="0" y="0"/>
+                      <a:ext cx="5508964" cy="5574760"/>
+                    </a:xfrm>
+                    <a:prstGeom prst="rect">
+                      <a:avLst/>
+                    </a:prstGeom>
+                  </pic:spPr>
+                </pic:pic>
+              </a:graphicData>
+            </a:graphic>
+          </wp:inline>
+        </w:drawing>
+      </w:r>
+    </w:p>
+    <w:p/>
+    <w:p/>
+    <w:p/>
+    <w:p/>
+    <w:p/>
+    <w:p/>
+    <w:p/>
+    <w:p/>
+    <w:p/>
+    <w:p/>
+    <w:p/>
+    <w:p/>
+    <w:p>
+      <w:r>
+        <w:lastRenderedPageBreak/>
+        <w:t>Specific Producer</w:t>
+      </w:r>
+      <w:r>
+        <w:t>s Page (Producer: Greenacre Farm)</w:t>
+      </w:r>
+    </w:p>
+    <w:p/>
+    <w:p>
+      <w:pPr>
+        <w:jc w:val="center"/>
+      </w:pPr>
+      <w:r>
+        <w:drawing>
+          <wp:inline distT="0" distB="0" distL="0" distR="0" wp14:anchorId="41543BA9" wp14:editId="39F2BC2B">
+            <wp:extent cx="5220277" cy="6264233"/>
+            <wp:effectExtent l="0" t="0" r="0" b="3810"/>
+            <wp:docPr id="15" name="Picture 15"/>
+            <wp:cNvGraphicFramePr>
+              <a:graphicFrameLocks xmlns:a="http://schemas.openxmlformats.org/drawingml/2006/main" noChangeAspect="1"/>
+            </wp:cNvGraphicFramePr>
+            <a:graphic xmlns:a="http://schemas.openxmlformats.org/drawingml/2006/main">
+              <a:graphicData uri="http://schemas.openxmlformats.org/drawingml/2006/picture">
+                <pic:pic xmlns:pic="http://schemas.openxmlformats.org/drawingml/2006/picture">
+                  <pic:nvPicPr>
+                    <pic:cNvPr id="1" name=""/>
+                    <pic:cNvPicPr/>
+                  </pic:nvPicPr>
+                  <pic:blipFill>
+                    <a:blip r:embed="rId14"/>
+                    <a:stretch>
+                      <a:fillRect/>
+                    </a:stretch>
+                  </pic:blipFill>
+                  <pic:spPr>
+                    <a:xfrm>
+                      <a:off x="0" y="0"/>
+                      <a:ext cx="5222617" cy="6267041"/>
+                    </a:xfrm>
+                    <a:prstGeom prst="rect">
+                      <a:avLst/>
+                    </a:prstGeom>
+                  </pic:spPr>
+                </pic:pic>
+              </a:graphicData>
+            </a:graphic>
+          </wp:inline>
+        </w:drawing>
+      </w:r>
+    </w:p>
+    <w:p/>
+    <w:p/>
+    <w:p/>
+    <w:p/>
+    <w:p/>
+    <w:p/>
+    <w:p/>
+    <w:p/>
+    <w:p/>
+    <w:p/>
+    <w:p>
+      <w:pPr>
+        <w:pStyle w:val="Subtitle"/>
+      </w:pPr>
+      <w:r>
+        <w:lastRenderedPageBreak/>
+        <w:t>About Us Page</w:t>
+      </w:r>
+    </w:p>
+    <w:p/>
+    <w:p>
+      <w:pPr>
+        <w:jc w:val="center"/>
+      </w:pPr>
+      <w:r>
+        <w:drawing>
+          <wp:inline distT="0" distB="0" distL="0" distR="0" wp14:anchorId="189F7170" wp14:editId="730FDA43">
+            <wp:extent cx="5392413" cy="6591869"/>
+            <wp:effectExtent l="0" t="0" r="0" b="0"/>
+            <wp:docPr id="17" name="Picture 17"/>
+            <wp:cNvGraphicFramePr>
+              <a:graphicFrameLocks xmlns:a="http://schemas.openxmlformats.org/drawingml/2006/main" noChangeAspect="1"/>
+            </wp:cNvGraphicFramePr>
+            <a:graphic xmlns:a="http://schemas.openxmlformats.org/drawingml/2006/main">
+              <a:graphicData uri="http://schemas.openxmlformats.org/drawingml/2006/picture">
+                <pic:pic xmlns:pic="http://schemas.openxmlformats.org/drawingml/2006/picture">
+                  <pic:nvPicPr>
+                    <pic:cNvPr id="1" name=""/>
+                    <pic:cNvPicPr/>
+                  </pic:nvPicPr>
+                  <pic:blipFill>
+                    <a:blip r:embed="rId15"/>
+                    <a:stretch>
+                      <a:fillRect/>
+                    </a:stretch>
+                  </pic:blipFill>
+                  <pic:spPr>
+                    <a:xfrm>
+                      <a:off x="0" y="0"/>
+                      <a:ext cx="5441468" cy="6651835"/>
+                    </a:xfrm>
+                    <a:prstGeom prst="rect">
+                      <a:avLst/>
+                    </a:prstGeom>
+                  </pic:spPr>
+                </pic:pic>
+              </a:graphicData>
+            </a:graphic>
+          </wp:inline>
+        </w:drawing>
+      </w:r>
+    </w:p>
+    <w:p/>
+    <w:p/>
+    <w:p/>
+    <w:p/>
+    <w:p/>
+    <w:p/>
+    <w:p/>
+    <w:p/>
+    <w:p/>
+    <w:p>
+      <w:pPr>
+        <w:pStyle w:val="Subtitle"/>
+      </w:pPr>
+      <w:r>
+        <w:lastRenderedPageBreak/>
+        <w:t>Contact Page</w:t>
+      </w:r>
+    </w:p>
+    <w:p/>
+    <w:p>
+      <w:pPr>
+        <w:jc w:val="center"/>
+      </w:pPr>
+      <w:r>
+        <w:drawing>
+          <wp:inline distT="0" distB="0" distL="0" distR="0" wp14:anchorId="6178B81B" wp14:editId="5C0108A7">
+            <wp:extent cx="6645910" cy="4627880"/>
+            <wp:effectExtent l="0" t="0" r="2540" b="1270"/>
+            <wp:docPr id="18" name="Picture 18"/>
+            <wp:cNvGraphicFramePr>
+              <a:graphicFrameLocks xmlns:a="http://schemas.openxmlformats.org/drawingml/2006/main" noChangeAspect="1"/>
+            </wp:cNvGraphicFramePr>
+            <a:graphic xmlns:a="http://schemas.openxmlformats.org/drawingml/2006/main">
+              <a:graphicData uri="http://schemas.openxmlformats.org/drawingml/2006/picture">
+                <pic:pic xmlns:pic="http://schemas.openxmlformats.org/drawingml/2006/picture">
+                  <pic:nvPicPr>
+                    <pic:cNvPr id="1" name=""/>
+                    <pic:cNvPicPr/>
+                  </pic:nvPicPr>
+                  <pic:blipFill>
+                    <a:blip r:embed="rId16"/>
+                    <a:stretch>
+                      <a:fillRect/>
+                    </a:stretch>
+                  </pic:blipFill>
+                  <pic:spPr>
+                    <a:xfrm>
+                      <a:off x="0" y="0"/>
+                      <a:ext cx="6645910" cy="4627880"/>
+                    </a:xfrm>
+                    <a:prstGeom prst="rect">
+                      <a:avLst/>
+                    </a:prstGeom>
+                  </pic:spPr>
+                </pic:pic>
+              </a:graphicData>
+            </a:graphic>
+          </wp:inline>
+        </w:drawing>
+      </w:r>
+    </w:p>
+    <w:p/>
+    <w:p/>
+    <w:p/>
+    <w:p/>
+    <w:p/>
+    <w:p/>
+    <w:p/>
+    <w:p/>
+    <w:p/>
+    <w:p/>
+    <w:p/>
+    <w:p/>
+    <w:p/>
+    <w:p/>
+    <w:p/>
+    <w:p/>
+    <w:p>
+      <w:pPr>
+        <w:pStyle w:val="Subtitle"/>
+      </w:pPr>
+      <w:r>
+        <w:lastRenderedPageBreak/>
+        <w:t>Shopping Cart Page</w:t>
+      </w:r>
+    </w:p>
+    <w:p/>
+    <w:p>
+      <w:pPr>
+        <w:jc w:val="center"/>
+      </w:pPr>
+      <w:r>
+        <w:drawing>
+          <wp:inline distT="0" distB="0" distL="0" distR="0" wp14:anchorId="76E49F0C" wp14:editId="070EC935">
+            <wp:extent cx="6645910" cy="4565650"/>
+            <wp:effectExtent l="0" t="0" r="2540" b="6350"/>
+            <wp:docPr id="19" name="Picture 19"/>
+            <wp:cNvGraphicFramePr>
+              <a:graphicFrameLocks xmlns:a="http://schemas.openxmlformats.org/drawingml/2006/main" noChangeAspect="1"/>
+            </wp:cNvGraphicFramePr>
+            <a:graphic xmlns:a="http://schemas.openxmlformats.org/drawingml/2006/main">
+              <a:graphicData uri="http://schemas.openxmlformats.org/drawingml/2006/picture">
+                <pic:pic xmlns:pic="http://schemas.openxmlformats.org/drawingml/2006/picture">
+                  <pic:nvPicPr>
+                    <pic:cNvPr id="1" name=""/>
+                    <pic:cNvPicPr/>
+                  </pic:nvPicPr>
+                  <pic:blipFill>
+                    <a:blip r:embed="rId17"/>
+                    <a:stretch>
+                      <a:fillRect/>
+                    </a:stretch>
+                  </pic:blipFill>
+                  <pic:spPr>
+                    <a:xfrm>
+                      <a:off x="0" y="0"/>
+                      <a:ext cx="6645910" cy="4565650"/>
+                    </a:xfrm>
+                    <a:prstGeom prst="rect">
+                      <a:avLst/>
+                    </a:prstGeom>
+                  </pic:spPr>
+                </pic:pic>
+              </a:graphicData>
+            </a:graphic>
+          </wp:inline>
+        </w:drawing>
+      </w:r>
+    </w:p>
+    <w:p/>
+    <w:p/>
+    <w:p/>
+    <w:p/>
+    <w:p/>
+    <w:p/>
+    <w:p/>
+    <w:p/>
+    <w:p/>
+    <w:p/>
+    <w:p/>
+    <w:p/>
+    <w:p/>
+    <w:p/>
+    <w:p/>
+    <w:p/>
+    <w:p>
+      <w:pPr>
+        <w:pStyle w:val="Subtitle"/>
+      </w:pPr>
+      <w:r>
+        <w:lastRenderedPageBreak/>
+        <w:t>Account Profile Page</w:t>
+      </w:r>
+    </w:p>
+    <w:p/>
+    <w:p>
+      <w:pPr>
+        <w:jc w:val="center"/>
+      </w:pPr>
+      <w:r>
+        <w:drawing>
+          <wp:inline distT="0" distB="0" distL="0" distR="0" wp14:anchorId="16E1FC5F" wp14:editId="14F11CDA">
+            <wp:extent cx="6645910" cy="4686935"/>
+            <wp:effectExtent l="0" t="0" r="2540" b="0"/>
+            <wp:docPr id="20" name="Picture 20"/>
+            <wp:cNvGraphicFramePr>
+              <a:graphicFrameLocks xmlns:a="http://schemas.openxmlformats.org/drawingml/2006/main" noChangeAspect="1"/>
+            </wp:cNvGraphicFramePr>
+            <a:graphic xmlns:a="http://schemas.openxmlformats.org/drawingml/2006/main">
+              <a:graphicData uri="http://schemas.openxmlformats.org/drawingml/2006/picture">
+                <pic:pic xmlns:pic="http://schemas.openxmlformats.org/drawingml/2006/picture">
+                  <pic:nvPicPr>
+                    <pic:cNvPr id="1" name=""/>
+                    <pic:cNvPicPr/>
+                  </pic:nvPicPr>
+                  <pic:blipFill>
+                    <a:blip r:embed="rId18"/>
+                    <a:stretch>
+                      <a:fillRect/>
+                    </a:stretch>
+                  </pic:blipFill>
+                  <pic:spPr>
+                    <a:xfrm>
+                      <a:off x="0" y="0"/>
+                      <a:ext cx="6645910" cy="4686935"/>
+                    </a:xfrm>
+                    <a:prstGeom prst="rect">
+                      <a:avLst/>
+                    </a:prstGeom>
+                  </pic:spPr>
+                </pic:pic>
+              </a:graphicData>
+            </a:graphic>
+          </wp:inline>
+        </w:drawing>
+      </w:r>
+    </w:p>
+    <w:p/>
+    <w:p/>
+    <w:p/>
+    <w:p/>
+    <w:p/>
+    <w:p/>
+    <w:p/>
+    <w:p/>
+    <w:p/>
+    <w:p/>
+    <w:p/>
+    <w:p/>
+    <w:p/>
+    <w:p/>
+    <w:p/>
+    <w:p>
+      <w:pPr>
+        <w:pStyle w:val="Subtitle"/>
+      </w:pPr>
+      <w:r>
+        <w:lastRenderedPageBreak/>
+        <w:t>My Orders Page</w:t>
+      </w:r>
+    </w:p>
+    <w:p/>
+    <w:p>
+      <w:pPr>
+        <w:jc w:val="center"/>
+      </w:pPr>
+      <w:r>
+        <w:drawing>
+          <wp:inline distT="0" distB="0" distL="0" distR="0" wp14:anchorId="1C2A00AD" wp14:editId="7FBB4570">
+            <wp:extent cx="6645910" cy="3970020"/>
+            <wp:effectExtent l="0" t="0" r="2540" b="0"/>
+            <wp:docPr id="21" name="Picture 21"/>
+            <wp:cNvGraphicFramePr>
+              <a:graphicFrameLocks xmlns:a="http://schemas.openxmlformats.org/drawingml/2006/main" noChangeAspect="1"/>
+            </wp:cNvGraphicFramePr>
+            <a:graphic xmlns:a="http://schemas.openxmlformats.org/drawingml/2006/main">
+              <a:graphicData uri="http://schemas.openxmlformats.org/drawingml/2006/picture">
+                <pic:pic xmlns:pic="http://schemas.openxmlformats.org/drawingml/2006/picture">
+                  <pic:nvPicPr>
+                    <pic:cNvPr id="1" name=""/>
+                    <pic:cNvPicPr/>
+                  </pic:nvPicPr>
+                  <pic:blipFill>
+                    <a:blip r:embed="rId19"/>
+                    <a:stretch>
+                      <a:fillRect/>
+                    </a:stretch>
+                  </pic:blipFill>
+                  <pic:spPr>
+                    <a:xfrm>
+                      <a:off x="0" y="0"/>
+                      <a:ext cx="6645910" cy="3970020"/>
+                    </a:xfrm>
+                    <a:prstGeom prst="rect">
+                      <a:avLst/>
+                    </a:prstGeom>
+                  </pic:spPr>
+                </pic:pic>
+              </a:graphicData>
+            </a:graphic>
+          </wp:inline>
+        </w:drawing>
+      </w:r>
+    </w:p>
+    <w:p/>
+    <w:p/>
+    <w:p/>
+    <w:p/>
+    <w:p/>
+    <w:p/>
+    <w:p/>
+    <w:p/>
+    <w:p/>
+    <w:p/>
+    <w:p/>
+    <w:p/>
+    <w:p/>
+    <w:p/>
+    <w:p/>
+    <w:p/>
+    <w:p/>
+    <w:p/>
+    <w:p>
+      <w:pPr>
+        <w:pStyle w:val="Subtitle"/>
+      </w:pPr>
+      <w:r>
+        <w:lastRenderedPageBreak/>
+        <w:t>My Loyalty Page</w:t>
+      </w:r>
+    </w:p>
+    <w:p/>
+    <w:p>
+      <w:pPr>
+        <w:jc w:val="center"/>
+      </w:pPr>
+      <w:r>
+        <w:drawing>
+          <wp:inline distT="0" distB="0" distL="0" distR="0" wp14:anchorId="2F772961" wp14:editId="55F5066C">
+            <wp:extent cx="6645910" cy="4472305"/>
+            <wp:effectExtent l="0" t="0" r="2540" b="4445"/>
+            <wp:docPr id="22" name="Picture 22"/>
+            <wp:cNvGraphicFramePr>
+              <a:graphicFrameLocks xmlns:a="http://schemas.openxmlformats.org/drawingml/2006/main" noChangeAspect="1"/>
+            </wp:cNvGraphicFramePr>
+            <a:graphic xmlns:a="http://schemas.openxmlformats.org/drawingml/2006/main">
+              <a:graphicData uri="http://schemas.openxmlformats.org/drawingml/2006/picture">
+                <pic:pic xmlns:pic="http://schemas.openxmlformats.org/drawingml/2006/picture">
+                  <pic:nvPicPr>
+                    <pic:cNvPr id="1" name=""/>
+                    <pic:cNvPicPr/>
+                  </pic:nvPicPr>
+                  <pic:blipFill>
+                    <a:blip r:embed="rId20"/>
+                    <a:stretch>
+                      <a:fillRect/>
+                    </a:stretch>
+                  </pic:blipFill>
+                  <pic:spPr>
+                    <a:xfrm>
+                      <a:off x="0" y="0"/>
+                      <a:ext cx="6645910" cy="4472305"/>
+                    </a:xfrm>
+                    <a:prstGeom prst="rect">
+                      <a:avLst/>
+                    </a:prstGeom>
+                  </pic:spPr>
+                </pic:pic>
+              </a:graphicData>
+            </a:graphic>
+          </wp:inline>
+        </w:drawing>
+      </w:r>
+    </w:p>
+    <w:p/>
+    <w:p/>
+    <w:p/>
+    <w:p/>
+    <w:p/>
+    <w:p/>
+    <w:p/>
+    <w:p/>
+    <w:p/>
+    <w:p/>
+    <w:p/>
+    <w:p/>
+    <w:p/>
+    <w:p/>
+    <w:p/>
+    <w:p/>
+    <w:p>
+      <w:pPr>
+        <w:pStyle w:val="Subtitle"/>
+      </w:pPr>
+      <w:r>
+        <w:lastRenderedPageBreak/>
+        <w:t>Address Book Page</w:t>
+      </w:r>
+    </w:p>
+    <w:p/>
+    <w:p>
+      <w:pPr>
+        <w:jc w:val="center"/>
+      </w:pPr>
+      <w:r>
+        <w:drawing>
+          <wp:inline distT="0" distB="0" distL="0" distR="0" wp14:anchorId="221D205A" wp14:editId="0E84B984">
+            <wp:extent cx="6645910" cy="3683000"/>
+            <wp:effectExtent l="0" t="0" r="2540" b="0"/>
+            <wp:docPr id="23" name="Picture 23"/>
+            <wp:cNvGraphicFramePr>
+              <a:graphicFrameLocks xmlns:a="http://schemas.openxmlformats.org/drawingml/2006/main" noChangeAspect="1"/>
+            </wp:cNvGraphicFramePr>
+            <a:graphic xmlns:a="http://schemas.openxmlformats.org/drawingml/2006/main">
+              <a:graphicData uri="http://schemas.openxmlformats.org/drawingml/2006/picture">
+                <pic:pic xmlns:pic="http://schemas.openxmlformats.org/drawingml/2006/picture">
+                  <pic:nvPicPr>
+                    <pic:cNvPr id="1" name=""/>
+                    <pic:cNvPicPr/>
+                  </pic:nvPicPr>
+                  <pic:blipFill>
+                    <a:blip r:embed="rId21"/>
+                    <a:stretch>
+                      <a:fillRect/>
+                    </a:stretch>
+                  </pic:blipFill>
+                  <pic:spPr>
+                    <a:xfrm>
+                      <a:off x="0" y="0"/>
+                      <a:ext cx="6645910" cy="3683000"/>
+                    </a:xfrm>
+                    <a:prstGeom prst="rect">
+                      <a:avLst/>
+                    </a:prstGeom>
+                  </pic:spPr>
+                </pic:pic>
+              </a:graphicData>
+            </a:graphic>
+          </wp:inline>
+        </w:drawing>
+      </w:r>
+    </w:p>
+    <w:p/>
+    <w:p/>
+    <w:p/>
+    <w:p/>
+    <w:p/>
+    <w:p/>
+    <w:p/>
+    <w:p/>
+    <w:p/>
+    <w:p/>
+    <w:p/>
+    <w:p/>
+    <w:p/>
+    <w:p/>
+    <w:p/>
+    <w:p/>
+    <w:p/>
+    <w:p/>
+    <w:p/>
+    <w:p>
+      <w:pPr>
+        <w:pStyle w:val="Subtitle"/>
+      </w:pPr>
+      <w:r>
+        <w:lastRenderedPageBreak/>
+        <w:t>Producer Dashboard Page (Order Management Section)</w:t>
+      </w:r>
+    </w:p>
+    <w:p/>
+    <w:p>
+      <w:pPr>
+        <w:jc w:val="center"/>
+      </w:pPr>
+      <w:r>
+        <w:drawing>
+          <wp:inline distT="0" distB="0" distL="0" distR="0" wp14:anchorId="1A5512E7" wp14:editId="0DD78B5C">
+            <wp:extent cx="6645910" cy="4700905"/>
+            <wp:effectExtent l="0" t="0" r="2540" b="4445"/>
+            <wp:docPr id="27" name="Picture 27"/>
+            <wp:cNvGraphicFramePr>
+              <a:graphicFrameLocks xmlns:a="http://schemas.openxmlformats.org/drawingml/2006/main" noChangeAspect="1"/>
+            </wp:cNvGraphicFramePr>
+            <a:graphic xmlns:a="http://schemas.openxmlformats.org/drawingml/2006/main">
+              <a:graphicData uri="http://schemas.openxmlformats.org/drawingml/2006/picture">
+                <pic:pic xmlns:pic="http://schemas.openxmlformats.org/drawingml/2006/picture">
+                  <pic:nvPicPr>
+                    <pic:cNvPr id="1" name=""/>
+                    <pic:cNvPicPr/>
+                  </pic:nvPicPr>
+                  <pic:blipFill>
+                    <a:blip r:embed="rId22"/>
+                    <a:stretch>
+                      <a:fillRect/>
+                    </a:stretch>
+                  </pic:blipFill>
+                  <pic:spPr>
+                    <a:xfrm>
+                      <a:off x="0" y="0"/>
+                      <a:ext cx="6645910" cy="4700905"/>
+                    </a:xfrm>
+                    <a:prstGeom prst="rect">
+                      <a:avLst/>
+                    </a:prstGeom>
+                  </pic:spPr>
+                </pic:pic>
+              </a:graphicData>
+            </a:graphic>
+          </wp:inline>
+        </w:drawing>
+      </w:r>
+    </w:p>
+    <w:p/>
+    <w:p/>
+    <w:p/>
+    <w:p/>
+    <w:p/>
+    <w:p/>
+    <w:p/>
+    <w:p/>
+    <w:p/>
+    <w:p/>
+    <w:p/>
+    <w:p/>
+    <w:p/>
+    <w:p/>
+    <w:p/>
+    <w:p>
+      <w:pPr>
+        <w:pStyle w:val="Subtitle"/>
+      </w:pPr>
+      <w:r>
+        <w:lastRenderedPageBreak/>
+        <w:t>Producer Dashboard Page (</w:t>
+      </w:r>
+      <w:r>
+        <w:t>Product</w:t>
+      </w:r>
+      <w:r>
+        <w:t xml:space="preserve"> Management Section)</w:t>
+      </w:r>
+    </w:p>
+    <w:p/>
+    <w:p>
+      <w:pPr>
+        <w:jc w:val="center"/>
+      </w:pPr>
+      <w:r>
+        <w:drawing>
+          <wp:inline distT="0" distB="0" distL="0" distR="0" wp14:anchorId="30240187" wp14:editId="405F1394">
+            <wp:extent cx="6645910" cy="4721225"/>
+            <wp:effectExtent l="0" t="0" r="2540" b="3175"/>
+            <wp:docPr id="28" name="Picture 28"/>
+            <wp:cNvGraphicFramePr>
+              <a:graphicFrameLocks xmlns:a="http://schemas.openxmlformats.org/drawingml/2006/main" noChangeAspect="1"/>
+            </wp:cNvGraphicFramePr>
+            <a:graphic xmlns:a="http://schemas.openxmlformats.org/drawingml/2006/main">
+              <a:graphicData uri="http://schemas.openxmlformats.org/drawingml/2006/picture">
+                <pic:pic xmlns:pic="http://schemas.openxmlformats.org/drawingml/2006/picture">
+                  <pic:nvPicPr>
+                    <pic:cNvPr id="1" name=""/>
+                    <pic:cNvPicPr/>
+                  </pic:nvPicPr>
+                  <pic:blipFill>
+                    <a:blip r:embed="rId23"/>
+                    <a:stretch>
+                      <a:fillRect/>
+                    </a:stretch>
+                  </pic:blipFill>
+                  <pic:spPr>
+                    <a:xfrm>
+                      <a:off x="0" y="0"/>
+                      <a:ext cx="6645910" cy="4721225"/>
+                    </a:xfrm>
+                    <a:prstGeom prst="rect">
+                      <a:avLst/>
+                    </a:prstGeom>
+                  </pic:spPr>
+                </pic:pic>
+              </a:graphicData>
+            </a:graphic>
+          </wp:inline>
+        </w:drawing>
+      </w:r>
+    </w:p>
+    <w:p/>
+    <w:p/>
+    <w:p/>
+    <w:p/>
+    <w:p/>
+    <w:p/>
+    <w:p/>
+    <w:p/>
+    <w:p/>
+    <w:p/>
+    <w:p/>
+    <w:p/>
+    <w:p/>
+    <w:p/>
+    <w:p/>
+    <w:p>
+      <w:pPr>
+        <w:pStyle w:val="Subtitle"/>
+      </w:pPr>
+      <w:r>
+        <w:lastRenderedPageBreak/>
+        <w:t>Producer Dashboard Page (Produ</w:t>
+      </w:r>
+      <w:r>
+        <w:t xml:space="preserve">cer Details </w:t>
+      </w:r>
+      <w:r>
+        <w:t>Section)</w:t>
+      </w:r>
+    </w:p>
+    <w:p/>
+    <w:p>
+      <w:pPr>
+        <w:jc w:val="center"/>
+      </w:pPr>
+      <w:r>
+        <w:drawing>
+          <wp:inline distT="0" distB="0" distL="0" distR="0" wp14:anchorId="5217678C" wp14:editId="1F540E1E">
+            <wp:extent cx="6645910" cy="5136515"/>
+            <wp:effectExtent l="0" t="0" r="2540" b="6985"/>
+            <wp:docPr id="29" name="Picture 29"/>
+            <wp:cNvGraphicFramePr>
+              <a:graphicFrameLocks xmlns:a="http://schemas.openxmlformats.org/drawingml/2006/main" noChangeAspect="1"/>
+            </wp:cNvGraphicFramePr>
+            <a:graphic xmlns:a="http://schemas.openxmlformats.org/drawingml/2006/main">
+              <a:graphicData uri="http://schemas.openxmlformats.org/drawingml/2006/picture">
+                <pic:pic xmlns:pic="http://schemas.openxmlformats.org/drawingml/2006/picture">
+                  <pic:nvPicPr>
+                    <pic:cNvPr id="1" name=""/>
+                    <pic:cNvPicPr/>
+                  </pic:nvPicPr>
+                  <pic:blipFill>
+                    <a:blip r:embed="rId24"/>
+                    <a:stretch>
+                      <a:fillRect/>
+                    </a:stretch>
+                  </pic:blipFill>
+                  <pic:spPr>
+                    <a:xfrm>
+                      <a:off x="0" y="0"/>
+                      <a:ext cx="6645910" cy="5136515"/>
+                    </a:xfrm>
+                    <a:prstGeom prst="rect">
+                      <a:avLst/>
+                    </a:prstGeom>
+                  </pic:spPr>
+                </pic:pic>
+              </a:graphicData>
+            </a:graphic>
+          </wp:inline>
+        </w:drawing>
+      </w:r>
+    </w:p>
+    <w:p/>
+    <w:p/>
+    <w:p/>
+    <w:p/>
+    <w:p/>
+    <w:p/>
+    <w:p/>
+    <w:p/>
+    <w:p/>
+    <w:p/>
+    <w:p/>
+    <w:p/>
+    <w:p/>
+    <w:p/>
+    <w:p>
+      <w:pPr>
+        <w:pStyle w:val="Subtitle"/>
+      </w:pPr>
+      <w:r>
+        <w:lastRenderedPageBreak/>
+        <w:t>Register Page</w:t>
+      </w:r>
+    </w:p>
+    <w:p/>
+    <w:p>
+      <w:pPr>
+        <w:jc w:val="center"/>
+      </w:pPr>
+      <w:r>
+        <w:drawing>
+          <wp:inline distT="0" distB="0" distL="0" distR="0" wp14:anchorId="796E06F0" wp14:editId="531FC43B">
+            <wp:extent cx="6645910" cy="4770120"/>
+            <wp:effectExtent l="0" t="0" r="2540" b="0"/>
+            <wp:docPr id="24" name="Picture 24"/>
+            <wp:cNvGraphicFramePr>
+              <a:graphicFrameLocks xmlns:a="http://schemas.openxmlformats.org/drawingml/2006/main" noChangeAspect="1"/>
+            </wp:cNvGraphicFramePr>
+            <a:graphic xmlns:a="http://schemas.openxmlformats.org/drawingml/2006/main">
+              <a:graphicData uri="http://schemas.openxmlformats.org/drawingml/2006/picture">
+                <pic:pic xmlns:pic="http://schemas.openxmlformats.org/drawingml/2006/picture">
+                  <pic:nvPicPr>
+                    <pic:cNvPr id="1" name=""/>
+                    <pic:cNvPicPr/>
+                  </pic:nvPicPr>
+                  <pic:blipFill>
+                    <a:blip r:embed="rId25"/>
+                    <a:stretch>
+                      <a:fillRect/>
+                    </a:stretch>
+                  </pic:blipFill>
+                  <pic:spPr>
+                    <a:xfrm>
+                      <a:off x="0" y="0"/>
+                      <a:ext cx="6645910" cy="4770120"/>
+                    </a:xfrm>
+                    <a:prstGeom prst="rect">
+                      <a:avLst/>
+                    </a:prstGeom>
+                  </pic:spPr>
+                </pic:pic>
+              </a:graphicData>
+            </a:graphic>
+          </wp:inline>
+        </w:drawing>
+      </w:r>
+    </w:p>
+    <w:p/>
+    <w:p/>
+    <w:p/>
+    <w:p/>
+    <w:p/>
+    <w:p/>
+    <w:p/>
+    <w:p/>
+    <w:p/>
+    <w:p/>
+    <w:p/>
+    <w:p/>
+    <w:p/>
+    <w:p/>
+    <w:p/>
+    <w:p>
+      <w:pPr>
+        <w:pStyle w:val="Subtitle"/>
+      </w:pPr>
+      <w:r>
+        <w:lastRenderedPageBreak/>
+        <w:t>Sign in Page</w:t>
+      </w:r>
+    </w:p>
+    <w:p/>
+    <w:p>
+      <w:pPr>
+        <w:jc w:val="center"/>
+      </w:pPr>
+      <w:r>
+        <w:drawing>
+          <wp:inline distT="0" distB="0" distL="0" distR="0" wp14:anchorId="363E8C3F" wp14:editId="0763FD09">
+            <wp:extent cx="6645910" cy="4770120"/>
+            <wp:effectExtent l="0" t="0" r="2540" b="0"/>
+            <wp:docPr id="25" name="Picture 25"/>
+            <wp:cNvGraphicFramePr>
+              <a:graphicFrameLocks xmlns:a="http://schemas.openxmlformats.org/drawingml/2006/main" noChangeAspect="1"/>
+            </wp:cNvGraphicFramePr>
+            <a:graphic xmlns:a="http://schemas.openxmlformats.org/drawingml/2006/main">
+              <a:graphicData uri="http://schemas.openxmlformats.org/drawingml/2006/picture">
+                <pic:pic xmlns:pic="http://schemas.openxmlformats.org/drawingml/2006/picture">
+                  <pic:nvPicPr>
+                    <pic:cNvPr id="1" name=""/>
+                    <pic:cNvPicPr/>
+                  </pic:nvPicPr>
+                  <pic:blipFill>
+                    <a:blip r:embed="rId26"/>
+                    <a:stretch>
+                      <a:fillRect/>
+                    </a:stretch>
+                  </pic:blipFill>
+                  <pic:spPr>
+                    <a:xfrm>
+                      <a:off x="0" y="0"/>
+                      <a:ext cx="6645910" cy="4770120"/>
+                    </a:xfrm>
+                    <a:prstGeom prst="rect">
+                      <a:avLst/>
+                    </a:prstGeom>
+                  </pic:spPr>
+                </pic:pic>
+              </a:graphicData>
+            </a:graphic>
+          </wp:inline>
+        </w:drawing>
+      </w:r>
+    </w:p>
+    <w:p/>
+    <w:p/>
+    <w:p>
+      <w:pPr>
+        <w:pStyle w:val="Subtitle"/>
+      </w:pPr>
+    </w:p>
+    <w:p>
+      <w:pPr>
+        <w:pStyle w:val="Subtitle"/>
+      </w:pPr>
+    </w:p>
+    <w:p>
+      <w:pPr>
+        <w:pStyle w:val="Subtitle"/>
+      </w:pPr>
+    </w:p>
+    <w:p>
+      <w:pPr>
+        <w:pStyle w:val="Subtitle"/>
+      </w:pPr>
+    </w:p>
+    <w:p>
+      <w:pPr>
+        <w:pStyle w:val="Subtitle"/>
+      </w:pPr>
+    </w:p>
+    <w:p>
+      <w:pPr>
+        <w:pStyle w:val="Subtitle"/>
+      </w:pPr>
+    </w:p>
+    <w:p>
+      <w:pPr>
+        <w:pStyle w:val="Subtitle"/>
+      </w:pPr>
+    </w:p>
+    <w:p>
+      <w:pPr>
+        <w:pStyle w:val="Subtitle"/>
+      </w:pPr>
+    </w:p>
+    <w:p>
+      <w:pPr>
+        <w:pStyle w:val="Subtitle"/>
+      </w:pPr>
+    </w:p>
+    <w:p>
+      <w:pPr>
+        <w:pStyle w:val="Subtitle"/>
+      </w:pPr>
+    </w:p>
+    <w:p>
+      <w:pPr>
+        <w:pStyle w:val="Subtitle"/>
+      </w:pPr>
+    </w:p>
+    <w:p>
+      <w:pPr>
+        <w:pStyle w:val="Subtitle"/>
+      </w:pPr>
+    </w:p>
+    <w:p>
+      <w:pPr>
+        <w:pStyle w:val="Subtitle"/>
+      </w:pPr>
+    </w:p>
+    <w:p>
+      <w:pPr>
+        <w:pStyle w:val="Subtitle"/>
+      </w:pPr>
+      <w:r>
+        <w:lastRenderedPageBreak/>
+        <w:t>Forgot Password Page</w:t>
+      </w:r>
+    </w:p>
+    <w:p/>
+    <w:p>
+      <w:pPr>
+        <w:jc w:val="center"/>
+      </w:pPr>
+      <w:r>
+        <w:drawing>
+          <wp:inline distT="0" distB="0" distL="0" distR="0" wp14:anchorId="4CD470DB" wp14:editId="727E3F44">
+            <wp:extent cx="6645910" cy="4770120"/>
+            <wp:effectExtent l="0" t="0" r="2540" b="0"/>
+            <wp:docPr id="26" name="Picture 26"/>
+            <wp:cNvGraphicFramePr>
+              <a:graphicFrameLocks xmlns:a="http://schemas.openxmlformats.org/drawingml/2006/main" noChangeAspect="1"/>
+            </wp:cNvGraphicFramePr>
+            <a:graphic xmlns:a="http://schemas.openxmlformats.org/drawingml/2006/main">
+              <a:graphicData uri="http://schemas.openxmlformats.org/drawingml/2006/picture">
+                <pic:pic xmlns:pic="http://schemas.openxmlformats.org/drawingml/2006/picture">
+                  <pic:nvPicPr>
+                    <pic:cNvPr id="1" name=""/>
+                    <pic:cNvPicPr/>
+                  </pic:nvPicPr>
+                  <pic:blipFill>
+                    <a:blip r:embed="rId27"/>
+                    <a:stretch>
+                      <a:fillRect/>
+                    </a:stretch>
+                  </pic:blipFill>
+                  <pic:spPr>
+                    <a:xfrm>
+                      <a:off x="0" y="0"/>
+                      <a:ext cx="6645910" cy="4770120"/>
+                    </a:xfrm>
+                    <a:prstGeom prst="rect">
+                      <a:avLst/>
+                    </a:prstGeom>
+                  </pic:spPr>
+                </pic:pic>
+              </a:graphicData>
+            </a:graphic>
+          </wp:inline>
+        </w:drawing>
+      </w:r>
+    </w:p>
     <w:p/>
     <w:p/>
     <w:p/>
@@ -1071,15 +2368,15 @@
       <w:pPr>
         <w:pStyle w:val="Heading1"/>
       </w:pPr>
-      <w:bookmarkStart w:id="2" w:name="_Toc224291315"/>
+      <w:bookmarkStart w:id="2" w:name="_Toc224568267"/>
       <w:r>
         <w:lastRenderedPageBreak/>
         <w:t>Algorithm Designs</w:t>
       </w:r>
-      <w:bookmarkEnd w:id="2"/>
       <w:r>
         <w:t xml:space="preserve"> (Flowcharts)</w:t>
       </w:r>
+      <w:bookmarkEnd w:id="2"/>
     </w:p>
     <w:p/>
     <w:p>
@@ -1115,7 +2412,7 @@
                     <pic:cNvPicPr/>
                   </pic:nvPicPr>
                   <pic:blipFill>
-                    <a:blip r:embed="rId8">
+                    <a:blip r:embed="rId28">
                       <a:extLst>
                         <a:ext uri="{28A0092B-C50C-407E-A947-70E740481C1C}">
                           <a14:useLocalDpi xmlns:a14="http://schemas.microsoft.com/office/drawing/2010/main" val="0"/>
@@ -1144,6 +2441,11 @@
     </w:p>
     <w:p/>
     <w:p/>
+    <w:p>
+      <w:r>
+        <w:t xml:space="preserve">A </w:t>
+      </w:r>
+    </w:p>
     <w:p/>
     <w:p/>
     <w:p/>
@@ -1155,7 +2457,6 @@
         <w:pStyle w:val="Subtitle"/>
       </w:pPr>
       <w:r>
-        <w:lastRenderedPageBreak/>
         <w:t>Log in Flowchart</w:t>
       </w:r>
     </w:p>
@@ -1184,7 +2485,7 @@
                     <pic:cNvPicPr/>
                   </pic:nvPicPr>
                   <pic:blipFill>
-                    <a:blip r:embed="rId9">
+                    <a:blip r:embed="rId29">
                       <a:extLst>
                         <a:ext uri="{28A0092B-C50C-407E-A947-70E740481C1C}">
                           <a14:useLocalDpi xmlns:a14="http://schemas.microsoft.com/office/drawing/2010/main" val="0"/>
@@ -1221,7 +2522,7 @@
       <w:pPr>
         <w:pStyle w:val="Heading1"/>
       </w:pPr>
-      <w:bookmarkStart w:id="3" w:name="_Toc224291316"/>
+      <w:bookmarkStart w:id="3" w:name="_Toc224568268"/>
       <w:r>
         <w:lastRenderedPageBreak/>
         <w:t xml:space="preserve">Database </w:t>
@@ -1241,7 +2542,7 @@
       <w:pPr>
         <w:pStyle w:val="Heading1"/>
       </w:pPr>
-      <w:bookmarkStart w:id="4" w:name="_Toc224291317"/>
+      <w:bookmarkStart w:id="4" w:name="_Toc224568269"/>
       <w:r>
         <w:t>Data Dictionary</w:t>
       </w:r>
@@ -1252,7 +2553,7 @@
       <w:pPr>
         <w:pStyle w:val="Heading2"/>
       </w:pPr>
-      <w:bookmarkStart w:id="5" w:name="_Toc224291318"/>
+      <w:bookmarkStart w:id="5" w:name="_Toc224568270"/>
       <w:r>
         <w:t>MVC System Data Dictionary</w:t>
       </w:r>
@@ -1578,13 +2879,7 @@
           </w:tcPr>
           <w:p>
             <w:r>
-              <w:t>Normali</w:t>
-            </w:r>
-            <w:r>
-              <w:t>s</w:t>
-            </w:r>
-            <w:r>
-              <w:t>ed username for lookups</w:t>
+              <w:t>Normalised username for lookups</w:t>
             </w:r>
           </w:p>
         </w:tc>
@@ -1646,10 +2941,7 @@
           </w:tcPr>
           <w:p>
             <w:r>
-              <w:t>The user’s</w:t>
-            </w:r>
-            <w:r>
-              <w:t xml:space="preserve"> email address</w:t>
+              <w:t>The user’s email address</w:t>
             </w:r>
           </w:p>
         </w:tc>
@@ -1711,13 +3003,7 @@
           </w:tcPr>
           <w:p>
             <w:r>
-              <w:t>Normali</w:t>
-            </w:r>
-            <w:r>
-              <w:t>s</w:t>
-            </w:r>
-            <w:r>
-              <w:t>ed email for lookups</w:t>
+              <w:t>Normalised email for lookups</w:t>
             </w:r>
           </w:p>
         </w:tc>
@@ -1779,10 +3065,7 @@
           </w:tcPr>
           <w:p>
             <w:r>
-              <w:t>Shows</w:t>
-            </w:r>
-            <w:r>
-              <w:t xml:space="preserve"> if email is confirmed</w:t>
+              <w:t>Shows if email is confirmed</w:t>
             </w:r>
           </w:p>
         </w:tc>
@@ -2092,10 +3375,7 @@
           </w:tcPr>
           <w:p>
             <w:r>
-              <w:t>Shows</w:t>
-            </w:r>
-            <w:r>
-              <w:t xml:space="preserve"> if phone is confirmed</w:t>
+              <w:t>Shows if phone is confirmed</w:t>
             </w:r>
           </w:p>
         </w:tc>
@@ -2157,10 +3437,7 @@
           </w:tcPr>
           <w:p>
             <w:r>
-              <w:t>Shows</w:t>
-            </w:r>
-            <w:r>
-              <w:t xml:space="preserve"> if 2FA is enabled</w:t>
+              <w:t>Shows if 2FA is enabled</w:t>
             </w:r>
           </w:p>
         </w:tc>
@@ -2222,13 +3499,7 @@
           </w:tcPr>
           <w:p>
             <w:r>
-              <w:t>Date</w:t>
-            </w:r>
-            <w:r>
-              <w:t xml:space="preserve"> and t</w:t>
-            </w:r>
-            <w:r>
-              <w:t xml:space="preserve">ime when lockout </w:t>
+              <w:t xml:space="preserve">Date and time when lockout </w:t>
             </w:r>
             <w:proofErr w:type="gramStart"/>
             <w:r>
@@ -2291,10 +3562,7 @@
           </w:tcPr>
           <w:p>
             <w:r>
-              <w:t>Shows</w:t>
-            </w:r>
-            <w:r>
-              <w:t xml:space="preserve"> if lockout is enabled</w:t>
+              <w:t>Shows if lockout is enabled</w:t>
             </w:r>
           </w:p>
         </w:tc>
@@ -2356,10 +3624,7 @@
           </w:tcPr>
           <w:p>
             <w:r>
-              <w:t>The amount</w:t>
-            </w:r>
-            <w:r>
-              <w:t xml:space="preserve"> of failed access attempts</w:t>
+              <w:t>The amount of failed access attempts</w:t>
             </w:r>
           </w:p>
         </w:tc>
@@ -2650,10 +3915,7 @@
           </w:tcPr>
           <w:p>
             <w:r>
-              <w:t>The r</w:t>
-            </w:r>
-            <w:r>
-              <w:t>ole name</w:t>
+              <w:t>The role name</w:t>
             </w:r>
           </w:p>
         </w:tc>
@@ -2715,13 +3977,7 @@
           </w:tcPr>
           <w:p>
             <w:r>
-              <w:t>Normali</w:t>
-            </w:r>
-            <w:r>
-              <w:t>s</w:t>
-            </w:r>
-            <w:r>
-              <w:t>ed role name for lookups</w:t>
+              <w:t>Normalised role name for lookups</w:t>
             </w:r>
           </w:p>
         </w:tc>
@@ -3025,10 +4281,7 @@
               <w:t>PK</w:t>
             </w:r>
             <w:r>
-              <w:t xml:space="preserve"> </w:t>
-            </w:r>
-            <w:r>
-              <w:t>(Composite)</w:t>
+              <w:t xml:space="preserve"> (Composite)</w:t>
             </w:r>
             <w:r>
               <w:t>, FK</w:t>
@@ -3083,16 +4336,7 @@
           </w:tcPr>
           <w:p>
             <w:r>
-              <w:t xml:space="preserve">Links the role </w:t>
-            </w:r>
-            <w:r>
-              <w:t>task</w:t>
-            </w:r>
-            <w:r>
-              <w:t xml:space="preserve"> to a specific </w:t>
-            </w:r>
-            <w:r>
-              <w:t>role</w:t>
+              <w:t>Links the role task to a specific role</w:t>
             </w:r>
           </w:p>
         </w:tc>
@@ -3102,13 +4346,7 @@
           </w:tcPr>
           <w:p>
             <w:r>
-              <w:t>PK</w:t>
-            </w:r>
-            <w:r>
-              <w:t xml:space="preserve"> </w:t>
-            </w:r>
-            <w:r>
-              <w:t>(Composite), FK</w:t>
+              <w:t>PK (Composite), FK</w:t>
             </w:r>
           </w:p>
         </w:tc>
@@ -4162,13 +5400,7 @@
           </w:tcPr>
           <w:p>
             <w:r>
-              <w:t>PK</w:t>
-            </w:r>
-            <w:r>
-              <w:t xml:space="preserve"> </w:t>
-            </w:r>
-            <w:r>
-              <w:t>(Composite)</w:t>
+              <w:t>PK (Composite)</w:t>
             </w:r>
           </w:p>
         </w:tc>
@@ -4589,10 +5821,7 @@
           </w:tcPr>
           <w:p>
             <w:r>
-              <w:t>PK (Composite</w:t>
-            </w:r>
-            <w:r>
-              <w:t xml:space="preserve">), </w:t>
+              <w:t xml:space="preserve">PK (Composite), </w:t>
             </w:r>
             <w:r>
               <w:t>FK</w:t>
@@ -5109,12 +6338,11 @@
     </w:tbl>
     <w:p/>
     <w:p/>
-    <w:p/>
     <w:p>
       <w:pPr>
         <w:pStyle w:val="Heading2"/>
       </w:pPr>
-      <w:bookmarkStart w:id="6" w:name="_Toc224291319"/>
+      <w:bookmarkStart w:id="6" w:name="_Toc224568271"/>
       <w:r>
         <w:t>Greenfield Local Hub Data Dictionary</w:t>
       </w:r>
@@ -5130,10 +6358,12 @@
       <w:pPr>
         <w:pStyle w:val="Heading1"/>
       </w:pPr>
+      <w:bookmarkStart w:id="7" w:name="_Toc224568272"/>
       <w:r>
         <w:lastRenderedPageBreak/>
         <w:t>Test Strategy</w:t>
       </w:r>
+      <w:bookmarkEnd w:id="7"/>
     </w:p>
     <w:p/>
     <w:tbl>
@@ -5693,6 +6923,56 @@
     </w:sectPr>
   </w:body>
 </w:document>
+</file>
+
+<file path=word/endnotes.xml><?xml version="1.0" encoding="utf-8"?>
+<w:endnotes xmlns:wpc="http://schemas.microsoft.com/office/word/2010/wordprocessingCanvas" xmlns:cx="http://schemas.microsoft.com/office/drawing/2014/chartex" xmlns:cx1="http://schemas.microsoft.com/office/drawing/2015/9/8/chartex" xmlns:cx2="http://schemas.microsoft.com/office/drawing/2015/10/21/chartex" xmlns:cx3="http://schemas.microsoft.com/office/drawing/2016/5/9/chartex" xmlns:cx4="http://schemas.microsoft.com/office/drawing/2016/5/10/chartex" xmlns:cx5="http://schemas.microsoft.com/office/drawing/2016/5/11/chartex" xmlns:cx6="http://schemas.microsoft.com/office/drawing/2016/5/12/chartex" xmlns:cx7="http://schemas.microsoft.com/office/drawing/2016/5/13/chartex" xmlns:cx8="http://schemas.microsoft.com/office/drawing/2016/5/14/chartex" xmlns:mc="http://schemas.openxmlformats.org/markup-compatibility/2006" xmlns:aink="http://schemas.microsoft.com/office/drawing/2016/ink" xmlns:am3d="http://schemas.microsoft.com/office/drawing/2017/model3d" xmlns:o="urn:schemas-microsoft-com:office:office" xmlns:r="http://schemas.openxmlformats.org/officeDocument/2006/relationships" xmlns:m="http://schemas.openxmlformats.org/officeDocument/2006/math" xmlns:v="urn:schemas-microsoft-com:vml" xmlns:wp14="http://schemas.microsoft.com/office/word/2010/wordprocessingDrawing" xmlns:wp="http://schemas.openxmlformats.org/drawingml/2006/wordprocessingDrawing" xmlns:w10="urn:schemas-microsoft-com:office:word" xmlns:w="http://schemas.openxmlformats.org/wordprocessingml/2006/main" xmlns:w14="http://schemas.microsoft.com/office/word/2010/wordml" xmlns:w15="http://schemas.microsoft.com/office/word/2012/wordml" xmlns:w16cex="http://schemas.microsoft.com/office/word/2018/wordml/cex" xmlns:w16cid="http://schemas.microsoft.com/office/word/2016/wordml/cid" xmlns:w16="http://schemas.microsoft.com/office/word/2018/wordml" xmlns:w16sdtdh="http://schemas.microsoft.com/office/word/2020/wordml/sdtdatahash" xmlns:w16se="http://schemas.microsoft.com/office/word/2015/wordml/symex" xmlns:wpg="http://schemas.microsoft.com/office/word/2010/wordprocessingGroup" xmlns:wpi="http://schemas.microsoft.com/office/word/2010/wordprocessingInk" xmlns:wne="http://schemas.microsoft.com/office/word/2006/wordml" xmlns:wps="http://schemas.microsoft.com/office/word/2010/wordprocessingShape" mc:Ignorable="w14 w15 w16se w16cid w16 w16cex w16sdtdh wp14">
+  <w:endnote w:type="separator" w:id="-1">
+    <w:p>
+      <w:pPr>
+        <w:spacing w:after="0" w:line="240" w:lineRule="auto"/>
+      </w:pPr>
+      <w:r>
+        <w:separator/>
+      </w:r>
+    </w:p>
+  </w:endnote>
+  <w:endnote w:type="continuationSeparator" w:id="0">
+    <w:p>
+      <w:pPr>
+        <w:spacing w:after="0" w:line="240" w:lineRule="auto"/>
+      </w:pPr>
+      <w:r>
+        <w:continuationSeparator/>
+      </w:r>
+    </w:p>
+  </w:endnote>
+</w:endnotes>
+</file>
+
+<file path=word/footnotes.xml><?xml version="1.0" encoding="utf-8"?>
+<w:footnotes xmlns:wpc="http://schemas.microsoft.com/office/word/2010/wordprocessingCanvas" xmlns:cx="http://schemas.microsoft.com/office/drawing/2014/chartex" xmlns:cx1="http://schemas.microsoft.com/office/drawing/2015/9/8/chartex" xmlns:cx2="http://schemas.microsoft.com/office/drawing/2015/10/21/chartex" xmlns:cx3="http://schemas.microsoft.com/office/drawing/2016/5/9/chartex" xmlns:cx4="http://schemas.microsoft.com/office/drawing/2016/5/10/chartex" xmlns:cx5="http://schemas.microsoft.com/office/drawing/2016/5/11/chartex" xmlns:cx6="http://schemas.microsoft.com/office/drawing/2016/5/12/chartex" xmlns:cx7="http://schemas.microsoft.com/office/drawing/2016/5/13/chartex" xmlns:cx8="http://schemas.microsoft.com/office/drawing/2016/5/14/chartex" xmlns:mc="http://schemas.openxmlformats.org/markup-compatibility/2006" xmlns:aink="http://schemas.microsoft.com/office/drawing/2016/ink" xmlns:am3d="http://schemas.microsoft.com/office/drawing/2017/model3d" xmlns:o="urn:schemas-microsoft-com:office:office" xmlns:r="http://schemas.openxmlformats.org/officeDocument/2006/relationships" xmlns:m="http://schemas.openxmlformats.org/officeDocument/2006/math" xmlns:v="urn:schemas-microsoft-com:vml" xmlns:wp14="http://schemas.microsoft.com/office/word/2010/wordprocessingDrawing" xmlns:wp="http://schemas.openxmlformats.org/drawingml/2006/wordprocessingDrawing" xmlns:w10="urn:schemas-microsoft-com:office:word" xmlns:w="http://schemas.openxmlformats.org/wordprocessingml/2006/main" xmlns:w14="http://schemas.microsoft.com/office/word/2010/wordml" xmlns:w15="http://schemas.microsoft.com/office/word/2012/wordml" xmlns:w16cex="http://schemas.microsoft.com/office/word/2018/wordml/cex" xmlns:w16cid="http://schemas.microsoft.com/office/word/2016/wordml/cid" xmlns:w16="http://schemas.microsoft.com/office/word/2018/wordml" xmlns:w16sdtdh="http://schemas.microsoft.com/office/word/2020/wordml/sdtdatahash" xmlns:w16se="http://schemas.microsoft.com/office/word/2015/wordml/symex" xmlns:wpg="http://schemas.microsoft.com/office/word/2010/wordprocessingGroup" xmlns:wpi="http://schemas.microsoft.com/office/word/2010/wordprocessingInk" xmlns:wne="http://schemas.microsoft.com/office/word/2006/wordml" xmlns:wps="http://schemas.microsoft.com/office/word/2010/wordprocessingShape" mc:Ignorable="w14 w15 w16se w16cid w16 w16cex w16sdtdh wp14">
+  <w:footnote w:type="separator" w:id="-1">
+    <w:p>
+      <w:pPr>
+        <w:spacing w:after="0" w:line="240" w:lineRule="auto"/>
+      </w:pPr>
+      <w:r>
+        <w:separator/>
+      </w:r>
+    </w:p>
+  </w:footnote>
+  <w:footnote w:type="continuationSeparator" w:id="0">
+    <w:p>
+      <w:pPr>
+        <w:spacing w:after="0" w:line="240" w:lineRule="auto"/>
+      </w:pPr>
+      <w:r>
+        <w:continuationSeparator/>
+      </w:r>
+    </w:p>
+  </w:footnote>
+</w:footnotes>
 </file>
 
 <file path=word/styles.xml><?xml version="1.0" encoding="utf-8"?>
@@ -6140,6 +7420,7 @@
   <w:style w:type="character" w:default="1" w:styleId="DefaultParagraphFont">
     <w:name w:val="Default Paragraph Font"/>
     <w:uiPriority w:val="1"/>
+    <w:semiHidden/>
     <w:unhideWhenUsed/>
   </w:style>
   <w:style w:type="table" w:default="1" w:styleId="TableNormal">
@@ -6349,6 +7630,67 @@
       <w:u w:val="single"/>
     </w:rPr>
   </w:style>
+  <w:style w:type="paragraph" w:styleId="NormalWeb">
+    <w:name w:val="Normal (Web)"/>
+    <w:basedOn w:val="Normal"/>
+    <w:uiPriority w:val="99"/>
+    <w:semiHidden/>
+    <w:unhideWhenUsed/>
+    <w:rsid w:val="00355212"/>
+    <w:pPr>
+      <w:spacing w:before="100" w:beforeAutospacing="1" w:after="100" w:afterAutospacing="1" w:line="240" w:lineRule="auto"/>
+    </w:pPr>
+    <w:rPr>
+      <w:rFonts w:ascii="Times New Roman" w:eastAsia="Times New Roman" w:hAnsi="Times New Roman" w:cs="Times New Roman"/>
+      <w:sz w:val="24"/>
+      <w:szCs w:val="24"/>
+      <w:lang w:eastAsia="en-GB"/>
+    </w:rPr>
+  </w:style>
+  <w:style w:type="paragraph" w:styleId="Header">
+    <w:name w:val="header"/>
+    <w:basedOn w:val="Normal"/>
+    <w:link w:val="HeaderChar"/>
+    <w:uiPriority w:val="99"/>
+    <w:unhideWhenUsed/>
+    <w:rsid w:val="00E365F8"/>
+    <w:pPr>
+      <w:tabs>
+        <w:tab w:val="center" w:pos="4513"/>
+        <w:tab w:val="right" w:pos="9026"/>
+      </w:tabs>
+      <w:spacing w:after="0" w:line="240" w:lineRule="auto"/>
+    </w:pPr>
+  </w:style>
+  <w:style w:type="character" w:customStyle="1" w:styleId="HeaderChar">
+    <w:name w:val="Header Char"/>
+    <w:basedOn w:val="DefaultParagraphFont"/>
+    <w:link w:val="Header"/>
+    <w:uiPriority w:val="99"/>
+    <w:rsid w:val="00E365F8"/>
+  </w:style>
+  <w:style w:type="paragraph" w:styleId="Footer">
+    <w:name w:val="footer"/>
+    <w:basedOn w:val="Normal"/>
+    <w:link w:val="FooterChar"/>
+    <w:uiPriority w:val="99"/>
+    <w:unhideWhenUsed/>
+    <w:rsid w:val="00E365F8"/>
+    <w:pPr>
+      <w:tabs>
+        <w:tab w:val="center" w:pos="4513"/>
+        <w:tab w:val="right" w:pos="9026"/>
+      </w:tabs>
+      <w:spacing w:after="0" w:line="240" w:lineRule="auto"/>
+    </w:pPr>
+  </w:style>
+  <w:style w:type="character" w:customStyle="1" w:styleId="FooterChar">
+    <w:name w:val="Footer Char"/>
+    <w:basedOn w:val="DefaultParagraphFont"/>
+    <w:link w:val="Footer"/>
+    <w:uiPriority w:val="99"/>
+    <w:rsid w:val="00E365F8"/>
+  </w:style>
 </w:styles>
 </file>
 
@@ -6430,21 +7772,21 @@
     <w:charset w:val="00"/>
     <w:family w:val="swiss"/>
     <w:pitch w:val="variable"/>
-    <w:sig w:usb0="E0002AFF" w:usb1="4000ACFF" w:usb2="00000001" w:usb3="00000000" w:csb0="000001FF" w:csb1="00000000"/>
+    <w:sig w:usb0="E00002FF" w:usb1="4000ACFF" w:usb2="00000001" w:usb3="00000000" w:csb0="0000019F" w:csb1="00000000"/>
   </w:font>
   <w:font w:name="Times New Roman">
     <w:panose1 w:val="02020603050405020304"/>
     <w:charset w:val="00"/>
     <w:family w:val="roman"/>
     <w:pitch w:val="variable"/>
-    <w:sig w:usb0="E0002AFF" w:usb1="C0007841" w:usb2="00000009" w:usb3="00000000" w:csb0="000001FF" w:csb1="00000000"/>
+    <w:sig w:usb0="E0002AFF" w:usb1="C0007843" w:usb2="00000009" w:usb3="00000000" w:csb0="000001FF" w:csb1="00000000"/>
   </w:font>
   <w:font w:name="Calibri Light">
     <w:panose1 w:val="020F0302020204030204"/>
     <w:charset w:val="00"/>
     <w:family w:val="swiss"/>
     <w:pitch w:val="variable"/>
-    <w:sig w:usb0="A0002AEF" w:usb1="4000207B" w:usb2="00000000" w:usb3="00000000" w:csb0="000001FF" w:csb1="00000000"/>
+    <w:sig w:usb0="A00002EF" w:usb1="4000207B" w:usb2="00000000" w:usb3="00000000" w:csb0="0000009F" w:csb1="00000000"/>
   </w:font>
   <w:font w:name="Arial">
     <w:panose1 w:val="020B0604020202020204"/>
@@ -6473,6 +7815,8 @@
   <w:rsids>
     <w:rsidRoot w:val="00033BC2"/>
     <w:rsid w:val="00033BC2"/>
+    <w:rsid w:val="00BA1509"/>
+    <w:rsid w:val="00CC127A"/>
     <w:rsid w:val="00E22901"/>
   </w:rsids>
   <m:mathPr>

</xml_diff>

<commit_message>
Day 5 Exam finished
Finished 17 march 12:30
</commit_message>
<xml_diff>
--- a/Task 1/Task 1b/Task1_DesignDocs_VisualDesigns_LL-000020914_Naser_A.docx
+++ b/Task 1/Task 1b/Task1_DesignDocs_VisualDesigns_LL-000020914_Naser_A.docx
@@ -1,7 +1,19 @@
 
 <file path=word/document.xml><?xml version="1.0" encoding="utf-8"?>
-<w:document xmlns:wpc="http://schemas.microsoft.com/office/word/2010/wordprocessingCanvas" xmlns:cx="http://schemas.microsoft.com/office/drawing/2014/chartex" xmlns:cx1="http://schemas.microsoft.com/office/drawing/2015/9/8/chartex" xmlns:cx2="http://schemas.microsoft.com/office/drawing/2015/10/21/chartex" xmlns:cx3="http://schemas.microsoft.com/office/drawing/2016/5/9/chartex" xmlns:cx4="http://schemas.microsoft.com/office/drawing/2016/5/10/chartex" xmlns:cx5="http://schemas.microsoft.com/office/drawing/2016/5/11/chartex" xmlns:cx6="http://schemas.microsoft.com/office/drawing/2016/5/12/chartex" xmlns:cx7="http://schemas.microsoft.com/office/drawing/2016/5/13/chartex" xmlns:cx8="http://schemas.microsoft.com/office/drawing/2016/5/14/chartex" xmlns:mc="http://schemas.openxmlformats.org/markup-compatibility/2006" xmlns:aink="http://schemas.microsoft.com/office/drawing/2016/ink" xmlns:am3d="http://schemas.microsoft.com/office/drawing/2017/model3d" xmlns:o="urn:schemas-microsoft-com:office:office" xmlns:oel="http://schemas.microsoft.com/office/2019/extlst" xmlns:r="http://schemas.openxmlformats.org/officeDocument/2006/relationships" xmlns:m="http://schemas.openxmlformats.org/officeDocument/2006/math" xmlns:v="urn:schemas-microsoft-com:vml" xmlns:wp14="http://schemas.microsoft.com/office/word/2010/wordprocessingDrawing" xmlns:wp="http://schemas.openxmlformats.org/drawingml/2006/wordprocessingDrawing" xmlns:w10="urn:schemas-microsoft-com:office:word" xmlns:w="http://schemas.openxmlformats.org/wordprocessingml/2006/main" xmlns:w14="http://schemas.microsoft.com/office/word/2010/wordml" xmlns:w15="http://schemas.microsoft.com/office/word/2012/wordml" xmlns:w16cex="http://schemas.microsoft.com/office/word/2018/wordml/cex" xmlns:w16cid="http://schemas.microsoft.com/office/word/2016/wordml/cid" xmlns:w16="http://schemas.microsoft.com/office/word/2018/wordml" xmlns:w16du="http://schemas.microsoft.com/office/word/2023/wordml/word16du" xmlns:w16sdtdh="http://schemas.microsoft.com/office/word/2020/wordml/sdtdatahash" xmlns:w16sdtfl="http://schemas.microsoft.com/office/word/2024/wordml/sdtformatlock" xmlns:w16se="http://schemas.microsoft.com/office/word/2015/wordml/symex" xmlns:wpg="http://schemas.microsoft.com/office/word/2010/wordprocessingGroup" xmlns:wpi="http://schemas.microsoft.com/office/word/2010/wordprocessingInk" xmlns:wne="http://schemas.microsoft.com/office/word/2006/wordml" xmlns:wps="http://schemas.microsoft.com/office/word/2010/wordprocessingShape" mc:Ignorable="w14 w15 w16se w16cid w16 w16cex w16sdtdh w16sdtfl w16du wp14">
+<w:document xmlns:wpc="http://schemas.microsoft.com/office/word/2010/wordprocessingCanvas" xmlns:cx="http://schemas.microsoft.com/office/drawing/2014/chartex" xmlns:cx1="http://schemas.microsoft.com/office/drawing/2015/9/8/chartex" xmlns:cx2="http://schemas.microsoft.com/office/drawing/2015/10/21/chartex" xmlns:cx3="http://schemas.microsoft.com/office/drawing/2016/5/9/chartex" xmlns:cx4="http://schemas.microsoft.com/office/drawing/2016/5/10/chartex" xmlns:cx5="http://schemas.microsoft.com/office/drawing/2016/5/11/chartex" xmlns:cx6="http://schemas.microsoft.com/office/drawing/2016/5/12/chartex" xmlns:cx7="http://schemas.microsoft.com/office/drawing/2016/5/13/chartex" xmlns:cx8="http://schemas.microsoft.com/office/drawing/2016/5/14/chartex" xmlns:mc="http://schemas.openxmlformats.org/markup-compatibility/2006" xmlns:aink="http://schemas.microsoft.com/office/drawing/2016/ink" xmlns:am3d="http://schemas.microsoft.com/office/drawing/2017/model3d" xmlns:o="urn:schemas-microsoft-com:office:office" xmlns:r="http://schemas.openxmlformats.org/officeDocument/2006/relationships" xmlns:m="http://schemas.openxmlformats.org/officeDocument/2006/math" xmlns:v="urn:schemas-microsoft-com:vml" xmlns:wp14="http://schemas.microsoft.com/office/word/2010/wordprocessingDrawing" xmlns:wp="http://schemas.openxmlformats.org/drawingml/2006/wordprocessingDrawing" xmlns:w10="urn:schemas-microsoft-com:office:word" xmlns:w="http://schemas.openxmlformats.org/wordprocessingml/2006/main" xmlns:w14="http://schemas.microsoft.com/office/word/2010/wordml" xmlns:w15="http://schemas.microsoft.com/office/word/2012/wordml" xmlns:w16cex="http://schemas.microsoft.com/office/word/2018/wordml/cex" xmlns:w16cid="http://schemas.microsoft.com/office/word/2016/wordml/cid" xmlns:w16="http://schemas.microsoft.com/office/word/2018/wordml" xmlns:w16sdtdh="http://schemas.microsoft.com/office/word/2020/wordml/sdtdatahash" xmlns:w16se="http://schemas.microsoft.com/office/word/2015/wordml/symex" xmlns:wpg="http://schemas.microsoft.com/office/word/2010/wordprocessingGroup" xmlns:wpi="http://schemas.microsoft.com/office/word/2010/wordprocessingInk" xmlns:wne="http://schemas.microsoft.com/office/word/2006/wordml" xmlns:wps="http://schemas.microsoft.com/office/word/2010/wordprocessingShape" mc:Ignorable="w14 w15 w16se w16cid w16 w16cex w16sdtdh wp14">
   <w:body>
+    <w:p>
+      <w:pPr>
+        <w:pStyle w:val="NoSpacing"/>
+        <w:spacing w:before="1540" w:after="240"/>
+        <w:jc w:val="center"/>
+        <w:rPr>
+          <w:rFonts w:eastAsiaTheme="minorHAnsi"/>
+          <w:color w:val="4472C4" w:themeColor="accent1"/>
+          <w:lang w:eastAsia="en-US"/>
+        </w:rPr>
+      </w:pPr>
+    </w:p>
     <w:sdt>
       <w:sdtPr>
         <w:rPr>
@@ -160,6 +172,7 @@
             <w:dataBinding w:prefixMappings="xmlns:ns0='http://purl.org/dc/elements/1.1/' xmlns:ns1='http://schemas.openxmlformats.org/package/2006/metadata/core-properties' " w:xpath="/ns1:coreProperties[1]/ns0:subject[1]" w:storeItemID="{6C3C8BC8-F283-45AE-878A-BAB7291924A1}"/>
             <w:text/>
           </w:sdtPr>
+          <w:sdtEndPr/>
           <w:sdtContent>
             <w:p>
               <w:pPr>
@@ -1109,12 +1122,364 @@
     <w:p/>
     <w:p>
       <w:pPr>
+        <w:pStyle w:val="Heading2"/>
+      </w:pPr>
+      <w:r>
+        <w:t>Global Style Guide</w:t>
+      </w:r>
+    </w:p>
+    <w:p>
+      <w:pPr>
+        <w:spacing w:before="240" w:line="276" w:lineRule="auto"/>
+      </w:pPr>
+      <w:r>
+        <w:t xml:space="preserve">In this style guide I will go through the typical elements and key aspects of the wireframes such as the colour scheme, typography, layout and spacing, navigation bar and the footer. This style guide will </w:t>
+      </w:r>
+      <w:r>
+        <w:t>document</w:t>
+      </w:r>
+      <w:r>
+        <w:t xml:space="preserve"> all recurring elements of the wireframes, </w:t>
+      </w:r>
+      <w:r>
+        <w:t>removing the need to repeat this information in each page’s individual annotations.</w:t>
+      </w:r>
+    </w:p>
+    <w:p>
+      <w:pPr>
+        <w:spacing w:before="240"/>
+        <w:rPr>
+          <w:b/>
+          <w:bCs/>
+          <w:sz w:val="24"/>
+          <w:szCs w:val="24"/>
+        </w:rPr>
+      </w:pPr>
+      <w:r>
+        <w:rPr>
+          <w:b/>
+          <w:bCs/>
+          <w:sz w:val="24"/>
+          <w:szCs w:val="24"/>
+        </w:rPr>
+        <w:t>Typography</w:t>
+      </w:r>
+    </w:p>
+    <w:p>
+      <w:r>
+        <w:t xml:space="preserve">The fonts I have used across all the pages of the Greenfield Local Hubs wireframes are two, a sans-serif and a serif font. </w:t>
+      </w:r>
+      <w:r>
+        <w:t>The serif font I used was “Playfair Display” and it is mainly used for all headings, hero titles, section titles and product prices. The font represents elegance and gives the user a feeling of sincerity</w:t>
+      </w:r>
+      <w:r>
+        <w:t xml:space="preserve"> but also makes the website have a vintage business aesthetic.</w:t>
+      </w:r>
+      <w:r>
+        <w:t xml:space="preserve"> </w:t>
+      </w:r>
+      <w:r>
+        <w:t xml:space="preserve">Now for the sans-serif font I used for the wireframes is “DM sans”, it is used for all other body text, navigation, footer, buttons footer, </w:t>
+      </w:r>
+      <w:r>
+        <w:t>and form. It is a simple calm font that is easy to read and has a modern style to it.</w:t>
+      </w:r>
+      <w:r>
+        <w:t xml:space="preserve"> Both fonts are </w:t>
+      </w:r>
+      <w:r>
+        <w:t xml:space="preserve">freely available in Canva, and </w:t>
+      </w:r>
+      <w:r>
+        <w:t xml:space="preserve">sourced from </w:t>
+      </w:r>
+      <w:r>
+        <w:t xml:space="preserve">a trusted open-source which is </w:t>
+      </w:r>
+      <w:r>
+        <w:t>google fonts</w:t>
+      </w:r>
+      <w:r>
+        <w:t>. This is great since th</w:t>
+      </w:r>
+      <w:r>
+        <w:t>e source is dependable and could be confidently used when developing the solution.</w:t>
+      </w:r>
+    </w:p>
+    <w:p>
+      <w:r>
+        <w:t xml:space="preserve">The sizes I have used for the fonts are various, the </w:t>
+      </w:r>
+      <w:r>
+        <w:t xml:space="preserve">hero titles are 60px on </w:t>
+      </w:r>
+      <w:r>
+        <w:t>the wireframes</w:t>
+      </w:r>
+      <w:r>
+        <w:t xml:space="preserve">. Section titles are 16px, and for the other body texts the sizes vary. The font sizes </w:t>
+      </w:r>
+      <w:r>
+        <w:t>maintain</w:t>
+      </w:r>
+      <w:r>
+        <w:t xml:space="preserve"> </w:t>
+      </w:r>
+      <w:r>
+        <w:t xml:space="preserve">visual balance </w:t>
+      </w:r>
+      <w:r>
+        <w:t>creating a great user experience making it readable for the users.</w:t>
+      </w:r>
+    </w:p>
+    <w:p/>
+    <w:p>
+      <w:pPr>
+        <w:rPr>
+          <w:b/>
+          <w:bCs/>
+          <w:sz w:val="24"/>
+          <w:szCs w:val="24"/>
+        </w:rPr>
+      </w:pPr>
+      <w:r>
+        <w:rPr>
+          <w:b/>
+          <w:bCs/>
+          <w:sz w:val="24"/>
+          <w:szCs w:val="24"/>
+        </w:rPr>
+        <w:t>Colour Scheme</w:t>
+      </w:r>
+    </w:p>
+    <w:p>
+      <w:r>
+        <w:t xml:space="preserve">Main colours used in the </w:t>
+      </w:r>
+      <w:r>
+        <w:t xml:space="preserve">wireframes are dark green, a warm brown and white. The green and brown </w:t>
+      </w:r>
+      <w:r>
+        <w:t xml:space="preserve">was used because of the natural landscape that </w:t>
+      </w:r>
+      <w:r>
+        <w:t>represent the farmers and food producers</w:t>
+      </w:r>
+      <w:r>
+        <w:t xml:space="preserve">. </w:t>
+      </w:r>
+      <w:r>
+        <w:t>The</w:t>
+      </w:r>
+      <w:r>
+        <w:t xml:space="preserve"> dark green (#1B4D3F) was used consistently for primary buttons, the Greenfield Local Hub logo, and for key navigation elements </w:t>
+      </w:r>
+      <w:r>
+        <w:t>including the footer. The brown (#7C5C3E)</w:t>
+      </w:r>
+      <w:r>
+        <w:t xml:space="preserve"> representing the earth, was used on </w:t>
+      </w:r>
+      <w:r>
+        <w:t xml:space="preserve">badges, and few buttons which helps </w:t>
+      </w:r>
+      <w:r>
+        <w:t>d</w:t>
+      </w:r>
+      <w:r>
+        <w:t>r</w:t>
+      </w:r>
+      <w:r>
+        <w:t xml:space="preserve">aw the </w:t>
+      </w:r>
+      <w:r>
+        <w:t>viewer</w:t>
+      </w:r>
+      <w:r>
+        <w:t>s attention</w:t>
+      </w:r>
+      <w:r>
+        <w:t xml:space="preserve"> to read the element. The white used in the designs make sure of high contrast and readability, </w:t>
+      </w:r>
+      <w:r>
+        <w:t xml:space="preserve">and it makes the design look more appealing to the eyes giving a sense of breathing space when navigating through the solution. It is used in the background of the designs, the navbar, and in forms. These colours together support accessibility and usability while also strengthening the brands theme. </w:t>
+      </w:r>
+    </w:p>
+    <w:p/>
+    <w:p>
+      <w:pPr>
+        <w:rPr>
+          <w:b/>
+          <w:bCs/>
+          <w:sz w:val="24"/>
+          <w:szCs w:val="24"/>
+        </w:rPr>
+      </w:pPr>
+      <w:r>
+        <w:rPr>
+          <w:b/>
+          <w:bCs/>
+          <w:sz w:val="24"/>
+          <w:szCs w:val="24"/>
+        </w:rPr>
+        <w:t>Navigation &amp; Footer</w:t>
+      </w:r>
+    </w:p>
+    <w:p>
+      <w:r>
+        <w:t xml:space="preserve">The white navigation bar is positioned at the top of every page with a slight drop shadow. The navbar design and positioning will stay consistent across every page without any exceptions. </w:t>
+      </w:r>
+      <w:r>
+        <w:t xml:space="preserve">It consists of the business logo, the navigational links such as home, shop, producers, about us, and contact. It also has a shopping cart, account information, register and sign in. The elements inside are mostly grey and white, except for the register button and the logo being the dark green mentioned in the colour scheme. The navigation bar </w:t>
+      </w:r>
+      <w:r>
+        <w:t xml:space="preserve">follows a common convention structure, </w:t>
+      </w:r>
+      <w:r>
+        <w:t>having every necessary element that all professional digital solutions include</w:t>
+      </w:r>
+      <w:r>
+        <w:t xml:space="preserve">. </w:t>
+      </w:r>
+      <w:r>
+        <w:t xml:space="preserve"> </w:t>
+      </w:r>
+      <w:r>
+        <w:t xml:space="preserve">It is professional and slick and easy for the user to navigate with which is the main goal of a navigation bar. </w:t>
+      </w:r>
+      <w:r>
+        <w:t>Just above the navbar is a</w:t>
+      </w:r>
+      <w:r>
+        <w:t xml:space="preserve"> green </w:t>
+      </w:r>
+      <w:r>
+        <w:t xml:space="preserve">accessibility bar which will offer a </w:t>
+      </w:r>
+      <w:r>
+        <w:t>drop-down menu of accessibility features when hovering on the buttons. There will be high contrast mode, large text, small text, dark mode, screen reader, etc.</w:t>
+      </w:r>
+    </w:p>
+    <w:p>
+      <w:r>
+        <w:t xml:space="preserve">Similarly, the footer is consistent with its design and positioning across all the pages in my wireframes. With its </w:t>
+      </w:r>
+      <w:r>
+        <w:t>bottom of the page positioning which is</w:t>
+      </w:r>
+      <w:r>
+        <w:t xml:space="preserve"> industry standard</w:t>
+      </w:r>
+      <w:r>
+        <w:t>, it consists of quick links to various pages and a small business identity section. The footers colour is the same dark green mentioned previously, and the quick links are in a shade of grey, and the b</w:t>
+      </w:r>
+      <w:r>
+        <w:t xml:space="preserve">usiness name is written in white. The quick links will eventually send the user to different pages of the solution, some will even take the user to a filtered page such as “Fruit &amp; Veg”. If the user clicks this link they will be redirected to the shop, but it will filter the products to only show the fruits and vegetables sold. These </w:t>
+      </w:r>
+      <w:r>
+        <w:lastRenderedPageBreak/>
+        <w:t>quick links will be useful and convenient for the user, enhancing their user experience and engagement of the solution.</w:t>
+      </w:r>
+    </w:p>
+    <w:p/>
+    <w:p>
+      <w:pPr>
+        <w:rPr>
+          <w:b/>
+          <w:bCs/>
+          <w:sz w:val="24"/>
+          <w:szCs w:val="24"/>
+        </w:rPr>
+      </w:pPr>
+      <w:r>
+        <w:rPr>
+          <w:b/>
+          <w:bCs/>
+          <w:sz w:val="24"/>
+          <w:szCs w:val="24"/>
+        </w:rPr>
+        <w:t>Layout &amp; Spacing</w:t>
+      </w:r>
+    </w:p>
+    <w:p>
+      <w:r>
+        <w:t xml:space="preserve">Almost every page I designed begins with a page hero section just underneath the </w:t>
+      </w:r>
+      <w:r>
+        <w:t xml:space="preserve">navigation bar, and it includes descriptive text suitable for </w:t>
+      </w:r>
+      <w:r>
+        <w:t xml:space="preserve">the selected page. The pages are designed in sections, every section has a different colour from the section after, this creates visual separation </w:t>
+      </w:r>
+      <w:r>
+        <w:t>between the content.</w:t>
+      </w:r>
+    </w:p>
+    <w:p/>
+    <w:p>
+      <w:pPr>
+        <w:rPr>
+          <w:b/>
+          <w:bCs/>
+          <w:sz w:val="24"/>
+          <w:szCs w:val="24"/>
+        </w:rPr>
+      </w:pPr>
+      <w:r>
+        <w:rPr>
+          <w:b/>
+          <w:bCs/>
+          <w:sz w:val="24"/>
+          <w:szCs w:val="24"/>
+        </w:rPr>
+        <w:t>Images</w:t>
+      </w:r>
+    </w:p>
+    <w:p/>
+    <w:p/>
+    <w:p/>
+    <w:p/>
+    <w:p/>
+    <w:p/>
+    <w:p/>
+    <w:p/>
+    <w:p/>
+    <w:p/>
+    <w:p/>
+    <w:p/>
+    <w:p/>
+    <w:p/>
+    <w:p/>
+    <w:p/>
+    <w:p/>
+    <w:p/>
+    <w:p/>
+    <w:p/>
+    <w:p/>
+    <w:p/>
+    <w:p>
+      <w:pPr>
         <w:pStyle w:val="Subtitle"/>
+        <w:rPr>
+          <w:b/>
+          <w:bCs/>
+          <w:color w:val="auto"/>
+        </w:rPr>
       </w:pPr>
       <w:r>
+        <w:rPr>
+          <w:b/>
+          <w:bCs/>
+          <w:color w:val="auto"/>
+        </w:rPr>
         <w:t>Home Pag</w:t>
       </w:r>
       <w:r>
+        <w:rPr>
+          <w:b/>
+          <w:bCs/>
+          <w:color w:val="auto"/>
+        </w:rPr>
         <w:t>e</w:t>
       </w:r>
     </w:p>
@@ -1127,6 +1492,7 @@
         <w:rPr>
           <w:noProof/>
         </w:rPr>
+        <w:lastRenderedPageBreak/>
         <w:drawing>
           <wp:inline distT="0" distB="0" distL="0" distR="0" wp14:anchorId="3EE82C91" wp14:editId="0153E351">
             <wp:extent cx="4134678" cy="6897700"/>
@@ -1174,8 +1540,18 @@
     <w:p>
       <w:pPr>
         <w:pStyle w:val="Subtitle"/>
+        <w:rPr>
+          <w:b/>
+          <w:bCs/>
+          <w:color w:val="auto"/>
+        </w:rPr>
       </w:pPr>
       <w:r>
+        <w:rPr>
+          <w:b/>
+          <w:bCs/>
+          <w:color w:val="auto"/>
+        </w:rPr>
         <w:t>Shop Page</w:t>
       </w:r>
     </w:p>
@@ -1188,6 +1564,7 @@
         <w:rPr>
           <w:noProof/>
         </w:rPr>
+        <w:lastRenderedPageBreak/>
         <w:drawing>
           <wp:inline distT="0" distB="0" distL="0" distR="0" wp14:anchorId="554302C4" wp14:editId="6F9EC196">
             <wp:extent cx="4263242" cy="4982608"/>
@@ -1241,15 +1618,34 @@
     <w:p>
       <w:pPr>
         <w:pStyle w:val="Subtitle"/>
+        <w:rPr>
+          <w:b/>
+          <w:bCs/>
+          <w:color w:val="auto"/>
+        </w:rPr>
       </w:pPr>
       <w:r>
-        <w:lastRenderedPageBreak/>
+        <w:rPr>
+          <w:b/>
+          <w:bCs/>
+          <w:color w:val="auto"/>
+        </w:rPr>
         <w:t>Specific Product Page (</w:t>
       </w:r>
       <w:r>
+        <w:rPr>
+          <w:b/>
+          <w:bCs/>
+          <w:color w:val="auto"/>
+        </w:rPr>
         <w:t xml:space="preserve">Product: </w:t>
       </w:r>
       <w:r>
+        <w:rPr>
+          <w:b/>
+          <w:bCs/>
+          <w:color w:val="auto"/>
+        </w:rPr>
         <w:t>Heirloom Tomatoes)</w:t>
       </w:r>
     </w:p>
@@ -1262,6 +1658,7 @@
         <w:rPr>
           <w:noProof/>
         </w:rPr>
+        <w:lastRenderedPageBreak/>
         <w:drawing>
           <wp:inline distT="0" distB="0" distL="0" distR="0" wp14:anchorId="6A47DFF7" wp14:editId="5E4DEA5F">
             <wp:extent cx="5682343" cy="6238850"/>
@@ -1312,9 +1709,18 @@
     <w:p>
       <w:pPr>
         <w:pStyle w:val="Subtitle"/>
+        <w:rPr>
+          <w:b/>
+          <w:bCs/>
+          <w:color w:val="auto"/>
+        </w:rPr>
       </w:pPr>
       <w:r>
-        <w:lastRenderedPageBreak/>
+        <w:rPr>
+          <w:b/>
+          <w:bCs/>
+          <w:color w:val="auto"/>
+        </w:rPr>
         <w:t>Producers Page</w:t>
       </w:r>
     </w:p>
@@ -1327,6 +1733,7 @@
         <w:rPr>
           <w:noProof/>
         </w:rPr>
+        <w:lastRenderedPageBreak/>
         <w:drawing>
           <wp:inline distT="0" distB="0" distL="0" distR="0" wp14:anchorId="0D4B7E81" wp14:editId="3AC4A400">
             <wp:extent cx="5503793" cy="5569527"/>
@@ -1377,11 +1784,24 @@
     <w:p/>
     <w:p/>
     <w:p>
-      <w:r>
-        <w:lastRenderedPageBreak/>
+      <w:pPr>
+        <w:rPr>
+          <w:b/>
+          <w:bCs/>
+        </w:rPr>
+      </w:pPr>
+      <w:r>
+        <w:rPr>
+          <w:b/>
+          <w:bCs/>
+        </w:rPr>
         <w:t>Specific Producer</w:t>
       </w:r>
       <w:r>
+        <w:rPr>
+          <w:b/>
+          <w:bCs/>
+        </w:rPr>
         <w:t>s Page (Producer: Greenacre Farm)</w:t>
       </w:r>
     </w:p>
@@ -1394,6 +1814,7 @@
         <w:rPr>
           <w:noProof/>
         </w:rPr>
+        <w:lastRenderedPageBreak/>
         <w:drawing>
           <wp:inline distT="0" distB="0" distL="0" distR="0" wp14:anchorId="41543BA9" wp14:editId="39F2BC2B">
             <wp:extent cx="5220277" cy="6264233"/>
@@ -1444,9 +1865,18 @@
     <w:p>
       <w:pPr>
         <w:pStyle w:val="Subtitle"/>
+        <w:rPr>
+          <w:b/>
+          <w:bCs/>
+          <w:color w:val="auto"/>
+        </w:rPr>
       </w:pPr>
       <w:r>
-        <w:lastRenderedPageBreak/>
+        <w:rPr>
+          <w:b/>
+          <w:bCs/>
+          <w:color w:val="auto"/>
+        </w:rPr>
         <w:t>About Us Page</w:t>
       </w:r>
     </w:p>
@@ -1459,6 +1889,7 @@
         <w:rPr>
           <w:noProof/>
         </w:rPr>
+        <w:lastRenderedPageBreak/>
         <w:drawing>
           <wp:inline distT="0" distB="0" distL="0" distR="0" wp14:anchorId="189F7170" wp14:editId="730FDA43">
             <wp:extent cx="5392413" cy="6591869"/>
@@ -1508,9 +1939,18 @@
     <w:p>
       <w:pPr>
         <w:pStyle w:val="Subtitle"/>
+        <w:rPr>
+          <w:b/>
+          <w:bCs/>
+          <w:color w:val="auto"/>
+        </w:rPr>
       </w:pPr>
       <w:r>
-        <w:lastRenderedPageBreak/>
+        <w:rPr>
+          <w:b/>
+          <w:bCs/>
+          <w:color w:val="auto"/>
+        </w:rPr>
         <w:t>Contact Page</w:t>
       </w:r>
     </w:p>
@@ -1523,6 +1963,7 @@
         <w:rPr>
           <w:noProof/>
         </w:rPr>
+        <w:lastRenderedPageBreak/>
         <w:drawing>
           <wp:inline distT="0" distB="0" distL="0" distR="0" wp14:anchorId="6178B81B" wp14:editId="5C0108A7">
             <wp:extent cx="6645910" cy="4627880"/>
@@ -1579,9 +2020,18 @@
     <w:p>
       <w:pPr>
         <w:pStyle w:val="Subtitle"/>
+        <w:rPr>
+          <w:b/>
+          <w:bCs/>
+          <w:color w:val="auto"/>
+        </w:rPr>
       </w:pPr>
       <w:r>
-        <w:lastRenderedPageBreak/>
+        <w:rPr>
+          <w:b/>
+          <w:bCs/>
+          <w:color w:val="auto"/>
+        </w:rPr>
         <w:t>Shopping Cart Page</w:t>
       </w:r>
     </w:p>
@@ -1594,6 +2044,7 @@
         <w:rPr>
           <w:noProof/>
         </w:rPr>
+        <w:lastRenderedPageBreak/>
         <w:drawing>
           <wp:inline distT="0" distB="0" distL="0" distR="0" wp14:anchorId="76E49F0C" wp14:editId="070EC935">
             <wp:extent cx="6645910" cy="4565650"/>
@@ -1650,9 +2101,18 @@
     <w:p>
       <w:pPr>
         <w:pStyle w:val="Subtitle"/>
+        <w:rPr>
+          <w:b/>
+          <w:bCs/>
+          <w:color w:val="auto"/>
+        </w:rPr>
       </w:pPr>
       <w:r>
-        <w:lastRenderedPageBreak/>
+        <w:rPr>
+          <w:b/>
+          <w:bCs/>
+          <w:color w:val="auto"/>
+        </w:rPr>
         <w:t>Account Profile Page</w:t>
       </w:r>
     </w:p>
@@ -1665,6 +2125,7 @@
         <w:rPr>
           <w:noProof/>
         </w:rPr>
+        <w:lastRenderedPageBreak/>
         <w:drawing>
           <wp:inline distT="0" distB="0" distL="0" distR="0" wp14:anchorId="16E1FC5F" wp14:editId="14F11CDA">
             <wp:extent cx="6645910" cy="4686935"/>
@@ -1720,9 +2181,18 @@
     <w:p>
       <w:pPr>
         <w:pStyle w:val="Subtitle"/>
+        <w:rPr>
+          <w:b/>
+          <w:bCs/>
+          <w:color w:val="auto"/>
+        </w:rPr>
       </w:pPr>
       <w:r>
-        <w:lastRenderedPageBreak/>
+        <w:rPr>
+          <w:b/>
+          <w:bCs/>
+          <w:color w:val="auto"/>
+        </w:rPr>
         <w:t>My Orders Page</w:t>
       </w:r>
     </w:p>
@@ -1735,6 +2205,7 @@
         <w:rPr>
           <w:noProof/>
         </w:rPr>
+        <w:lastRenderedPageBreak/>
         <w:drawing>
           <wp:inline distT="0" distB="0" distL="0" distR="0" wp14:anchorId="1C2A00AD" wp14:editId="7FBB4570">
             <wp:extent cx="6645910" cy="3970020"/>
@@ -1793,9 +2264,18 @@
     <w:p>
       <w:pPr>
         <w:pStyle w:val="Subtitle"/>
+        <w:rPr>
+          <w:b/>
+          <w:bCs/>
+          <w:color w:val="auto"/>
+        </w:rPr>
       </w:pPr>
       <w:r>
-        <w:lastRenderedPageBreak/>
+        <w:rPr>
+          <w:b/>
+          <w:bCs/>
+          <w:color w:val="auto"/>
+        </w:rPr>
         <w:t>My Loyalty Page</w:t>
       </w:r>
     </w:p>
@@ -1808,6 +2288,7 @@
         <w:rPr>
           <w:noProof/>
         </w:rPr>
+        <w:lastRenderedPageBreak/>
         <w:drawing>
           <wp:inline distT="0" distB="0" distL="0" distR="0" wp14:anchorId="2F772961" wp14:editId="55F5066C">
             <wp:extent cx="6645910" cy="4472305"/>
@@ -1864,9 +2345,18 @@
     <w:p>
       <w:pPr>
         <w:pStyle w:val="Subtitle"/>
+        <w:rPr>
+          <w:b/>
+          <w:bCs/>
+          <w:color w:val="auto"/>
+        </w:rPr>
       </w:pPr>
       <w:r>
-        <w:lastRenderedPageBreak/>
+        <w:rPr>
+          <w:b/>
+          <w:bCs/>
+          <w:color w:val="auto"/>
+        </w:rPr>
         <w:t>Address Book Page</w:t>
       </w:r>
     </w:p>
@@ -1879,6 +2369,7 @@
         <w:rPr>
           <w:noProof/>
         </w:rPr>
+        <w:lastRenderedPageBreak/>
         <w:drawing>
           <wp:inline distT="0" distB="0" distL="0" distR="0" wp14:anchorId="221D205A" wp14:editId="0E84B984">
             <wp:extent cx="6645910" cy="3683000"/>
@@ -1938,9 +2429,18 @@
     <w:p>
       <w:pPr>
         <w:pStyle w:val="Subtitle"/>
+        <w:rPr>
+          <w:b/>
+          <w:bCs/>
+          <w:color w:val="auto"/>
+        </w:rPr>
       </w:pPr>
       <w:r>
-        <w:lastRenderedPageBreak/>
+        <w:rPr>
+          <w:b/>
+          <w:bCs/>
+          <w:color w:val="auto"/>
+        </w:rPr>
         <w:t>Producer Dashboard Page (Order Management Section)</w:t>
       </w:r>
     </w:p>
@@ -1953,6 +2453,7 @@
         <w:rPr>
           <w:noProof/>
         </w:rPr>
+        <w:lastRenderedPageBreak/>
         <w:drawing>
           <wp:inline distT="0" distB="0" distL="0" distR="0" wp14:anchorId="1A5512E7" wp14:editId="0DD78B5C">
             <wp:extent cx="6645910" cy="4700905"/>
@@ -2008,9 +2509,18 @@
     <w:p>
       <w:pPr>
         <w:pStyle w:val="Subtitle"/>
+        <w:rPr>
+          <w:b/>
+          <w:bCs/>
+          <w:color w:val="auto"/>
+        </w:rPr>
       </w:pPr>
       <w:r>
-        <w:lastRenderedPageBreak/>
+        <w:rPr>
+          <w:b/>
+          <w:bCs/>
+          <w:color w:val="auto"/>
+        </w:rPr>
         <w:t>Producer Dashboard Page (Product Management Section)</w:t>
       </w:r>
     </w:p>
@@ -2023,6 +2533,7 @@
         <w:rPr>
           <w:noProof/>
         </w:rPr>
+        <w:lastRenderedPageBreak/>
         <w:drawing>
           <wp:inline distT="0" distB="0" distL="0" distR="0" wp14:anchorId="30240187" wp14:editId="405F1394">
             <wp:extent cx="6645910" cy="4721225"/>
@@ -2078,9 +2589,18 @@
     <w:p>
       <w:pPr>
         <w:pStyle w:val="Subtitle"/>
+        <w:rPr>
+          <w:b/>
+          <w:bCs/>
+          <w:color w:val="auto"/>
+        </w:rPr>
       </w:pPr>
       <w:r>
-        <w:lastRenderedPageBreak/>
+        <w:rPr>
+          <w:b/>
+          <w:bCs/>
+          <w:color w:val="auto"/>
+        </w:rPr>
         <w:t>Producer Dashboard Page (Producer Details Section)</w:t>
       </w:r>
     </w:p>
@@ -2093,6 +2613,7 @@
         <w:rPr>
           <w:noProof/>
         </w:rPr>
+        <w:lastRenderedPageBreak/>
         <w:drawing>
           <wp:inline distT="0" distB="0" distL="0" distR="0" wp14:anchorId="5217678C" wp14:editId="1F540E1E">
             <wp:extent cx="6645910" cy="5136515"/>
@@ -2147,9 +2668,18 @@
     <w:p>
       <w:pPr>
         <w:pStyle w:val="Subtitle"/>
+        <w:rPr>
+          <w:b/>
+          <w:bCs/>
+          <w:color w:val="auto"/>
+        </w:rPr>
       </w:pPr>
       <w:r>
-        <w:lastRenderedPageBreak/>
+        <w:rPr>
+          <w:b/>
+          <w:bCs/>
+          <w:color w:val="auto"/>
+        </w:rPr>
         <w:t>Register Page</w:t>
       </w:r>
     </w:p>
@@ -2162,6 +2692,7 @@
         <w:rPr>
           <w:noProof/>
         </w:rPr>
+        <w:lastRenderedPageBreak/>
         <w:drawing>
           <wp:inline distT="0" distB="0" distL="0" distR="0" wp14:anchorId="796E06F0" wp14:editId="531FC43B">
             <wp:extent cx="6645910" cy="4770120"/>
@@ -2217,9 +2748,18 @@
     <w:p>
       <w:pPr>
         <w:pStyle w:val="Subtitle"/>
+        <w:rPr>
+          <w:b/>
+          <w:bCs/>
+          <w:color w:val="auto"/>
+        </w:rPr>
       </w:pPr>
       <w:r>
-        <w:lastRenderedPageBreak/>
+        <w:rPr>
+          <w:b/>
+          <w:bCs/>
+          <w:color w:val="auto"/>
+        </w:rPr>
         <w:t>Sign in Page</w:t>
       </w:r>
     </w:p>
@@ -2232,6 +2772,7 @@
         <w:rPr>
           <w:noProof/>
         </w:rPr>
+        <w:lastRenderedPageBreak/>
         <w:drawing>
           <wp:inline distT="0" distB="0" distL="0" distR="0" wp14:anchorId="363E8C3F" wp14:editId="0763FD09">
             <wp:extent cx="6645910" cy="4770120"/>
@@ -2339,9 +2880,18 @@
     <w:p>
       <w:pPr>
         <w:pStyle w:val="Subtitle"/>
+        <w:rPr>
+          <w:b/>
+          <w:bCs/>
+          <w:color w:val="auto"/>
+        </w:rPr>
       </w:pPr>
       <w:r>
-        <w:lastRenderedPageBreak/>
+        <w:rPr>
+          <w:b/>
+          <w:bCs/>
+          <w:color w:val="auto"/>
+        </w:rPr>
         <w:t>Forgot Password Page</w:t>
       </w:r>
     </w:p>
@@ -2354,6 +2904,7 @@
         <w:rPr>
           <w:noProof/>
         </w:rPr>
+        <w:lastRenderedPageBreak/>
         <w:drawing>
           <wp:inline distT="0" distB="0" distL="0" distR="0" wp14:anchorId="4CD470DB" wp14:editId="727E3F44">
             <wp:extent cx="6645910" cy="4770120"/>
@@ -2411,7 +2962,6 @@
       </w:pPr>
       <w:bookmarkStart w:id="2" w:name="_Toc224568267"/>
       <w:r>
-        <w:lastRenderedPageBreak/>
         <w:t>Algorithm Designs</w:t>
       </w:r>
       <w:r>
@@ -2510,6 +3060,7 @@
         <w:rPr>
           <w:noProof/>
         </w:rPr>
+        <w:lastRenderedPageBreak/>
         <w:drawing>
           <wp:inline distT="0" distB="0" distL="0" distR="0" wp14:anchorId="25D90BFE" wp14:editId="3DF1C237">
             <wp:extent cx="4892633" cy="7084174"/>
@@ -2565,7 +3116,6 @@
       </w:pPr>
       <w:bookmarkStart w:id="3" w:name="_Toc224568268"/>
       <w:r>
-        <w:lastRenderedPageBreak/>
         <w:t xml:space="preserve">Database </w:t>
       </w:r>
       <w:r>
@@ -4705,7 +5255,6 @@
           </w:tcPr>
           <w:p>
             <w:r>
-              <w:lastRenderedPageBreak/>
               <w:t>ClaimType</w:t>
             </w:r>
           </w:p>
@@ -4867,6 +5416,7 @@
                 <w:bCs/>
                 <w:color w:val="FFFFFF" w:themeColor="background1"/>
               </w:rPr>
+              <w:lastRenderedPageBreak/>
               <w:t>Property</w:t>
             </w:r>
           </w:p>
@@ -6396,7 +6946,6 @@
       </w:pPr>
       <w:bookmarkStart w:id="7" w:name="_Toc224568272"/>
       <w:r>
-        <w:lastRenderedPageBreak/>
         <w:t>Test Strategy</w:t>
       </w:r>
       <w:bookmarkEnd w:id="7"/>
@@ -6962,7 +7511,7 @@
 </file>
 
 <file path=word/endnotes.xml><?xml version="1.0" encoding="utf-8"?>
-<w:endnotes xmlns:wpc="http://schemas.microsoft.com/office/word/2010/wordprocessingCanvas" xmlns:cx="http://schemas.microsoft.com/office/drawing/2014/chartex" xmlns:cx1="http://schemas.microsoft.com/office/drawing/2015/9/8/chartex" xmlns:cx2="http://schemas.microsoft.com/office/drawing/2015/10/21/chartex" xmlns:cx3="http://schemas.microsoft.com/office/drawing/2016/5/9/chartex" xmlns:cx4="http://schemas.microsoft.com/office/drawing/2016/5/10/chartex" xmlns:cx5="http://schemas.microsoft.com/office/drawing/2016/5/11/chartex" xmlns:cx6="http://schemas.microsoft.com/office/drawing/2016/5/12/chartex" xmlns:cx7="http://schemas.microsoft.com/office/drawing/2016/5/13/chartex" xmlns:cx8="http://schemas.microsoft.com/office/drawing/2016/5/14/chartex" xmlns:mc="http://schemas.openxmlformats.org/markup-compatibility/2006" xmlns:aink="http://schemas.microsoft.com/office/drawing/2016/ink" xmlns:am3d="http://schemas.microsoft.com/office/drawing/2017/model3d" xmlns:o="urn:schemas-microsoft-com:office:office" xmlns:oel="http://schemas.microsoft.com/office/2019/extlst" xmlns:r="http://schemas.openxmlformats.org/officeDocument/2006/relationships" xmlns:m="http://schemas.openxmlformats.org/officeDocument/2006/math" xmlns:v="urn:schemas-microsoft-com:vml" xmlns:wp14="http://schemas.microsoft.com/office/word/2010/wordprocessingDrawing" xmlns:wp="http://schemas.openxmlformats.org/drawingml/2006/wordprocessingDrawing" xmlns:w10="urn:schemas-microsoft-com:office:word" xmlns:w="http://schemas.openxmlformats.org/wordprocessingml/2006/main" xmlns:w14="http://schemas.microsoft.com/office/word/2010/wordml" xmlns:w15="http://schemas.microsoft.com/office/word/2012/wordml" xmlns:w16cex="http://schemas.microsoft.com/office/word/2018/wordml/cex" xmlns:w16cid="http://schemas.microsoft.com/office/word/2016/wordml/cid" xmlns:w16="http://schemas.microsoft.com/office/word/2018/wordml" xmlns:w16du="http://schemas.microsoft.com/office/word/2023/wordml/word16du" xmlns:w16sdtdh="http://schemas.microsoft.com/office/word/2020/wordml/sdtdatahash" xmlns:w16sdtfl="http://schemas.microsoft.com/office/word/2024/wordml/sdtformatlock" xmlns:w16se="http://schemas.microsoft.com/office/word/2015/wordml/symex" xmlns:wpg="http://schemas.microsoft.com/office/word/2010/wordprocessingGroup" xmlns:wpi="http://schemas.microsoft.com/office/word/2010/wordprocessingInk" xmlns:wne="http://schemas.microsoft.com/office/word/2006/wordml" xmlns:wps="http://schemas.microsoft.com/office/word/2010/wordprocessingShape" mc:Ignorable="w14 w15 w16se w16cid w16 w16cex w16sdtdh w16sdtfl w16du wp14">
+<w:endnotes xmlns:wpc="http://schemas.microsoft.com/office/word/2010/wordprocessingCanvas" xmlns:cx="http://schemas.microsoft.com/office/drawing/2014/chartex" xmlns:cx1="http://schemas.microsoft.com/office/drawing/2015/9/8/chartex" xmlns:cx2="http://schemas.microsoft.com/office/drawing/2015/10/21/chartex" xmlns:cx3="http://schemas.microsoft.com/office/drawing/2016/5/9/chartex" xmlns:cx4="http://schemas.microsoft.com/office/drawing/2016/5/10/chartex" xmlns:cx5="http://schemas.microsoft.com/office/drawing/2016/5/11/chartex" xmlns:cx6="http://schemas.microsoft.com/office/drawing/2016/5/12/chartex" xmlns:cx7="http://schemas.microsoft.com/office/drawing/2016/5/13/chartex" xmlns:cx8="http://schemas.microsoft.com/office/drawing/2016/5/14/chartex" xmlns:mc="http://schemas.openxmlformats.org/markup-compatibility/2006" xmlns:aink="http://schemas.microsoft.com/office/drawing/2016/ink" xmlns:am3d="http://schemas.microsoft.com/office/drawing/2017/model3d" xmlns:o="urn:schemas-microsoft-com:office:office" xmlns:r="http://schemas.openxmlformats.org/officeDocument/2006/relationships" xmlns:m="http://schemas.openxmlformats.org/officeDocument/2006/math" xmlns:v="urn:schemas-microsoft-com:vml" xmlns:wp14="http://schemas.microsoft.com/office/word/2010/wordprocessingDrawing" xmlns:wp="http://schemas.openxmlformats.org/drawingml/2006/wordprocessingDrawing" xmlns:w10="urn:schemas-microsoft-com:office:word" xmlns:w="http://schemas.openxmlformats.org/wordprocessingml/2006/main" xmlns:w14="http://schemas.microsoft.com/office/word/2010/wordml" xmlns:w15="http://schemas.microsoft.com/office/word/2012/wordml" xmlns:w16cex="http://schemas.microsoft.com/office/word/2018/wordml/cex" xmlns:w16cid="http://schemas.microsoft.com/office/word/2016/wordml/cid" xmlns:w16="http://schemas.microsoft.com/office/word/2018/wordml" xmlns:w16sdtdh="http://schemas.microsoft.com/office/word/2020/wordml/sdtdatahash" xmlns:w16se="http://schemas.microsoft.com/office/word/2015/wordml/symex" xmlns:wpg="http://schemas.microsoft.com/office/word/2010/wordprocessingGroup" xmlns:wpi="http://schemas.microsoft.com/office/word/2010/wordprocessingInk" xmlns:wne="http://schemas.microsoft.com/office/word/2006/wordml" xmlns:wps="http://schemas.microsoft.com/office/word/2010/wordprocessingShape" mc:Ignorable="w14 w15 w16se w16cid w16 w16cex w16sdtdh wp14">
   <w:endnote w:type="separator" w:id="-1">
     <w:p>
       <w:pPr>
@@ -6987,7 +7536,7 @@
 </file>
 
 <file path=word/footnotes.xml><?xml version="1.0" encoding="utf-8"?>
-<w:footnotes xmlns:wpc="http://schemas.microsoft.com/office/word/2010/wordprocessingCanvas" xmlns:cx="http://schemas.microsoft.com/office/drawing/2014/chartex" xmlns:cx1="http://schemas.microsoft.com/office/drawing/2015/9/8/chartex" xmlns:cx2="http://schemas.microsoft.com/office/drawing/2015/10/21/chartex" xmlns:cx3="http://schemas.microsoft.com/office/drawing/2016/5/9/chartex" xmlns:cx4="http://schemas.microsoft.com/office/drawing/2016/5/10/chartex" xmlns:cx5="http://schemas.microsoft.com/office/drawing/2016/5/11/chartex" xmlns:cx6="http://schemas.microsoft.com/office/drawing/2016/5/12/chartex" xmlns:cx7="http://schemas.microsoft.com/office/drawing/2016/5/13/chartex" xmlns:cx8="http://schemas.microsoft.com/office/drawing/2016/5/14/chartex" xmlns:mc="http://schemas.openxmlformats.org/markup-compatibility/2006" xmlns:aink="http://schemas.microsoft.com/office/drawing/2016/ink" xmlns:am3d="http://schemas.microsoft.com/office/drawing/2017/model3d" xmlns:o="urn:schemas-microsoft-com:office:office" xmlns:oel="http://schemas.microsoft.com/office/2019/extlst" xmlns:r="http://schemas.openxmlformats.org/officeDocument/2006/relationships" xmlns:m="http://schemas.openxmlformats.org/officeDocument/2006/math" xmlns:v="urn:schemas-microsoft-com:vml" xmlns:wp14="http://schemas.microsoft.com/office/word/2010/wordprocessingDrawing" xmlns:wp="http://schemas.openxmlformats.org/drawingml/2006/wordprocessingDrawing" xmlns:w10="urn:schemas-microsoft-com:office:word" xmlns:w="http://schemas.openxmlformats.org/wordprocessingml/2006/main" xmlns:w14="http://schemas.microsoft.com/office/word/2010/wordml" xmlns:w15="http://schemas.microsoft.com/office/word/2012/wordml" xmlns:w16cex="http://schemas.microsoft.com/office/word/2018/wordml/cex" xmlns:w16cid="http://schemas.microsoft.com/office/word/2016/wordml/cid" xmlns:w16="http://schemas.microsoft.com/office/word/2018/wordml" xmlns:w16du="http://schemas.microsoft.com/office/word/2023/wordml/word16du" xmlns:w16sdtdh="http://schemas.microsoft.com/office/word/2020/wordml/sdtdatahash" xmlns:w16sdtfl="http://schemas.microsoft.com/office/word/2024/wordml/sdtformatlock" xmlns:w16se="http://schemas.microsoft.com/office/word/2015/wordml/symex" xmlns:wpg="http://schemas.microsoft.com/office/word/2010/wordprocessingGroup" xmlns:wpi="http://schemas.microsoft.com/office/word/2010/wordprocessingInk" xmlns:wne="http://schemas.microsoft.com/office/word/2006/wordml" xmlns:wps="http://schemas.microsoft.com/office/word/2010/wordprocessingShape" mc:Ignorable="w14 w15 w16se w16cid w16 w16cex w16sdtdh w16sdtfl w16du wp14">
+<w:footnotes xmlns:wpc="http://schemas.microsoft.com/office/word/2010/wordprocessingCanvas" xmlns:cx="http://schemas.microsoft.com/office/drawing/2014/chartex" xmlns:cx1="http://schemas.microsoft.com/office/drawing/2015/9/8/chartex" xmlns:cx2="http://schemas.microsoft.com/office/drawing/2015/10/21/chartex" xmlns:cx3="http://schemas.microsoft.com/office/drawing/2016/5/9/chartex" xmlns:cx4="http://schemas.microsoft.com/office/drawing/2016/5/10/chartex" xmlns:cx5="http://schemas.microsoft.com/office/drawing/2016/5/11/chartex" xmlns:cx6="http://schemas.microsoft.com/office/drawing/2016/5/12/chartex" xmlns:cx7="http://schemas.microsoft.com/office/drawing/2016/5/13/chartex" xmlns:cx8="http://schemas.microsoft.com/office/drawing/2016/5/14/chartex" xmlns:mc="http://schemas.openxmlformats.org/markup-compatibility/2006" xmlns:aink="http://schemas.microsoft.com/office/drawing/2016/ink" xmlns:am3d="http://schemas.microsoft.com/office/drawing/2017/model3d" xmlns:o="urn:schemas-microsoft-com:office:office" xmlns:r="http://schemas.openxmlformats.org/officeDocument/2006/relationships" xmlns:m="http://schemas.openxmlformats.org/officeDocument/2006/math" xmlns:v="urn:schemas-microsoft-com:vml" xmlns:wp14="http://schemas.microsoft.com/office/word/2010/wordprocessingDrawing" xmlns:wp="http://schemas.openxmlformats.org/drawingml/2006/wordprocessingDrawing" xmlns:w10="urn:schemas-microsoft-com:office:word" xmlns:w="http://schemas.openxmlformats.org/wordprocessingml/2006/main" xmlns:w14="http://schemas.microsoft.com/office/word/2010/wordml" xmlns:w15="http://schemas.microsoft.com/office/word/2012/wordml" xmlns:w16cex="http://schemas.microsoft.com/office/word/2018/wordml/cex" xmlns:w16cid="http://schemas.microsoft.com/office/word/2016/wordml/cid" xmlns:w16="http://schemas.microsoft.com/office/word/2018/wordml" xmlns:w16sdtdh="http://schemas.microsoft.com/office/word/2020/wordml/sdtdatahash" xmlns:w16se="http://schemas.microsoft.com/office/word/2015/wordml/symex" xmlns:wpg="http://schemas.microsoft.com/office/word/2010/wordprocessingGroup" xmlns:wpi="http://schemas.microsoft.com/office/word/2010/wordprocessingInk" xmlns:wne="http://schemas.microsoft.com/office/word/2006/wordml" xmlns:wps="http://schemas.microsoft.com/office/word/2010/wordprocessingShape" mc:Ignorable="w14 w15 w16se w16cid w16 w16cex w16sdtdh wp14">
   <w:footnote w:type="separator" w:id="-1">
     <w:p>
       <w:pPr>
@@ -7012,7 +7561,7 @@
 </file>
 
 <file path=word/styles.xml><?xml version="1.0" encoding="utf-8"?>
-<w:styles xmlns:mc="http://schemas.openxmlformats.org/markup-compatibility/2006" xmlns:r="http://schemas.openxmlformats.org/officeDocument/2006/relationships" xmlns:w="http://schemas.openxmlformats.org/wordprocessingml/2006/main" xmlns:w14="http://schemas.microsoft.com/office/word/2010/wordml" xmlns:w15="http://schemas.microsoft.com/office/word/2012/wordml" xmlns:w16cex="http://schemas.microsoft.com/office/word/2018/wordml/cex" xmlns:w16cid="http://schemas.microsoft.com/office/word/2016/wordml/cid" xmlns:w16="http://schemas.microsoft.com/office/word/2018/wordml" xmlns:w16du="http://schemas.microsoft.com/office/word/2023/wordml/word16du" xmlns:w16sdtdh="http://schemas.microsoft.com/office/word/2020/wordml/sdtdatahash" xmlns:w16sdtfl="http://schemas.microsoft.com/office/word/2024/wordml/sdtformatlock" xmlns:w16se="http://schemas.microsoft.com/office/word/2015/wordml/symex" mc:Ignorable="w14 w15 w16se w16cid w16 w16cex w16sdtdh w16sdtfl w16du">
+<w:styles xmlns:mc="http://schemas.openxmlformats.org/markup-compatibility/2006" xmlns:r="http://schemas.openxmlformats.org/officeDocument/2006/relationships" xmlns:w="http://schemas.openxmlformats.org/wordprocessingml/2006/main" xmlns:w14="http://schemas.microsoft.com/office/word/2010/wordml" xmlns:w15="http://schemas.microsoft.com/office/word/2012/wordml" xmlns:w16cex="http://schemas.microsoft.com/office/word/2018/wordml/cex" xmlns:w16cid="http://schemas.microsoft.com/office/word/2016/wordml/cid" xmlns:w16="http://schemas.microsoft.com/office/word/2018/wordml" xmlns:w16sdtdh="http://schemas.microsoft.com/office/word/2020/wordml/sdtdatahash" xmlns:w16se="http://schemas.microsoft.com/office/word/2015/wordml/symex" mc:Ignorable="w14 w15 w16se w16cid w16 w16cex w16sdtdh">
   <w:docDefaults>
     <w:rPrDefault>
       <w:rPr>
@@ -7731,7 +8280,7 @@
 </file>
 
 <file path=word/glossary/document.xml><?xml version="1.0" encoding="utf-8"?>
-<w:glossaryDocument xmlns:wpc="http://schemas.microsoft.com/office/word/2010/wordprocessingCanvas" xmlns:cx="http://schemas.microsoft.com/office/drawing/2014/chartex" xmlns:cx1="http://schemas.microsoft.com/office/drawing/2015/9/8/chartex" xmlns:cx2="http://schemas.microsoft.com/office/drawing/2015/10/21/chartex" xmlns:cx3="http://schemas.microsoft.com/office/drawing/2016/5/9/chartex" xmlns:cx4="http://schemas.microsoft.com/office/drawing/2016/5/10/chartex" xmlns:cx5="http://schemas.microsoft.com/office/drawing/2016/5/11/chartex" xmlns:cx6="http://schemas.microsoft.com/office/drawing/2016/5/12/chartex" xmlns:cx7="http://schemas.microsoft.com/office/drawing/2016/5/13/chartex" xmlns:cx8="http://schemas.microsoft.com/office/drawing/2016/5/14/chartex" xmlns:mc="http://schemas.openxmlformats.org/markup-compatibility/2006" xmlns:aink="http://schemas.microsoft.com/office/drawing/2016/ink" xmlns:am3d="http://schemas.microsoft.com/office/drawing/2017/model3d" xmlns:o="urn:schemas-microsoft-com:office:office" xmlns:oel="http://schemas.microsoft.com/office/2019/extlst" xmlns:r="http://schemas.openxmlformats.org/officeDocument/2006/relationships" xmlns:m="http://schemas.openxmlformats.org/officeDocument/2006/math" xmlns:v="urn:schemas-microsoft-com:vml" xmlns:wp14="http://schemas.microsoft.com/office/word/2010/wordprocessingDrawing" xmlns:wp="http://schemas.openxmlformats.org/drawingml/2006/wordprocessingDrawing" xmlns:w10="urn:schemas-microsoft-com:office:word" xmlns:w="http://schemas.openxmlformats.org/wordprocessingml/2006/main" xmlns:w14="http://schemas.microsoft.com/office/word/2010/wordml" xmlns:w15="http://schemas.microsoft.com/office/word/2012/wordml" xmlns:w16cex="http://schemas.microsoft.com/office/word/2018/wordml/cex" xmlns:w16cid="http://schemas.microsoft.com/office/word/2016/wordml/cid" xmlns:w16="http://schemas.microsoft.com/office/word/2018/wordml" xmlns:w16du="http://schemas.microsoft.com/office/word/2023/wordml/word16du" xmlns:w16sdtdh="http://schemas.microsoft.com/office/word/2020/wordml/sdtdatahash" xmlns:w16sdtfl="http://schemas.microsoft.com/office/word/2024/wordml/sdtformatlock" xmlns:w16se="http://schemas.microsoft.com/office/word/2015/wordml/symex" xmlns:wpg="http://schemas.microsoft.com/office/word/2010/wordprocessingGroup" xmlns:wpi="http://schemas.microsoft.com/office/word/2010/wordprocessingInk" xmlns:wne="http://schemas.microsoft.com/office/word/2006/wordml" xmlns:wps="http://schemas.microsoft.com/office/word/2010/wordprocessingShape" mc:Ignorable="w14 w15 w16se w16cid w16 w16cex w16sdtdh w16sdtfl w16du wp14">
+<w:glossaryDocument xmlns:wpc="http://schemas.microsoft.com/office/word/2010/wordprocessingCanvas" xmlns:cx="http://schemas.microsoft.com/office/drawing/2014/chartex" xmlns:cx1="http://schemas.microsoft.com/office/drawing/2015/9/8/chartex" xmlns:cx2="http://schemas.microsoft.com/office/drawing/2015/10/21/chartex" xmlns:cx3="http://schemas.microsoft.com/office/drawing/2016/5/9/chartex" xmlns:cx4="http://schemas.microsoft.com/office/drawing/2016/5/10/chartex" xmlns:cx5="http://schemas.microsoft.com/office/drawing/2016/5/11/chartex" xmlns:cx6="http://schemas.microsoft.com/office/drawing/2016/5/12/chartex" xmlns:cx7="http://schemas.microsoft.com/office/drawing/2016/5/13/chartex" xmlns:cx8="http://schemas.microsoft.com/office/drawing/2016/5/14/chartex" xmlns:mc="http://schemas.openxmlformats.org/markup-compatibility/2006" xmlns:aink="http://schemas.microsoft.com/office/drawing/2016/ink" xmlns:am3d="http://schemas.microsoft.com/office/drawing/2017/model3d" xmlns:o="urn:schemas-microsoft-com:office:office" xmlns:r="http://schemas.openxmlformats.org/officeDocument/2006/relationships" xmlns:m="http://schemas.openxmlformats.org/officeDocument/2006/math" xmlns:v="urn:schemas-microsoft-com:vml" xmlns:wp14="http://schemas.microsoft.com/office/word/2010/wordprocessingDrawing" xmlns:wp="http://schemas.openxmlformats.org/drawingml/2006/wordprocessingDrawing" xmlns:w10="urn:schemas-microsoft-com:office:word" xmlns:w="http://schemas.openxmlformats.org/wordprocessingml/2006/main" xmlns:w14="http://schemas.microsoft.com/office/word/2010/wordml" xmlns:w15="http://schemas.microsoft.com/office/word/2012/wordml" xmlns:w16cex="http://schemas.microsoft.com/office/word/2018/wordml/cex" xmlns:w16cid="http://schemas.microsoft.com/office/word/2016/wordml/cid" xmlns:w16="http://schemas.microsoft.com/office/word/2018/wordml" xmlns:w16sdtdh="http://schemas.microsoft.com/office/word/2020/wordml/sdtdatahash" xmlns:w16se="http://schemas.microsoft.com/office/word/2015/wordml/symex" xmlns:wpg="http://schemas.microsoft.com/office/word/2010/wordprocessingGroup" xmlns:wpi="http://schemas.microsoft.com/office/word/2010/wordprocessingInk" xmlns:wne="http://schemas.microsoft.com/office/word/2006/wordml" xmlns:wps="http://schemas.microsoft.com/office/word/2010/wordprocessingShape" mc:Ignorable="w14 w15 w16se w16cid w16 w16cex w16sdtdh wp14">
   <w:docParts>
     <w:docPart>
       <w:docPartPr>
@@ -7757,7 +8306,7 @@
             <w:rPr>
               <w:rFonts w:asciiTheme="majorHAnsi" w:eastAsiaTheme="majorEastAsia" w:hAnsiTheme="majorHAnsi" w:cstheme="majorBidi"/>
               <w:caps/>
-              <w:color w:val="156082" w:themeColor="accent1"/>
+              <w:color w:val="4472C4" w:themeColor="accent1"/>
               <w:sz w:val="80"/>
               <w:szCs w:val="80"/>
             </w:rPr>
@@ -7788,7 +8337,7 @@
           </w:pPr>
           <w:r>
             <w:rPr>
-              <w:color w:val="156082" w:themeColor="accent1"/>
+              <w:color w:val="4472C4" w:themeColor="accent1"/>
               <w:sz w:val="28"/>
               <w:szCs w:val="28"/>
             </w:rPr>
@@ -7802,13 +8351,13 @@
 </file>
 
 <file path=word/glossary/fontTable.xml><?xml version="1.0" encoding="utf-8"?>
-<w:fonts xmlns:mc="http://schemas.openxmlformats.org/markup-compatibility/2006" xmlns:r="http://schemas.openxmlformats.org/officeDocument/2006/relationships" xmlns:w="http://schemas.openxmlformats.org/wordprocessingml/2006/main" xmlns:w14="http://schemas.microsoft.com/office/word/2010/wordml" xmlns:w15="http://schemas.microsoft.com/office/word/2012/wordml" xmlns:w16cex="http://schemas.microsoft.com/office/word/2018/wordml/cex" xmlns:w16cid="http://schemas.microsoft.com/office/word/2016/wordml/cid" xmlns:w16="http://schemas.microsoft.com/office/word/2018/wordml" xmlns:w16du="http://schemas.microsoft.com/office/word/2023/wordml/word16du" xmlns:w16sdtdh="http://schemas.microsoft.com/office/word/2020/wordml/sdtdatahash" xmlns:w16sdtfl="http://schemas.microsoft.com/office/word/2024/wordml/sdtformatlock" xmlns:w16se="http://schemas.microsoft.com/office/word/2015/wordml/symex" mc:Ignorable="w14 w15 w16se w16cid w16 w16cex w16sdtdh w16sdtfl w16du">
+<w:fonts xmlns:mc="http://schemas.openxmlformats.org/markup-compatibility/2006" xmlns:r="http://schemas.openxmlformats.org/officeDocument/2006/relationships" xmlns:w="http://schemas.openxmlformats.org/wordprocessingml/2006/main" xmlns:w14="http://schemas.microsoft.com/office/word/2010/wordml" xmlns:w15="http://schemas.microsoft.com/office/word/2012/wordml" xmlns:w16cex="http://schemas.microsoft.com/office/word/2018/wordml/cex" xmlns:w16cid="http://schemas.microsoft.com/office/word/2016/wordml/cid" xmlns:w16="http://schemas.microsoft.com/office/word/2018/wordml" xmlns:w16sdtdh="http://schemas.microsoft.com/office/word/2020/wordml/sdtdatahash" xmlns:w16se="http://schemas.microsoft.com/office/word/2015/wordml/symex" mc:Ignorable="w14 w15 w16se w16cid w16 w16cex w16sdtdh">
   <w:font w:name="Calibri">
     <w:panose1 w:val="020F0502020204030204"/>
     <w:charset w:val="00"/>
     <w:family w:val="swiss"/>
     <w:pitch w:val="variable"/>
-    <w:sig w:usb0="E4002EFF" w:usb1="C200ACFF" w:usb2="00000009" w:usb3="00000000" w:csb0="000001FF" w:csb1="00000000"/>
+    <w:sig w:usb0="E4002EFF" w:usb1="C200247B" w:usb2="00000009" w:usb3="00000000" w:csb0="000001FF" w:csb1="00000000"/>
   </w:font>
   <w:font w:name="Arial">
     <w:panose1 w:val="020B0604020202020204"/>
@@ -7831,23 +8380,11 @@
     <w:pitch w:val="variable"/>
     <w:sig w:usb0="E0002EFF" w:usb1="C000785B" w:usb2="00000009" w:usb3="00000000" w:csb0="000001FF" w:csb1="00000000"/>
   </w:font>
-  <w:font w:name="Aptos">
-    <w:charset w:val="00"/>
-    <w:family w:val="swiss"/>
-    <w:pitch w:val="variable"/>
-    <w:sig w:usb0="20000287" w:usb1="00000003" w:usb2="00000000" w:usb3="00000000" w:csb0="0000019F" w:csb1="00000000"/>
-  </w:font>
-  <w:font w:name="Aptos Display">
-    <w:charset w:val="00"/>
-    <w:family w:val="swiss"/>
-    <w:pitch w:val="variable"/>
-    <w:sig w:usb0="20000287" w:usb1="00000003" w:usb2="00000000" w:usb3="00000000" w:csb0="0000019F" w:csb1="00000000"/>
-  </w:font>
 </w:fonts>
 </file>
 
 <file path=word/glossary/settings.xml><?xml version="1.0" encoding="utf-8"?>
-<w:settings xmlns:mc="http://schemas.openxmlformats.org/markup-compatibility/2006" xmlns:o="urn:schemas-microsoft-com:office:office" xmlns:r="http://schemas.openxmlformats.org/officeDocument/2006/relationships" xmlns:m="http://schemas.openxmlformats.org/officeDocument/2006/math" xmlns:v="urn:schemas-microsoft-com:vml" xmlns:w10="urn:schemas-microsoft-com:office:word" xmlns:w="http://schemas.openxmlformats.org/wordprocessingml/2006/main" xmlns:w14="http://schemas.microsoft.com/office/word/2010/wordml" xmlns:w15="http://schemas.microsoft.com/office/word/2012/wordml" xmlns:w16cex="http://schemas.microsoft.com/office/word/2018/wordml/cex" xmlns:w16cid="http://schemas.microsoft.com/office/word/2016/wordml/cid" xmlns:w16="http://schemas.microsoft.com/office/word/2018/wordml" xmlns:w16du="http://schemas.microsoft.com/office/word/2023/wordml/word16du" xmlns:w16sdtdh="http://schemas.microsoft.com/office/word/2020/wordml/sdtdatahash" xmlns:w16sdtfl="http://schemas.microsoft.com/office/word/2024/wordml/sdtformatlock" xmlns:w16se="http://schemas.microsoft.com/office/word/2015/wordml/symex" xmlns:sl="http://schemas.openxmlformats.org/schemaLibrary/2006/main" mc:Ignorable="w14 w15 w16se w16cid w16 w16cex w16sdtdh w16sdtfl w16du">
+<w:settings xmlns:mc="http://schemas.openxmlformats.org/markup-compatibility/2006" xmlns:o="urn:schemas-microsoft-com:office:office" xmlns:r="http://schemas.openxmlformats.org/officeDocument/2006/relationships" xmlns:m="http://schemas.openxmlformats.org/officeDocument/2006/math" xmlns:v="urn:schemas-microsoft-com:vml" xmlns:w10="urn:schemas-microsoft-com:office:word" xmlns:w="http://schemas.openxmlformats.org/wordprocessingml/2006/main" xmlns:w14="http://schemas.microsoft.com/office/word/2010/wordml" xmlns:w15="http://schemas.microsoft.com/office/word/2012/wordml" xmlns:w16cex="http://schemas.microsoft.com/office/word/2018/wordml/cex" xmlns:w16cid="http://schemas.microsoft.com/office/word/2016/wordml/cid" xmlns:w16="http://schemas.microsoft.com/office/word/2018/wordml" xmlns:w16sdtdh="http://schemas.microsoft.com/office/word/2020/wordml/sdtdatahash" xmlns:w16se="http://schemas.microsoft.com/office/word/2015/wordml/symex" xmlns:sl="http://schemas.openxmlformats.org/schemaLibrary/2006/main" mc:Ignorable="w14 w15 w16se w16cid w16 w16cex w16sdtdh">
   <w:view w:val="normal"/>
   <w:defaultTabStop w:val="720"/>
   <w:characterSpacingControl w:val="doNotCompress"/>
@@ -7864,6 +8401,8 @@
     <w:rsidRoot w:val="00033BC2"/>
     <w:rsid w:val="00033BC2"/>
     <w:rsid w:val="00436BE1"/>
+    <w:rsid w:val="00475F2D"/>
+    <w:rsid w:val="00516727"/>
     <w:rsid w:val="00BA1509"/>
     <w:rsid w:val="00CC127A"/>
     <w:rsid w:val="00E22901"/>
@@ -7891,7 +8430,7 @@
 </file>
 
 <file path=word/glossary/styles.xml><?xml version="1.0" encoding="utf-8"?>
-<w:styles xmlns:mc="http://schemas.openxmlformats.org/markup-compatibility/2006" xmlns:r="http://schemas.openxmlformats.org/officeDocument/2006/relationships" xmlns:w="http://schemas.openxmlformats.org/wordprocessingml/2006/main" xmlns:w14="http://schemas.microsoft.com/office/word/2010/wordml" xmlns:w15="http://schemas.microsoft.com/office/word/2012/wordml" xmlns:w16cex="http://schemas.microsoft.com/office/word/2018/wordml/cex" xmlns:w16cid="http://schemas.microsoft.com/office/word/2016/wordml/cid" xmlns:w16="http://schemas.microsoft.com/office/word/2018/wordml" xmlns:w16du="http://schemas.microsoft.com/office/word/2023/wordml/word16du" xmlns:w16sdtdh="http://schemas.microsoft.com/office/word/2020/wordml/sdtdatahash" xmlns:w16sdtfl="http://schemas.microsoft.com/office/word/2024/wordml/sdtformatlock" xmlns:w16se="http://schemas.microsoft.com/office/word/2015/wordml/symex" mc:Ignorable="w14 w15 w16se w16cid w16 w16cex w16sdtdh w16sdtfl w16du">
+<w:styles xmlns:mc="http://schemas.openxmlformats.org/markup-compatibility/2006" xmlns:r="http://schemas.openxmlformats.org/officeDocument/2006/relationships" xmlns:w="http://schemas.openxmlformats.org/wordprocessingml/2006/main" xmlns:w14="http://schemas.microsoft.com/office/word/2010/wordml" xmlns:w15="http://schemas.microsoft.com/office/word/2012/wordml" xmlns:w16cex="http://schemas.microsoft.com/office/word/2018/wordml/cex" xmlns:w16cid="http://schemas.microsoft.com/office/word/2016/wordml/cid" xmlns:w16="http://schemas.microsoft.com/office/word/2018/wordml" xmlns:w16sdtdh="http://schemas.microsoft.com/office/word/2020/wordml/sdtdatahash" xmlns:w16se="http://schemas.microsoft.com/office/word/2015/wordml/symex" mc:Ignorable="w14 w15 w16se w16cid w16 w16cex w16sdtdh">
   <w:docDefaults>
     <w:rPrDefault>
       <w:rPr>
@@ -8328,7 +8867,7 @@
 </file>
 
 <file path=word/glossary/webSettings.xml><?xml version="1.0" encoding="utf-8"?>
-<w:webSettings xmlns:mc="http://schemas.openxmlformats.org/markup-compatibility/2006" xmlns:r="http://schemas.openxmlformats.org/officeDocument/2006/relationships" xmlns:w="http://schemas.openxmlformats.org/wordprocessingml/2006/main" xmlns:w14="http://schemas.microsoft.com/office/word/2010/wordml" xmlns:w15="http://schemas.microsoft.com/office/word/2012/wordml" xmlns:w16cex="http://schemas.microsoft.com/office/word/2018/wordml/cex" xmlns:w16cid="http://schemas.microsoft.com/office/word/2016/wordml/cid" xmlns:w16="http://schemas.microsoft.com/office/word/2018/wordml" xmlns:w16du="http://schemas.microsoft.com/office/word/2023/wordml/word16du" xmlns:w16sdtdh="http://schemas.microsoft.com/office/word/2020/wordml/sdtdatahash" xmlns:w16sdtfl="http://schemas.microsoft.com/office/word/2024/wordml/sdtformatlock" xmlns:w16se="http://schemas.microsoft.com/office/word/2015/wordml/symex" mc:Ignorable="w14 w15 w16se w16cid w16 w16cex w16sdtdh w16sdtfl w16du">
+<w:webSettings xmlns:mc="http://schemas.openxmlformats.org/markup-compatibility/2006" xmlns:r="http://schemas.openxmlformats.org/officeDocument/2006/relationships" xmlns:w="http://schemas.openxmlformats.org/wordprocessingml/2006/main" xmlns:w14="http://schemas.microsoft.com/office/word/2010/wordml" xmlns:w15="http://schemas.microsoft.com/office/word/2012/wordml" xmlns:w16cex="http://schemas.microsoft.com/office/word/2018/wordml/cex" xmlns:w16cid="http://schemas.microsoft.com/office/word/2016/wordml/cid" xmlns:w16="http://schemas.microsoft.com/office/word/2018/wordml" xmlns:w16sdtdh="http://schemas.microsoft.com/office/word/2020/wordml/sdtdatahash" xmlns:w16se="http://schemas.microsoft.com/office/word/2015/wordml/symex" mc:Ignorable="w14 w15 w16se w16cid w16 w16cex w16sdtdh">
   <w:optimizeForBrowser/>
   <w:allowPNG/>
 </w:webSettings>

</xml_diff>

<commit_message>
Tuesday Night Home Day 5
</commit_message>
<xml_diff>
--- a/Task 1/Task 1b/Task1_DesignDocs_VisualDesigns_LL-000020914_Naser_A.docx
+++ b/Task 1/Task 1b/Task1_DesignDocs_VisualDesigns_LL-000020914_Naser_A.docx
@@ -1,6 +1,6 @@
 
 <file path=word/document.xml><?xml version="1.0" encoding="utf-8"?>
-<w:document xmlns:wpc="http://schemas.microsoft.com/office/word/2010/wordprocessingCanvas" xmlns:cx="http://schemas.microsoft.com/office/drawing/2014/chartex" xmlns:cx1="http://schemas.microsoft.com/office/drawing/2015/9/8/chartex" xmlns:cx2="http://schemas.microsoft.com/office/drawing/2015/10/21/chartex" xmlns:cx3="http://schemas.microsoft.com/office/drawing/2016/5/9/chartex" xmlns:cx4="http://schemas.microsoft.com/office/drawing/2016/5/10/chartex" xmlns:cx5="http://schemas.microsoft.com/office/drawing/2016/5/11/chartex" xmlns:cx6="http://schemas.microsoft.com/office/drawing/2016/5/12/chartex" xmlns:cx7="http://schemas.microsoft.com/office/drawing/2016/5/13/chartex" xmlns:cx8="http://schemas.microsoft.com/office/drawing/2016/5/14/chartex" xmlns:mc="http://schemas.openxmlformats.org/markup-compatibility/2006" xmlns:aink="http://schemas.microsoft.com/office/drawing/2016/ink" xmlns:am3d="http://schemas.microsoft.com/office/drawing/2017/model3d" xmlns:o="urn:schemas-microsoft-com:office:office" xmlns:r="http://schemas.openxmlformats.org/officeDocument/2006/relationships" xmlns:m="http://schemas.openxmlformats.org/officeDocument/2006/math" xmlns:v="urn:schemas-microsoft-com:vml" xmlns:wp14="http://schemas.microsoft.com/office/word/2010/wordprocessingDrawing" xmlns:wp="http://schemas.openxmlformats.org/drawingml/2006/wordprocessingDrawing" xmlns:w10="urn:schemas-microsoft-com:office:word" xmlns:w="http://schemas.openxmlformats.org/wordprocessingml/2006/main" xmlns:w14="http://schemas.microsoft.com/office/word/2010/wordml" xmlns:w15="http://schemas.microsoft.com/office/word/2012/wordml" xmlns:w16cex="http://schemas.microsoft.com/office/word/2018/wordml/cex" xmlns:w16cid="http://schemas.microsoft.com/office/word/2016/wordml/cid" xmlns:w16="http://schemas.microsoft.com/office/word/2018/wordml" xmlns:w16sdtdh="http://schemas.microsoft.com/office/word/2020/wordml/sdtdatahash" xmlns:w16se="http://schemas.microsoft.com/office/word/2015/wordml/symex" xmlns:wpg="http://schemas.microsoft.com/office/word/2010/wordprocessingGroup" xmlns:wpi="http://schemas.microsoft.com/office/word/2010/wordprocessingInk" xmlns:wne="http://schemas.microsoft.com/office/word/2006/wordml" xmlns:wps="http://schemas.microsoft.com/office/word/2010/wordprocessingShape" mc:Ignorable="w14 w15 w16se w16cid w16 w16cex w16sdtdh wp14">
+<w:document xmlns:wpc="http://schemas.microsoft.com/office/word/2010/wordprocessingCanvas" xmlns:cx="http://schemas.microsoft.com/office/drawing/2014/chartex" xmlns:cx1="http://schemas.microsoft.com/office/drawing/2015/9/8/chartex" xmlns:cx2="http://schemas.microsoft.com/office/drawing/2015/10/21/chartex" xmlns:cx3="http://schemas.microsoft.com/office/drawing/2016/5/9/chartex" xmlns:cx4="http://schemas.microsoft.com/office/drawing/2016/5/10/chartex" xmlns:cx5="http://schemas.microsoft.com/office/drawing/2016/5/11/chartex" xmlns:cx6="http://schemas.microsoft.com/office/drawing/2016/5/12/chartex" xmlns:cx7="http://schemas.microsoft.com/office/drawing/2016/5/13/chartex" xmlns:cx8="http://schemas.microsoft.com/office/drawing/2016/5/14/chartex" xmlns:mc="http://schemas.openxmlformats.org/markup-compatibility/2006" xmlns:aink="http://schemas.microsoft.com/office/drawing/2016/ink" xmlns:am3d="http://schemas.microsoft.com/office/drawing/2017/model3d" xmlns:o="urn:schemas-microsoft-com:office:office" xmlns:oel="http://schemas.microsoft.com/office/2019/extlst" xmlns:r="http://schemas.openxmlformats.org/officeDocument/2006/relationships" xmlns:m="http://schemas.openxmlformats.org/officeDocument/2006/math" xmlns:v="urn:schemas-microsoft-com:vml" xmlns:wp14="http://schemas.microsoft.com/office/word/2010/wordprocessingDrawing" xmlns:wp="http://schemas.openxmlformats.org/drawingml/2006/wordprocessingDrawing" xmlns:w10="urn:schemas-microsoft-com:office:word" xmlns:w="http://schemas.openxmlformats.org/wordprocessingml/2006/main" xmlns:w14="http://schemas.microsoft.com/office/word/2010/wordml" xmlns:w15="http://schemas.microsoft.com/office/word/2012/wordml" xmlns:w16cex="http://schemas.microsoft.com/office/word/2018/wordml/cex" xmlns:w16cid="http://schemas.microsoft.com/office/word/2016/wordml/cid" xmlns:w16="http://schemas.microsoft.com/office/word/2018/wordml" xmlns:w16du="http://schemas.microsoft.com/office/word/2023/wordml/word16du" xmlns:w16sdtdh="http://schemas.microsoft.com/office/word/2020/wordml/sdtdatahash" xmlns:w16sdtfl="http://schemas.microsoft.com/office/word/2024/wordml/sdtformatlock" xmlns:w16se="http://schemas.microsoft.com/office/word/2015/wordml/symex" xmlns:wpg="http://schemas.microsoft.com/office/word/2010/wordprocessingGroup" xmlns:wpi="http://schemas.microsoft.com/office/word/2010/wordprocessingInk" xmlns:wne="http://schemas.microsoft.com/office/word/2006/wordml" xmlns:wps="http://schemas.microsoft.com/office/word/2010/wordprocessingShape" mc:Ignorable="w14 w15 w16se w16cid w16 w16cex w16sdtdh w16sdtfl w16du wp14">
   <w:body>
     <w:p>
       <w:pPr>
@@ -172,7 +172,6 @@
             <w:dataBinding w:prefixMappings="xmlns:ns0='http://purl.org/dc/elements/1.1/' xmlns:ns1='http://schemas.openxmlformats.org/package/2006/metadata/core-properties' " w:xpath="/ns1:coreProperties[1]/ns0:subject[1]" w:storeItemID="{6C3C8BC8-F283-45AE-878A-BAB7291924A1}"/>
             <w:text/>
           </w:sdtPr>
-          <w:sdtEndPr/>
           <w:sdtContent>
             <w:p>
               <w:pPr>
@@ -424,7 +423,11 @@
             <w:rPr>
               <w:rFonts w:eastAsiaTheme="minorEastAsia"/>
               <w:noProof/>
+              <w:kern w:val="2"/>
+              <w:sz w:val="24"/>
+              <w:szCs w:val="24"/>
               <w:lang w:eastAsia="en-GB"/>
+              <w14:ligatures w14:val="standardContextual"/>
             </w:rPr>
           </w:pPr>
           <w:r>
@@ -436,7 +439,7 @@
           <w:r>
             <w:fldChar w:fldCharType="separate"/>
           </w:r>
-          <w:hyperlink w:anchor="_Toc224568265" w:history="1">
+          <w:hyperlink w:anchor="_Toc224651718" w:history="1">
             <w:r>
               <w:rPr>
                 <w:rStyle w:val="Hyperlink"/>
@@ -463,7 +466,7 @@
                 <w:noProof/>
                 <w:webHidden/>
               </w:rPr>
-              <w:instrText xml:space="preserve"> PAGEREF _Toc224568265 \h </w:instrText>
+              <w:instrText xml:space="preserve"> PAGEREF _Toc224651718 \h </w:instrText>
             </w:r>
             <w:r>
               <w:rPr>
@@ -503,10 +506,14 @@
             <w:rPr>
               <w:rFonts w:eastAsiaTheme="minorEastAsia"/>
               <w:noProof/>
+              <w:kern w:val="2"/>
+              <w:sz w:val="24"/>
+              <w:szCs w:val="24"/>
               <w:lang w:eastAsia="en-GB"/>
+              <w14:ligatures w14:val="standardContextual"/>
             </w:rPr>
           </w:pPr>
-          <w:hyperlink w:anchor="_Toc224568266" w:history="1">
+          <w:hyperlink w:anchor="_Toc224651719" w:history="1">
             <w:r>
               <w:rPr>
                 <w:rStyle w:val="Hyperlink"/>
@@ -533,7 +540,81 @@
                 <w:noProof/>
                 <w:webHidden/>
               </w:rPr>
-              <w:instrText xml:space="preserve"> PAGEREF _Toc224568266 \h </w:instrText>
+              <w:instrText xml:space="preserve"> PAGEREF _Toc224651719 \h </w:instrText>
+            </w:r>
+            <w:r>
+              <w:rPr>
+                <w:noProof/>
+                <w:webHidden/>
+              </w:rPr>
+            </w:r>
+            <w:r>
+              <w:rPr>
+                <w:noProof/>
+                <w:webHidden/>
+              </w:rPr>
+              <w:fldChar w:fldCharType="separate"/>
+            </w:r>
+            <w:r>
+              <w:rPr>
+                <w:noProof/>
+                <w:webHidden/>
+              </w:rPr>
+              <w:t>3</w:t>
+            </w:r>
+            <w:r>
+              <w:rPr>
+                <w:noProof/>
+                <w:webHidden/>
+              </w:rPr>
+              <w:fldChar w:fldCharType="end"/>
+            </w:r>
+          </w:hyperlink>
+        </w:p>
+        <w:p>
+          <w:pPr>
+            <w:pStyle w:val="TOC2"/>
+            <w:tabs>
+              <w:tab w:val="right" w:leader="dot" w:pos="10456"/>
+            </w:tabs>
+            <w:rPr>
+              <w:rFonts w:eastAsiaTheme="minorEastAsia"/>
+              <w:noProof/>
+              <w:kern w:val="2"/>
+              <w:sz w:val="24"/>
+              <w:szCs w:val="24"/>
+              <w:lang w:eastAsia="en-GB"/>
+              <w14:ligatures w14:val="standardContextual"/>
+            </w:rPr>
+          </w:pPr>
+          <w:hyperlink w:anchor="_Toc224651720" w:history="1">
+            <w:r>
+              <w:rPr>
+                <w:rStyle w:val="Hyperlink"/>
+                <w:noProof/>
+              </w:rPr>
+              <w:t>Global Style Guide</w:t>
+            </w:r>
+            <w:r>
+              <w:rPr>
+                <w:noProof/>
+                <w:webHidden/>
+              </w:rPr>
+              <w:tab/>
+            </w:r>
+            <w:r>
+              <w:rPr>
+                <w:noProof/>
+                <w:webHidden/>
+              </w:rPr>
+              <w:fldChar w:fldCharType="begin"/>
+            </w:r>
+            <w:r>
+              <w:rPr>
+                <w:noProof/>
+                <w:webHidden/>
+              </w:rPr>
+              <w:instrText xml:space="preserve"> PAGEREF _Toc224651720 \h </w:instrText>
             </w:r>
             <w:r>
               <w:rPr>
@@ -573,10 +654,14 @@
             <w:rPr>
               <w:rFonts w:eastAsiaTheme="minorEastAsia"/>
               <w:noProof/>
+              <w:kern w:val="2"/>
+              <w:sz w:val="24"/>
+              <w:szCs w:val="24"/>
               <w:lang w:eastAsia="en-GB"/>
+              <w14:ligatures w14:val="standardContextual"/>
             </w:rPr>
           </w:pPr>
-          <w:hyperlink w:anchor="_Toc224568267" w:history="1">
+          <w:hyperlink w:anchor="_Toc224651721" w:history="1">
             <w:r>
               <w:rPr>
                 <w:rStyle w:val="Hyperlink"/>
@@ -603,7 +688,7 @@
                 <w:noProof/>
                 <w:webHidden/>
               </w:rPr>
-              <w:instrText xml:space="preserve"> PAGEREF _Toc224568267 \h </w:instrText>
+              <w:instrText xml:space="preserve"> PAGEREF _Toc224651721 \h </w:instrText>
             </w:r>
             <w:r>
               <w:rPr>
@@ -623,7 +708,7 @@
                 <w:noProof/>
                 <w:webHidden/>
               </w:rPr>
-              <w:t>21</w:t>
+              <w:t>22</w:t>
             </w:r>
             <w:r>
               <w:rPr>
@@ -643,10 +728,14 @@
             <w:rPr>
               <w:rFonts w:eastAsiaTheme="minorEastAsia"/>
               <w:noProof/>
+              <w:kern w:val="2"/>
+              <w:sz w:val="24"/>
+              <w:szCs w:val="24"/>
               <w:lang w:eastAsia="en-GB"/>
+              <w14:ligatures w14:val="standardContextual"/>
             </w:rPr>
           </w:pPr>
-          <w:hyperlink w:anchor="_Toc224568268" w:history="1">
+          <w:hyperlink w:anchor="_Toc224651722" w:history="1">
             <w:r>
               <w:rPr>
                 <w:rStyle w:val="Hyperlink"/>
@@ -673,7 +762,7 @@
                 <w:noProof/>
                 <w:webHidden/>
               </w:rPr>
-              <w:instrText xml:space="preserve"> PAGEREF _Toc224568268 \h </w:instrText>
+              <w:instrText xml:space="preserve"> PAGEREF _Toc224651722 \h </w:instrText>
             </w:r>
             <w:r>
               <w:rPr>
@@ -693,7 +782,7 @@
                 <w:noProof/>
                 <w:webHidden/>
               </w:rPr>
-              <w:t>23</w:t>
+              <w:t>24</w:t>
             </w:r>
             <w:r>
               <w:rPr>
@@ -713,10 +802,14 @@
             <w:rPr>
               <w:rFonts w:eastAsiaTheme="minorEastAsia"/>
               <w:noProof/>
+              <w:kern w:val="2"/>
+              <w:sz w:val="24"/>
+              <w:szCs w:val="24"/>
               <w:lang w:eastAsia="en-GB"/>
+              <w14:ligatures w14:val="standardContextual"/>
             </w:rPr>
           </w:pPr>
-          <w:hyperlink w:anchor="_Toc224568269" w:history="1">
+          <w:hyperlink w:anchor="_Toc224651723" w:history="1">
             <w:r>
               <w:rPr>
                 <w:rStyle w:val="Hyperlink"/>
@@ -743,7 +836,7 @@
                 <w:noProof/>
                 <w:webHidden/>
               </w:rPr>
-              <w:instrText xml:space="preserve"> PAGEREF _Toc224568269 \h </w:instrText>
+              <w:instrText xml:space="preserve"> PAGEREF _Toc224651723 \h </w:instrText>
             </w:r>
             <w:r>
               <w:rPr>
@@ -763,7 +856,7 @@
                 <w:noProof/>
                 <w:webHidden/>
               </w:rPr>
-              <w:t>23</w:t>
+              <w:t>25</w:t>
             </w:r>
             <w:r>
               <w:rPr>
@@ -783,10 +876,14 @@
             <w:rPr>
               <w:rFonts w:eastAsiaTheme="minorEastAsia"/>
               <w:noProof/>
+              <w:kern w:val="2"/>
+              <w:sz w:val="24"/>
+              <w:szCs w:val="24"/>
               <w:lang w:eastAsia="en-GB"/>
+              <w14:ligatures w14:val="standardContextual"/>
             </w:rPr>
           </w:pPr>
-          <w:hyperlink w:anchor="_Toc224568270" w:history="1">
+          <w:hyperlink w:anchor="_Toc224651724" w:history="1">
             <w:r>
               <w:rPr>
                 <w:rStyle w:val="Hyperlink"/>
@@ -813,7 +910,7 @@
                 <w:noProof/>
                 <w:webHidden/>
               </w:rPr>
-              <w:instrText xml:space="preserve"> PAGEREF _Toc224568270 \h </w:instrText>
+              <w:instrText xml:space="preserve"> PAGEREF _Toc224651724 \h </w:instrText>
             </w:r>
             <w:r>
               <w:rPr>
@@ -833,7 +930,7 @@
                 <w:noProof/>
                 <w:webHidden/>
               </w:rPr>
-              <w:t>23</w:t>
+              <w:t>25</w:t>
             </w:r>
             <w:r>
               <w:rPr>
@@ -853,10 +950,14 @@
             <w:rPr>
               <w:rFonts w:eastAsiaTheme="minorEastAsia"/>
               <w:noProof/>
+              <w:kern w:val="2"/>
+              <w:sz w:val="24"/>
+              <w:szCs w:val="24"/>
               <w:lang w:eastAsia="en-GB"/>
+              <w14:ligatures w14:val="standardContextual"/>
             </w:rPr>
           </w:pPr>
-          <w:hyperlink w:anchor="_Toc224568271" w:history="1">
+          <w:hyperlink w:anchor="_Toc224651725" w:history="1">
             <w:r>
               <w:rPr>
                 <w:rStyle w:val="Hyperlink"/>
@@ -883,7 +984,7 @@
                 <w:noProof/>
                 <w:webHidden/>
               </w:rPr>
-              <w:instrText xml:space="preserve"> PAGEREF _Toc224568271 \h </w:instrText>
+              <w:instrText xml:space="preserve"> PAGEREF _Toc224651725 \h </w:instrText>
             </w:r>
             <w:r>
               <w:rPr>
@@ -903,7 +1004,7 @@
                 <w:noProof/>
                 <w:webHidden/>
               </w:rPr>
-              <w:t>24</w:t>
+              <w:t>26</w:t>
             </w:r>
             <w:r>
               <w:rPr>
@@ -923,10 +1024,14 @@
             <w:rPr>
               <w:rFonts w:eastAsiaTheme="minorEastAsia"/>
               <w:noProof/>
+              <w:kern w:val="2"/>
+              <w:sz w:val="24"/>
+              <w:szCs w:val="24"/>
               <w:lang w:eastAsia="en-GB"/>
+              <w14:ligatures w14:val="standardContextual"/>
             </w:rPr>
           </w:pPr>
-          <w:hyperlink w:anchor="_Toc224568272" w:history="1">
+          <w:hyperlink w:anchor="_Toc224651726" w:history="1">
             <w:r>
               <w:rPr>
                 <w:rStyle w:val="Hyperlink"/>
@@ -953,7 +1058,7 @@
                 <w:noProof/>
                 <w:webHidden/>
               </w:rPr>
-              <w:instrText xml:space="preserve"> PAGEREF _Toc224568272 \h </w:instrText>
+              <w:instrText xml:space="preserve"> PAGEREF _Toc224651726 \h </w:instrText>
             </w:r>
             <w:r>
               <w:rPr>
@@ -973,7 +1078,7 @@
                 <w:noProof/>
                 <w:webHidden/>
               </w:rPr>
-              <w:t>25</w:t>
+              <w:t>26</w:t>
             </w:r>
             <w:r>
               <w:rPr>
@@ -1025,7 +1130,7 @@
       <w:pPr>
         <w:pStyle w:val="Heading1"/>
       </w:pPr>
-      <w:bookmarkStart w:id="0" w:name="_Toc224568265"/>
+      <w:bookmarkStart w:id="0" w:name="_Toc224651718"/>
       <w:r>
         <w:t>Site Map</w:t>
       </w:r>
@@ -1107,12 +1212,11 @@
     <w:p/>
     <w:p/>
     <w:p/>
-    <w:p/>
     <w:p>
       <w:pPr>
         <w:pStyle w:val="Heading1"/>
       </w:pPr>
-      <w:bookmarkStart w:id="1" w:name="_Toc224568266"/>
+      <w:bookmarkStart w:id="1" w:name="_Toc224651719"/>
       <w:r>
         <w:lastRenderedPageBreak/>
         <w:t>Wireframe Designs</w:t>
@@ -1124,9 +1228,11 @@
       <w:pPr>
         <w:pStyle w:val="Heading2"/>
       </w:pPr>
+      <w:bookmarkStart w:id="2" w:name="_Toc224651720"/>
       <w:r>
         <w:t>Global Style Guide</w:t>
       </w:r>
+      <w:bookmarkEnd w:id="2"/>
     </w:p>
     <w:p>
       <w:pPr>
@@ -1188,13 +1294,27 @@
         <w:t xml:space="preserve"> Both fonts are </w:t>
       </w:r>
       <w:r>
-        <w:t xml:space="preserve">freely available in Canva, and </w:t>
+        <w:t xml:space="preserve">freely available in </w:t>
+      </w:r>
+      <w:r>
+        <w:t>Canva and</w:t>
+      </w:r>
+      <w:r>
+        <w:t xml:space="preserve"> </w:t>
       </w:r>
       <w:r>
         <w:t xml:space="preserve">sourced from </w:t>
       </w:r>
       <w:r>
-        <w:t xml:space="preserve">a trusted open-source which is </w:t>
+        <w:t xml:space="preserve">a trusted </w:t>
+      </w:r>
+      <w:proofErr w:type="gramStart"/>
+      <w:r>
+        <w:t>open-source</w:t>
+      </w:r>
+      <w:proofErr w:type="gramEnd"/>
+      <w:r>
+        <w:t xml:space="preserve"> which is </w:t>
       </w:r>
       <w:r>
         <w:t>google fonts</w:t>
@@ -1208,7 +1328,15 @@
     </w:p>
     <w:p>
       <w:r>
-        <w:t xml:space="preserve">The sizes I have used for the fonts are various, the </w:t>
+        <w:t xml:space="preserve">The sizes I have used for the fonts are </w:t>
+      </w:r>
+      <w:proofErr w:type="gramStart"/>
+      <w:r>
+        <w:t>various,</w:t>
+      </w:r>
+      <w:proofErr w:type="gramEnd"/>
+      <w:r>
+        <w:t xml:space="preserve"> the </w:t>
       </w:r>
       <w:r>
         <w:t xml:space="preserve">hero titles are 60px on </w:t>
@@ -1260,7 +1388,10 @@
         <w:t xml:space="preserve">wireframes are dark green, a warm brown and white. The green and brown </w:t>
       </w:r>
       <w:r>
-        <w:t xml:space="preserve">was used because of the natural landscape that </w:t>
+        <w:t>were</w:t>
+      </w:r>
+      <w:r>
+        <w:t xml:space="preserve"> used because of the natural landscape that </w:t>
       </w:r>
       <w:r>
         <w:t>represent the farmers and food producers</w:t>
@@ -1292,17 +1423,30 @@
       <w:r>
         <w:t xml:space="preserve">aw the </w:t>
       </w:r>
+      <w:proofErr w:type="spellStart"/>
       <w:r>
         <w:t>viewer</w:t>
       </w:r>
       <w:r>
-        <w:t>s attention</w:t>
+        <w:t>s</w:t>
+      </w:r>
+      <w:proofErr w:type="spellEnd"/>
+      <w:r>
+        <w:t xml:space="preserve"> attention</w:t>
       </w:r>
       <w:r>
         <w:t xml:space="preserve"> to read the element. The white used in the designs make sure of high contrast and readability, </w:t>
       </w:r>
       <w:r>
-        <w:t xml:space="preserve">and it makes the design look more appealing to the eyes giving a sense of breathing space when navigating through the solution. It is used in the background of the designs, the navbar, and in forms. These colours together support accessibility and usability while also strengthening the brands theme. </w:t>
+        <w:t xml:space="preserve">and it makes the design look more appealing to the eyes giving a sense of breathing space when navigating through the solution. It is used in the background of the designs, the navbar, and in forms. These colours together support accessibility and usability while also strengthening the </w:t>
+      </w:r>
+      <w:proofErr w:type="gramStart"/>
+      <w:r>
+        <w:t>brands</w:t>
+      </w:r>
+      <w:proofErr w:type="gramEnd"/>
+      <w:r>
+        <w:t xml:space="preserve"> theme. </w:t>
       </w:r>
     </w:p>
     <w:p/>
@@ -1365,7 +1509,13 @@
         <w:t xml:space="preserve">Similarly, the footer is consistent with its design and positioning across all the pages in my wireframes. With its </w:t>
       </w:r>
       <w:r>
-        <w:t>bottom of the page positioning which is</w:t>
+        <w:t xml:space="preserve">bottom of the page </w:t>
+      </w:r>
+      <w:r>
+        <w:t>positioning,</w:t>
+      </w:r>
+      <w:r>
+        <w:t xml:space="preserve"> which is</w:t>
       </w:r>
       <w:r>
         <w:t xml:space="preserve"> industry standard</w:t>
@@ -1374,7 +1524,15 @@
         <w:t>, it consists of quick links to various pages and a small business identity section. The footers colour is the same dark green mentioned previously, and the quick links are in a shade of grey, and the b</w:t>
       </w:r>
       <w:r>
-        <w:t xml:space="preserve">usiness name is written in white. The quick links will eventually send the user to different pages of the solution, some will even take the user to a filtered page such as “Fruit &amp; Veg”. If the user clicks this link they will be redirected to the shop, but it will filter the products to only show the fruits and vegetables sold. These </w:t>
+        <w:t xml:space="preserve">usiness name is written in white. The quick links will eventually send the user to different pages of the </w:t>
+      </w:r>
+      <w:proofErr w:type="gramStart"/>
+      <w:r>
+        <w:t>solution,</w:t>
+      </w:r>
+      <w:proofErr w:type="gramEnd"/>
+      <w:r>
+        <w:t xml:space="preserve"> some will even take the user to a filtered page such as “Fruit &amp; Veg”. If the user clicks this link they will be redirected to the shop, but it will filter the products to only show the fruits and vegetables sold. These </w:t>
       </w:r>
       <w:r>
         <w:lastRenderedPageBreak/>
@@ -2960,14 +3118,14 @@
       <w:pPr>
         <w:pStyle w:val="Heading1"/>
       </w:pPr>
-      <w:bookmarkStart w:id="2" w:name="_Toc224568267"/>
+      <w:bookmarkStart w:id="3" w:name="_Toc224651721"/>
       <w:r>
         <w:t>Algorithm Designs</w:t>
       </w:r>
       <w:r>
         <w:t xml:space="preserve"> (Flowcharts)</w:t>
       </w:r>
-      <w:bookmarkEnd w:id="2"/>
+      <w:bookmarkEnd w:id="3"/>
     </w:p>
     <w:p/>
     <w:p>
@@ -3110,12 +3268,228 @@
     <w:p/>
     <w:p/>
     <w:p/>
+    <w:p/>
+    <w:p/>
+    <w:p/>
+    <w:p>
+      <w:pPr>
+        <w:rPr>
+          <w:noProof/>
+        </w:rPr>
+      </w:pPr>
+      <w:r>
+        <w:rPr>
+          <w:noProof/>
+        </w:rPr>
+        <w:lastRenderedPageBreak/>
+        <w:t>Product view Flowchart</w:t>
+      </w:r>
+    </w:p>
+    <w:p/>
+    <w:p>
+      <w:r>
+        <w:rPr>
+          <w:noProof/>
+        </w:rPr>
+        <w:drawing>
+          <wp:inline distT="0" distB="0" distL="0" distR="0" wp14:anchorId="21C95CDD" wp14:editId="49576145">
+            <wp:extent cx="6645910" cy="5188585"/>
+            <wp:effectExtent l="0" t="0" r="2540" b="0"/>
+            <wp:docPr id="117278601" name="Picture 4"/>
+            <wp:cNvGraphicFramePr>
+              <a:graphicFrameLocks xmlns:a="http://schemas.openxmlformats.org/drawingml/2006/main" noChangeAspect="1"/>
+            </wp:cNvGraphicFramePr>
+            <a:graphic xmlns:a="http://schemas.openxmlformats.org/drawingml/2006/main">
+              <a:graphicData uri="http://schemas.openxmlformats.org/drawingml/2006/picture">
+                <pic:pic xmlns:pic="http://schemas.openxmlformats.org/drawingml/2006/picture">
+                  <pic:nvPicPr>
+                    <pic:cNvPr id="0" name="Picture 5"/>
+                    <pic:cNvPicPr>
+                      <a:picLocks noChangeAspect="1" noChangeArrowheads="1"/>
+                    </pic:cNvPicPr>
+                  </pic:nvPicPr>
+                  <pic:blipFill>
+                    <a:blip r:embed="rId30">
+                      <a:extLst>
+                        <a:ext uri="{28A0092B-C50C-407E-A947-70E740481C1C}">
+                          <a14:useLocalDpi xmlns:a14="http://schemas.microsoft.com/office/drawing/2010/main" val="0"/>
+                        </a:ext>
+                      </a:extLst>
+                    </a:blip>
+                    <a:srcRect/>
+                    <a:stretch>
+                      <a:fillRect/>
+                    </a:stretch>
+                  </pic:blipFill>
+                  <pic:spPr bwMode="auto">
+                    <a:xfrm>
+                      <a:off x="0" y="0"/>
+                      <a:ext cx="6645910" cy="5188585"/>
+                    </a:xfrm>
+                    <a:prstGeom prst="rect">
+                      <a:avLst/>
+                    </a:prstGeom>
+                    <a:noFill/>
+                    <a:ln>
+                      <a:noFill/>
+                    </a:ln>
+                  </pic:spPr>
+                </pic:pic>
+              </a:graphicData>
+            </a:graphic>
+          </wp:inline>
+        </w:drawing>
+      </w:r>
+    </w:p>
+    <w:p/>
+    <w:p/>
+    <w:p/>
+    <w:p/>
+    <w:p/>
+    <w:p/>
+    <w:p/>
+    <w:p/>
+    <w:p/>
+    <w:p/>
+    <w:p/>
+    <w:p/>
+    <w:p/>
+    <w:p/>
+    <w:p>
+      <w:r>
+        <w:lastRenderedPageBreak/>
+        <w:t>Place Order Flowchart</w:t>
+      </w:r>
+    </w:p>
+    <w:p/>
+    <w:p>
+      <w:r>
+        <w:rPr>
+          <w:noProof/>
+        </w:rPr>
+        <w:drawing>
+          <wp:inline distT="0" distB="0" distL="0" distR="0" wp14:anchorId="38318E4D" wp14:editId="4B1A17C1">
+            <wp:extent cx="6645910" cy="8687435"/>
+            <wp:effectExtent l="0" t="0" r="2540" b="0"/>
+            <wp:docPr id="1926524437" name="Picture 5"/>
+            <wp:cNvGraphicFramePr>
+              <a:graphicFrameLocks xmlns:a="http://schemas.openxmlformats.org/drawingml/2006/main" noChangeAspect="1"/>
+            </wp:cNvGraphicFramePr>
+            <a:graphic xmlns:a="http://schemas.openxmlformats.org/drawingml/2006/main">
+              <a:graphicData uri="http://schemas.openxmlformats.org/drawingml/2006/picture">
+                <pic:pic xmlns:pic="http://schemas.openxmlformats.org/drawingml/2006/picture">
+                  <pic:nvPicPr>
+                    <pic:cNvPr id="0" name="Picture 7"/>
+                    <pic:cNvPicPr>
+                      <a:picLocks noChangeAspect="1" noChangeArrowheads="1"/>
+                    </pic:cNvPicPr>
+                  </pic:nvPicPr>
+                  <pic:blipFill>
+                    <a:blip r:embed="rId31">
+                      <a:extLst>
+                        <a:ext uri="{28A0092B-C50C-407E-A947-70E740481C1C}">
+                          <a14:useLocalDpi xmlns:a14="http://schemas.microsoft.com/office/drawing/2010/main" val="0"/>
+                        </a:ext>
+                      </a:extLst>
+                    </a:blip>
+                    <a:srcRect/>
+                    <a:stretch>
+                      <a:fillRect/>
+                    </a:stretch>
+                  </pic:blipFill>
+                  <pic:spPr bwMode="auto">
+                    <a:xfrm>
+                      <a:off x="0" y="0"/>
+                      <a:ext cx="6645910" cy="8687435"/>
+                    </a:xfrm>
+                    <a:prstGeom prst="rect">
+                      <a:avLst/>
+                    </a:prstGeom>
+                    <a:noFill/>
+                    <a:ln>
+                      <a:noFill/>
+                    </a:ln>
+                  </pic:spPr>
+                </pic:pic>
+              </a:graphicData>
+            </a:graphic>
+          </wp:inline>
+        </w:drawing>
+      </w:r>
+    </w:p>
+    <w:p/>
+    <w:p>
+      <w:r>
+        <w:lastRenderedPageBreak/>
+        <w:t>Stock Update Flowchart</w:t>
+      </w:r>
+    </w:p>
+    <w:p/>
+    <w:p>
+      <w:r>
+        <w:rPr>
+          <w:noProof/>
+        </w:rPr>
+        <w:drawing>
+          <wp:inline distT="0" distB="0" distL="0" distR="0" wp14:anchorId="3C0CB750" wp14:editId="01076C90">
+            <wp:extent cx="6645910" cy="7974965"/>
+            <wp:effectExtent l="0" t="0" r="2540" b="6985"/>
+            <wp:docPr id="1669738119" name="Picture 6"/>
+            <wp:cNvGraphicFramePr>
+              <a:graphicFrameLocks xmlns:a="http://schemas.openxmlformats.org/drawingml/2006/main" noChangeAspect="1"/>
+            </wp:cNvGraphicFramePr>
+            <a:graphic xmlns:a="http://schemas.openxmlformats.org/drawingml/2006/main">
+              <a:graphicData uri="http://schemas.openxmlformats.org/drawingml/2006/picture">
+                <pic:pic xmlns:pic="http://schemas.openxmlformats.org/drawingml/2006/picture">
+                  <pic:nvPicPr>
+                    <pic:cNvPr id="0" name="Picture 9"/>
+                    <pic:cNvPicPr>
+                      <a:picLocks noChangeAspect="1" noChangeArrowheads="1"/>
+                    </pic:cNvPicPr>
+                  </pic:nvPicPr>
+                  <pic:blipFill>
+                    <a:blip r:embed="rId32">
+                      <a:extLst>
+                        <a:ext uri="{28A0092B-C50C-407E-A947-70E740481C1C}">
+                          <a14:useLocalDpi xmlns:a14="http://schemas.microsoft.com/office/drawing/2010/main" val="0"/>
+                        </a:ext>
+                      </a:extLst>
+                    </a:blip>
+                    <a:srcRect/>
+                    <a:stretch>
+                      <a:fillRect/>
+                    </a:stretch>
+                  </pic:blipFill>
+                  <pic:spPr bwMode="auto">
+                    <a:xfrm>
+                      <a:off x="0" y="0"/>
+                      <a:ext cx="6645910" cy="7974965"/>
+                    </a:xfrm>
+                    <a:prstGeom prst="rect">
+                      <a:avLst/>
+                    </a:prstGeom>
+                    <a:noFill/>
+                    <a:ln>
+                      <a:noFill/>
+                    </a:ln>
+                  </pic:spPr>
+                </pic:pic>
+              </a:graphicData>
+            </a:graphic>
+          </wp:inline>
+        </w:drawing>
+      </w:r>
+    </w:p>
+    <w:p/>
+    <w:p/>
+    <w:p/>
     <w:p>
       <w:pPr>
         <w:pStyle w:val="Heading1"/>
       </w:pPr>
-      <w:bookmarkStart w:id="3" w:name="_Toc224568268"/>
-      <w:r>
+      <w:bookmarkStart w:id="4" w:name="_Toc224651722"/>
+      <w:r>
+        <w:lastRenderedPageBreak/>
         <w:t xml:space="preserve">Database </w:t>
       </w:r>
       <w:r>
@@ -3124,7 +3498,7 @@
       <w:r>
         <w:t>Design</w:t>
       </w:r>
-      <w:bookmarkEnd w:id="3"/>
+      <w:bookmarkEnd w:id="4"/>
     </w:p>
     <w:p/>
     <w:p/>
@@ -3133,22 +3507,22 @@
       <w:pPr>
         <w:pStyle w:val="Heading1"/>
       </w:pPr>
-      <w:bookmarkStart w:id="4" w:name="_Toc224568269"/>
+      <w:bookmarkStart w:id="5" w:name="_Toc224651723"/>
       <w:r>
         <w:t>Data Dictionary</w:t>
       </w:r>
-      <w:bookmarkEnd w:id="4"/>
+      <w:bookmarkEnd w:id="5"/>
     </w:p>
     <w:p/>
     <w:p>
       <w:pPr>
         <w:pStyle w:val="Heading2"/>
       </w:pPr>
-      <w:bookmarkStart w:id="5" w:name="_Toc224568270"/>
+      <w:bookmarkStart w:id="6" w:name="_Toc224651724"/>
       <w:r>
         <w:t>MVC System Data Dictionary</w:t>
       </w:r>
-      <w:bookmarkEnd w:id="5"/>
+      <w:bookmarkEnd w:id="6"/>
       <w:r>
         <w:t xml:space="preserve"> </w:t>
       </w:r>
@@ -3158,9 +3532,11 @@
       <w:pPr>
         <w:pStyle w:val="Subtitle"/>
       </w:pPr>
+      <w:proofErr w:type="spellStart"/>
       <w:r>
         <w:t>AspNetUsers</w:t>
       </w:r>
+      <w:proofErr w:type="spellEnd"/>
     </w:p>
     <w:tbl>
       <w:tblPr>
@@ -3332,9 +3708,11 @@
             <w:tcW w:w="1200" w:type="dxa"/>
           </w:tcPr>
           <w:p>
+            <w:proofErr w:type="spellStart"/>
             <w:r>
               <w:t>nvarchar</w:t>
             </w:r>
+            <w:proofErr w:type="spellEnd"/>
           </w:p>
         </w:tc>
         <w:tc>
@@ -3384,9 +3762,11 @@
             <w:tcW w:w="2405" w:type="dxa"/>
           </w:tcPr>
           <w:p>
+            <w:proofErr w:type="spellStart"/>
             <w:r>
               <w:t>UserName</w:t>
             </w:r>
+            <w:proofErr w:type="spellEnd"/>
           </w:p>
         </w:tc>
         <w:tc>
@@ -3394,9 +3774,11 @@
             <w:tcW w:w="1200" w:type="dxa"/>
           </w:tcPr>
           <w:p>
+            <w:proofErr w:type="spellStart"/>
             <w:r>
               <w:t>nvarchar</w:t>
             </w:r>
+            <w:proofErr w:type="spellEnd"/>
           </w:p>
         </w:tc>
         <w:tc>
@@ -3449,9 +3831,11 @@
             <w:tcW w:w="2405" w:type="dxa"/>
           </w:tcPr>
           <w:p>
+            <w:proofErr w:type="spellStart"/>
             <w:r>
               <w:t>NormalizedUserName</w:t>
             </w:r>
+            <w:proofErr w:type="spellEnd"/>
           </w:p>
         </w:tc>
         <w:tc>
@@ -3459,9 +3843,11 @@
             <w:tcW w:w="1200" w:type="dxa"/>
           </w:tcPr>
           <w:p>
+            <w:proofErr w:type="spellStart"/>
             <w:r>
               <w:t>nvarchar</w:t>
             </w:r>
+            <w:proofErr w:type="spellEnd"/>
           </w:p>
         </w:tc>
         <w:tc>
@@ -3521,9 +3907,11 @@
             <w:tcW w:w="1200" w:type="dxa"/>
           </w:tcPr>
           <w:p>
+            <w:proofErr w:type="spellStart"/>
             <w:r>
               <w:t>nvarchar</w:t>
             </w:r>
+            <w:proofErr w:type="spellEnd"/>
           </w:p>
         </w:tc>
         <w:tc>
@@ -3573,9 +3961,11 @@
             <w:tcW w:w="2405" w:type="dxa"/>
           </w:tcPr>
           <w:p>
+            <w:proofErr w:type="spellStart"/>
             <w:r>
               <w:t>NormalizedEmail</w:t>
             </w:r>
+            <w:proofErr w:type="spellEnd"/>
           </w:p>
         </w:tc>
         <w:tc>
@@ -3583,9 +3973,11 @@
             <w:tcW w:w="1200" w:type="dxa"/>
           </w:tcPr>
           <w:p>
+            <w:proofErr w:type="spellStart"/>
             <w:r>
               <w:t>nvarchar</w:t>
             </w:r>
+            <w:proofErr w:type="spellEnd"/>
           </w:p>
         </w:tc>
         <w:tc>
@@ -3635,9 +4027,11 @@
             <w:tcW w:w="2405" w:type="dxa"/>
           </w:tcPr>
           <w:p>
+            <w:proofErr w:type="spellStart"/>
             <w:r>
               <w:t>EmailConfirmed</w:t>
             </w:r>
+            <w:proofErr w:type="spellEnd"/>
           </w:p>
         </w:tc>
         <w:tc>
@@ -3645,9 +4039,11 @@
             <w:tcW w:w="1200" w:type="dxa"/>
           </w:tcPr>
           <w:p>
+            <w:proofErr w:type="spellStart"/>
             <w:r>
               <w:t>boolean</w:t>
             </w:r>
+            <w:proofErr w:type="spellEnd"/>
           </w:p>
         </w:tc>
         <w:tc>
@@ -3697,9 +4093,11 @@
             <w:tcW w:w="2405" w:type="dxa"/>
           </w:tcPr>
           <w:p>
+            <w:proofErr w:type="spellStart"/>
             <w:r>
               <w:t>PasswordHash</w:t>
             </w:r>
+            <w:proofErr w:type="spellEnd"/>
           </w:p>
         </w:tc>
         <w:tc>
@@ -3707,9 +4105,11 @@
             <w:tcW w:w="1200" w:type="dxa"/>
           </w:tcPr>
           <w:p>
+            <w:proofErr w:type="spellStart"/>
             <w:r>
               <w:t>nvarchar</w:t>
             </w:r>
+            <w:proofErr w:type="spellEnd"/>
           </w:p>
         </w:tc>
         <w:tc>
@@ -3759,9 +4159,11 @@
             <w:tcW w:w="2405" w:type="dxa"/>
           </w:tcPr>
           <w:p>
+            <w:proofErr w:type="spellStart"/>
             <w:r>
               <w:t>SecurityStamp</w:t>
             </w:r>
+            <w:proofErr w:type="spellEnd"/>
           </w:p>
         </w:tc>
         <w:tc>
@@ -3769,9 +4171,11 @@
             <w:tcW w:w="1200" w:type="dxa"/>
           </w:tcPr>
           <w:p>
+            <w:proofErr w:type="spellStart"/>
             <w:r>
               <w:t>nvarchar</w:t>
             </w:r>
+            <w:proofErr w:type="spellEnd"/>
           </w:p>
         </w:tc>
         <w:tc>
@@ -3821,9 +4225,11 @@
             <w:tcW w:w="2405" w:type="dxa"/>
           </w:tcPr>
           <w:p>
+            <w:proofErr w:type="spellStart"/>
             <w:r>
               <w:t>ConcurrencyStamp</w:t>
             </w:r>
+            <w:proofErr w:type="spellEnd"/>
           </w:p>
         </w:tc>
         <w:tc>
@@ -3831,9 +4237,11 @@
             <w:tcW w:w="1200" w:type="dxa"/>
           </w:tcPr>
           <w:p>
+            <w:proofErr w:type="spellStart"/>
             <w:r>
               <w:t>nvarchar</w:t>
             </w:r>
+            <w:proofErr w:type="spellEnd"/>
           </w:p>
         </w:tc>
         <w:tc>
@@ -3883,9 +4291,11 @@
             <w:tcW w:w="2405" w:type="dxa"/>
           </w:tcPr>
           <w:p>
+            <w:proofErr w:type="spellStart"/>
             <w:r>
               <w:t>PhoneNumber</w:t>
             </w:r>
+            <w:proofErr w:type="spellEnd"/>
           </w:p>
         </w:tc>
         <w:tc>
@@ -3893,9 +4303,11 @@
             <w:tcW w:w="1200" w:type="dxa"/>
           </w:tcPr>
           <w:p>
+            <w:proofErr w:type="spellStart"/>
             <w:r>
               <w:t>nvarchar</w:t>
             </w:r>
+            <w:proofErr w:type="spellEnd"/>
           </w:p>
         </w:tc>
         <w:tc>
@@ -3945,9 +4357,11 @@
             <w:tcW w:w="2405" w:type="dxa"/>
           </w:tcPr>
           <w:p>
+            <w:proofErr w:type="spellStart"/>
             <w:r>
               <w:t>PhoneNumberConfirmed</w:t>
             </w:r>
+            <w:proofErr w:type="spellEnd"/>
           </w:p>
         </w:tc>
         <w:tc>
@@ -3955,9 +4369,11 @@
             <w:tcW w:w="1200" w:type="dxa"/>
           </w:tcPr>
           <w:p>
+            <w:proofErr w:type="spellStart"/>
             <w:r>
               <w:t>boolean</w:t>
             </w:r>
+            <w:proofErr w:type="spellEnd"/>
           </w:p>
         </w:tc>
         <w:tc>
@@ -4007,9 +4423,11 @@
             <w:tcW w:w="2405" w:type="dxa"/>
           </w:tcPr>
           <w:p>
+            <w:proofErr w:type="spellStart"/>
             <w:r>
               <w:t>TwoFactorEnabled</w:t>
             </w:r>
+            <w:proofErr w:type="spellEnd"/>
           </w:p>
         </w:tc>
         <w:tc>
@@ -4017,9 +4435,11 @@
             <w:tcW w:w="1200" w:type="dxa"/>
           </w:tcPr>
           <w:p>
+            <w:proofErr w:type="spellStart"/>
             <w:r>
               <w:t>boolean</w:t>
             </w:r>
+            <w:proofErr w:type="spellEnd"/>
           </w:p>
         </w:tc>
         <w:tc>
@@ -4069,9 +4489,11 @@
             <w:tcW w:w="2405" w:type="dxa"/>
           </w:tcPr>
           <w:p>
+            <w:proofErr w:type="spellStart"/>
             <w:r>
               <w:t>LockoutEnd</w:t>
             </w:r>
+            <w:proofErr w:type="spellEnd"/>
           </w:p>
         </w:tc>
         <w:tc>
@@ -4127,9 +4549,11 @@
             <w:tcW w:w="2405" w:type="dxa"/>
           </w:tcPr>
           <w:p>
+            <w:proofErr w:type="spellStart"/>
             <w:r>
               <w:t>LockoutEnabled</w:t>
             </w:r>
+            <w:proofErr w:type="spellEnd"/>
           </w:p>
         </w:tc>
         <w:tc>
@@ -4137,9 +4561,11 @@
             <w:tcW w:w="1200" w:type="dxa"/>
           </w:tcPr>
           <w:p>
+            <w:proofErr w:type="spellStart"/>
             <w:r>
               <w:t>boolean</w:t>
             </w:r>
+            <w:proofErr w:type="spellEnd"/>
           </w:p>
         </w:tc>
         <w:tc>
@@ -4189,9 +4615,11 @@
             <w:tcW w:w="2405" w:type="dxa"/>
           </w:tcPr>
           <w:p>
+            <w:proofErr w:type="spellStart"/>
             <w:r>
               <w:t>AccessFailedCount</w:t>
             </w:r>
+            <w:proofErr w:type="spellEnd"/>
           </w:p>
         </w:tc>
         <w:tc>
@@ -4251,9 +4679,11 @@
       <w:pPr>
         <w:pStyle w:val="Subtitle"/>
       </w:pPr>
+      <w:proofErr w:type="spellStart"/>
       <w:r>
         <w:t>AspNetRoles</w:t>
       </w:r>
+      <w:proofErr w:type="spellEnd"/>
     </w:p>
     <w:tbl>
       <w:tblPr>
@@ -4425,9 +4855,11 @@
             <w:tcW w:w="1058" w:type="dxa"/>
           </w:tcPr>
           <w:p>
+            <w:proofErr w:type="spellStart"/>
             <w:r>
               <w:t>nvarchar</w:t>
             </w:r>
+            <w:proofErr w:type="spellEnd"/>
           </w:p>
         </w:tc>
         <w:tc>
@@ -4490,9 +4922,11 @@
             <w:tcW w:w="1058" w:type="dxa"/>
           </w:tcPr>
           <w:p>
+            <w:proofErr w:type="spellStart"/>
             <w:r>
               <w:t>nvarchar</w:t>
             </w:r>
+            <w:proofErr w:type="spellEnd"/>
           </w:p>
         </w:tc>
         <w:tc>
@@ -4542,9 +4976,11 @@
             <w:tcW w:w="2975" w:type="dxa"/>
           </w:tcPr>
           <w:p>
+            <w:proofErr w:type="spellStart"/>
             <w:r>
               <w:t>NormalizedName</w:t>
             </w:r>
+            <w:proofErr w:type="spellEnd"/>
           </w:p>
         </w:tc>
         <w:tc>
@@ -4552,9 +4988,11 @@
             <w:tcW w:w="1058" w:type="dxa"/>
           </w:tcPr>
           <w:p>
+            <w:proofErr w:type="spellStart"/>
             <w:r>
               <w:t>nvarchar</w:t>
             </w:r>
+            <w:proofErr w:type="spellEnd"/>
           </w:p>
         </w:tc>
         <w:tc>
@@ -4604,9 +5042,11 @@
             <w:tcW w:w="2975" w:type="dxa"/>
           </w:tcPr>
           <w:p>
+            <w:proofErr w:type="spellStart"/>
             <w:r>
               <w:t>ConcurrencyStamp</w:t>
             </w:r>
+            <w:proofErr w:type="spellEnd"/>
           </w:p>
         </w:tc>
         <w:tc>
@@ -4614,9 +5054,11 @@
             <w:tcW w:w="1058" w:type="dxa"/>
           </w:tcPr>
           <w:p>
+            <w:proofErr w:type="spellStart"/>
             <w:r>
               <w:t>nvarchar</w:t>
             </w:r>
+            <w:proofErr w:type="spellEnd"/>
           </w:p>
         </w:tc>
         <w:tc>
@@ -4666,9 +5108,11 @@
       <w:pPr>
         <w:pStyle w:val="Subtitle"/>
       </w:pPr>
+      <w:proofErr w:type="spellStart"/>
       <w:r>
         <w:t>AspNetUserRoles</w:t>
       </w:r>
+      <w:proofErr w:type="spellEnd"/>
     </w:p>
     <w:tbl>
       <w:tblPr>
@@ -4830,12 +5274,14 @@
             <w:tcW w:w="2263" w:type="dxa"/>
           </w:tcPr>
           <w:p>
+            <w:proofErr w:type="spellStart"/>
             <w:r>
               <w:t>User</w:t>
             </w:r>
             <w:r>
               <w:t>Id</w:t>
             </w:r>
+            <w:proofErr w:type="spellEnd"/>
           </w:p>
         </w:tc>
         <w:tc>
@@ -4843,9 +5289,11 @@
             <w:tcW w:w="1134" w:type="dxa"/>
           </w:tcPr>
           <w:p>
+            <w:proofErr w:type="spellStart"/>
             <w:r>
               <w:t>nvarchar</w:t>
             </w:r>
+            <w:proofErr w:type="spellEnd"/>
           </w:p>
         </w:tc>
         <w:tc>
@@ -4901,9 +5349,11 @@
             <w:tcW w:w="2263" w:type="dxa"/>
           </w:tcPr>
           <w:p>
+            <w:proofErr w:type="spellStart"/>
             <w:r>
               <w:t>RoleId</w:t>
             </w:r>
+            <w:proofErr w:type="spellEnd"/>
           </w:p>
         </w:tc>
         <w:tc>
@@ -4911,9 +5361,11 @@
             <w:tcW w:w="1134" w:type="dxa"/>
           </w:tcPr>
           <w:p>
+            <w:proofErr w:type="spellStart"/>
             <w:r>
               <w:t>nvarchar</w:t>
             </w:r>
+            <w:proofErr w:type="spellEnd"/>
           </w:p>
         </w:tc>
         <w:tc>
@@ -4963,9 +5415,11 @@
       <w:pPr>
         <w:pStyle w:val="Subtitle"/>
       </w:pPr>
+      <w:proofErr w:type="spellStart"/>
       <w:r>
         <w:t>AspNetUserClaims</w:t>
       </w:r>
+      <w:proofErr w:type="spellEnd"/>
     </w:p>
     <w:tbl>
       <w:tblPr>
@@ -5192,9 +5646,11 @@
             <w:tcW w:w="1262" w:type="dxa"/>
           </w:tcPr>
           <w:p>
+            <w:proofErr w:type="spellStart"/>
             <w:r>
               <w:t>UserId</w:t>
             </w:r>
+            <w:proofErr w:type="spellEnd"/>
           </w:p>
         </w:tc>
         <w:tc>
@@ -5202,9 +5658,11 @@
             <w:tcW w:w="1058" w:type="dxa"/>
           </w:tcPr>
           <w:p>
+            <w:proofErr w:type="spellStart"/>
             <w:r>
               <w:t>nvarchar</w:t>
             </w:r>
+            <w:proofErr w:type="spellEnd"/>
           </w:p>
         </w:tc>
         <w:tc>
@@ -5254,9 +5712,12 @@
             <w:tcW w:w="1262" w:type="dxa"/>
           </w:tcPr>
           <w:p>
-            <w:r>
+            <w:proofErr w:type="spellStart"/>
+            <w:r>
+              <w:lastRenderedPageBreak/>
               <w:t>ClaimType</w:t>
             </w:r>
+            <w:proofErr w:type="spellEnd"/>
           </w:p>
         </w:tc>
         <w:tc>
@@ -5264,9 +5725,11 @@
             <w:tcW w:w="1058" w:type="dxa"/>
           </w:tcPr>
           <w:p>
+            <w:proofErr w:type="spellStart"/>
             <w:r>
               <w:t>nvarchar</w:t>
             </w:r>
+            <w:proofErr w:type="spellEnd"/>
           </w:p>
         </w:tc>
         <w:tc>
@@ -5316,9 +5779,11 @@
             <w:tcW w:w="1262" w:type="dxa"/>
           </w:tcPr>
           <w:p>
+            <w:proofErr w:type="spellStart"/>
             <w:r>
               <w:t>ClaimValue</w:t>
             </w:r>
+            <w:proofErr w:type="spellEnd"/>
           </w:p>
         </w:tc>
         <w:tc>
@@ -5326,9 +5791,11 @@
             <w:tcW w:w="1058" w:type="dxa"/>
           </w:tcPr>
           <w:p>
+            <w:proofErr w:type="spellStart"/>
             <w:r>
               <w:t>nvarchar</w:t>
             </w:r>
+            <w:proofErr w:type="spellEnd"/>
           </w:p>
         </w:tc>
         <w:tc>
@@ -5378,9 +5845,11 @@
       <w:pPr>
         <w:pStyle w:val="Subtitle"/>
       </w:pPr>
+      <w:proofErr w:type="spellStart"/>
       <w:r>
         <w:t>AspNetRoleClaims</w:t>
       </w:r>
+      <w:proofErr w:type="spellEnd"/>
     </w:p>
     <w:tbl>
       <w:tblPr>
@@ -5416,7 +5885,6 @@
                 <w:bCs/>
                 <w:color w:val="FFFFFF" w:themeColor="background1"/>
               </w:rPr>
-              <w:lastRenderedPageBreak/>
               <w:t>Property</w:t>
             </w:r>
           </w:p>
@@ -5605,9 +6073,11 @@
             <w:tcW w:w="1270" w:type="dxa"/>
           </w:tcPr>
           <w:p>
+            <w:proofErr w:type="spellStart"/>
             <w:r>
               <w:t>RoleId</w:t>
             </w:r>
+            <w:proofErr w:type="spellEnd"/>
           </w:p>
         </w:tc>
         <w:tc>
@@ -5615,9 +6085,11 @@
             <w:tcW w:w="1058" w:type="dxa"/>
           </w:tcPr>
           <w:p>
+            <w:proofErr w:type="spellStart"/>
             <w:r>
               <w:t>nvarchar</w:t>
             </w:r>
+            <w:proofErr w:type="spellEnd"/>
           </w:p>
         </w:tc>
         <w:tc>
@@ -5667,9 +6139,11 @@
             <w:tcW w:w="1270" w:type="dxa"/>
           </w:tcPr>
           <w:p>
+            <w:proofErr w:type="spellStart"/>
             <w:r>
               <w:t>ClaimType</w:t>
             </w:r>
+            <w:proofErr w:type="spellEnd"/>
           </w:p>
         </w:tc>
         <w:tc>
@@ -5677,9 +6151,11 @@
             <w:tcW w:w="1058" w:type="dxa"/>
           </w:tcPr>
           <w:p>
+            <w:proofErr w:type="spellStart"/>
             <w:r>
               <w:t>nvarchar</w:t>
             </w:r>
+            <w:proofErr w:type="spellEnd"/>
           </w:p>
         </w:tc>
         <w:tc>
@@ -5729,9 +6205,11 @@
             <w:tcW w:w="1270" w:type="dxa"/>
           </w:tcPr>
           <w:p>
+            <w:proofErr w:type="spellStart"/>
             <w:r>
               <w:t>ClaimValue</w:t>
             </w:r>
+            <w:proofErr w:type="spellEnd"/>
           </w:p>
         </w:tc>
         <w:tc>
@@ -5739,9 +6217,11 @@
             <w:tcW w:w="1058" w:type="dxa"/>
           </w:tcPr>
           <w:p>
+            <w:proofErr w:type="spellStart"/>
             <w:r>
               <w:t>nvarchar</w:t>
             </w:r>
+            <w:proofErr w:type="spellEnd"/>
           </w:p>
         </w:tc>
         <w:tc>
@@ -5791,9 +6271,11 @@
       <w:pPr>
         <w:pStyle w:val="Subtitle"/>
       </w:pPr>
+      <w:proofErr w:type="spellStart"/>
       <w:r>
         <w:t>AspNetUserLogins</w:t>
       </w:r>
+      <w:proofErr w:type="spellEnd"/>
     </w:p>
     <w:tbl>
       <w:tblPr>
@@ -5965,9 +6447,11 @@
             <w:tcW w:w="1058" w:type="dxa"/>
           </w:tcPr>
           <w:p>
+            <w:proofErr w:type="spellStart"/>
             <w:r>
               <w:t>nvarchar</w:t>
             </w:r>
+            <w:proofErr w:type="spellEnd"/>
           </w:p>
         </w:tc>
         <w:tc>
@@ -6017,9 +6501,11 @@
             <w:tcW w:w="2150" w:type="dxa"/>
           </w:tcPr>
           <w:p>
+            <w:proofErr w:type="spellStart"/>
             <w:r>
               <w:t>ProviderKey</w:t>
             </w:r>
+            <w:proofErr w:type="spellEnd"/>
           </w:p>
         </w:tc>
         <w:tc>
@@ -6027,9 +6513,11 @@
             <w:tcW w:w="1058" w:type="dxa"/>
           </w:tcPr>
           <w:p>
+            <w:proofErr w:type="spellStart"/>
             <w:r>
               <w:t>nvarchar</w:t>
             </w:r>
+            <w:proofErr w:type="spellEnd"/>
           </w:p>
         </w:tc>
         <w:tc>
@@ -6082,9 +6570,11 @@
             <w:tcW w:w="2150" w:type="dxa"/>
           </w:tcPr>
           <w:p>
+            <w:proofErr w:type="spellStart"/>
             <w:r>
               <w:t>ProviderDisplayName</w:t>
             </w:r>
+            <w:proofErr w:type="spellEnd"/>
           </w:p>
         </w:tc>
         <w:tc>
@@ -6092,9 +6582,11 @@
             <w:tcW w:w="1058" w:type="dxa"/>
           </w:tcPr>
           <w:p>
+            <w:proofErr w:type="spellStart"/>
             <w:r>
               <w:t>nvarchar</w:t>
             </w:r>
+            <w:proofErr w:type="spellEnd"/>
           </w:p>
         </w:tc>
         <w:tc>
@@ -6150,9 +6642,11 @@
             <w:tcW w:w="2150" w:type="dxa"/>
           </w:tcPr>
           <w:p>
+            <w:proofErr w:type="spellStart"/>
             <w:r>
               <w:t>UserId</w:t>
             </w:r>
+            <w:proofErr w:type="spellEnd"/>
           </w:p>
         </w:tc>
         <w:tc>
@@ -6160,9 +6654,11 @@
             <w:tcW w:w="1058" w:type="dxa"/>
           </w:tcPr>
           <w:p>
+            <w:proofErr w:type="spellStart"/>
             <w:r>
               <w:t>nvarchar</w:t>
             </w:r>
+            <w:proofErr w:type="spellEnd"/>
           </w:p>
         </w:tc>
         <w:tc>
@@ -6212,9 +6708,11 @@
       <w:pPr>
         <w:pStyle w:val="Subtitle"/>
       </w:pPr>
+      <w:proofErr w:type="spellStart"/>
       <w:r>
         <w:t>AspNetUserTokens</w:t>
       </w:r>
+      <w:proofErr w:type="spellEnd"/>
     </w:p>
     <w:tbl>
       <w:tblPr>
@@ -6376,9 +6874,11 @@
             <w:tcW w:w="1916" w:type="dxa"/>
           </w:tcPr>
           <w:p>
+            <w:proofErr w:type="spellStart"/>
             <w:r>
               <w:t>UserId</w:t>
             </w:r>
+            <w:proofErr w:type="spellEnd"/>
           </w:p>
         </w:tc>
         <w:tc>
@@ -6386,9 +6886,11 @@
             <w:tcW w:w="1058" w:type="dxa"/>
           </w:tcPr>
           <w:p>
+            <w:proofErr w:type="spellStart"/>
             <w:r>
               <w:t>nvarchar</w:t>
             </w:r>
+            <w:proofErr w:type="spellEnd"/>
           </w:p>
         </w:tc>
         <w:tc>
@@ -6451,9 +6953,11 @@
             <w:tcW w:w="1058" w:type="dxa"/>
           </w:tcPr>
           <w:p>
+            <w:proofErr w:type="spellStart"/>
             <w:r>
               <w:t>nvarchar</w:t>
             </w:r>
+            <w:proofErr w:type="spellEnd"/>
           </w:p>
         </w:tc>
         <w:tc>
@@ -6513,9 +7017,11 @@
             <w:tcW w:w="1058" w:type="dxa"/>
           </w:tcPr>
           <w:p>
+            <w:proofErr w:type="spellStart"/>
             <w:r>
               <w:t>nvarchar</w:t>
             </w:r>
+            <w:proofErr w:type="spellEnd"/>
           </w:p>
         </w:tc>
         <w:tc>
@@ -6578,9 +7084,11 @@
             <w:tcW w:w="1058" w:type="dxa"/>
           </w:tcPr>
           <w:p>
+            <w:proofErr w:type="spellStart"/>
             <w:r>
               <w:t>nvarchar</w:t>
             </w:r>
+            <w:proofErr w:type="spellEnd"/>
           </w:p>
         </w:tc>
         <w:tc>
@@ -6630,12 +7138,14 @@
       <w:r>
         <w:t>__</w:t>
       </w:r>
+      <w:proofErr w:type="spellStart"/>
       <w:r>
         <w:rPr>
           <w:rStyle w:val="SubtitleChar"/>
         </w:rPr>
         <w:t>EFMigrationsHistory</w:t>
       </w:r>
+      <w:proofErr w:type="spellEnd"/>
     </w:p>
     <w:tbl>
       <w:tblPr>
@@ -6797,9 +7307,11 @@
             <w:tcW w:w="3256" w:type="dxa"/>
           </w:tcPr>
           <w:p>
+            <w:proofErr w:type="spellStart"/>
             <w:r>
               <w:t>MigrationId</w:t>
             </w:r>
+            <w:proofErr w:type="spellEnd"/>
           </w:p>
         </w:tc>
         <w:tc>
@@ -6807,9 +7319,11 @@
             <w:tcW w:w="425" w:type="dxa"/>
           </w:tcPr>
           <w:p>
+            <w:proofErr w:type="spellStart"/>
             <w:r>
               <w:t>nvarchar</w:t>
             </w:r>
+            <w:proofErr w:type="spellEnd"/>
           </w:p>
         </w:tc>
         <w:tc>
@@ -6862,9 +7376,11 @@
             <w:tcW w:w="3256" w:type="dxa"/>
           </w:tcPr>
           <w:p>
+            <w:proofErr w:type="spellStart"/>
             <w:r>
               <w:t>ProductVersion</w:t>
             </w:r>
+            <w:proofErr w:type="spellEnd"/>
           </w:p>
         </w:tc>
         <w:tc>
@@ -6872,9 +7388,11 @@
             <w:tcW w:w="425" w:type="dxa"/>
           </w:tcPr>
           <w:p>
+            <w:proofErr w:type="spellStart"/>
             <w:r>
               <w:t>nvarchar</w:t>
             </w:r>
+            <w:proofErr w:type="spellEnd"/>
           </w:p>
         </w:tc>
         <w:tc>
@@ -6928,11 +7446,11 @@
       <w:pPr>
         <w:pStyle w:val="Heading2"/>
       </w:pPr>
-      <w:bookmarkStart w:id="6" w:name="_Toc224568271"/>
+      <w:bookmarkStart w:id="7" w:name="_Toc224651725"/>
       <w:r>
         <w:t>Greenfield Local Hub Data Dictionary</w:t>
       </w:r>
-      <w:bookmarkEnd w:id="6"/>
+      <w:bookmarkEnd w:id="7"/>
     </w:p>
     <w:p/>
     <w:p/>
@@ -6944,11 +7462,12 @@
       <w:pPr>
         <w:pStyle w:val="Heading1"/>
       </w:pPr>
-      <w:bookmarkStart w:id="7" w:name="_Toc224568272"/>
-      <w:r>
+      <w:bookmarkStart w:id="8" w:name="_Toc224651726"/>
+      <w:r>
+        <w:lastRenderedPageBreak/>
         <w:t>Test Strategy</w:t>
       </w:r>
-      <w:bookmarkEnd w:id="7"/>
+      <w:bookmarkEnd w:id="8"/>
     </w:p>
     <w:p/>
     <w:tbl>
@@ -7511,7 +8030,7 @@
 </file>
 
 <file path=word/endnotes.xml><?xml version="1.0" encoding="utf-8"?>
-<w:endnotes xmlns:wpc="http://schemas.microsoft.com/office/word/2010/wordprocessingCanvas" xmlns:cx="http://schemas.microsoft.com/office/drawing/2014/chartex" xmlns:cx1="http://schemas.microsoft.com/office/drawing/2015/9/8/chartex" xmlns:cx2="http://schemas.microsoft.com/office/drawing/2015/10/21/chartex" xmlns:cx3="http://schemas.microsoft.com/office/drawing/2016/5/9/chartex" xmlns:cx4="http://schemas.microsoft.com/office/drawing/2016/5/10/chartex" xmlns:cx5="http://schemas.microsoft.com/office/drawing/2016/5/11/chartex" xmlns:cx6="http://schemas.microsoft.com/office/drawing/2016/5/12/chartex" xmlns:cx7="http://schemas.microsoft.com/office/drawing/2016/5/13/chartex" xmlns:cx8="http://schemas.microsoft.com/office/drawing/2016/5/14/chartex" xmlns:mc="http://schemas.openxmlformats.org/markup-compatibility/2006" xmlns:aink="http://schemas.microsoft.com/office/drawing/2016/ink" xmlns:am3d="http://schemas.microsoft.com/office/drawing/2017/model3d" xmlns:o="urn:schemas-microsoft-com:office:office" xmlns:r="http://schemas.openxmlformats.org/officeDocument/2006/relationships" xmlns:m="http://schemas.openxmlformats.org/officeDocument/2006/math" xmlns:v="urn:schemas-microsoft-com:vml" xmlns:wp14="http://schemas.microsoft.com/office/word/2010/wordprocessingDrawing" xmlns:wp="http://schemas.openxmlformats.org/drawingml/2006/wordprocessingDrawing" xmlns:w10="urn:schemas-microsoft-com:office:word" xmlns:w="http://schemas.openxmlformats.org/wordprocessingml/2006/main" xmlns:w14="http://schemas.microsoft.com/office/word/2010/wordml" xmlns:w15="http://schemas.microsoft.com/office/word/2012/wordml" xmlns:w16cex="http://schemas.microsoft.com/office/word/2018/wordml/cex" xmlns:w16cid="http://schemas.microsoft.com/office/word/2016/wordml/cid" xmlns:w16="http://schemas.microsoft.com/office/word/2018/wordml" xmlns:w16sdtdh="http://schemas.microsoft.com/office/word/2020/wordml/sdtdatahash" xmlns:w16se="http://schemas.microsoft.com/office/word/2015/wordml/symex" xmlns:wpg="http://schemas.microsoft.com/office/word/2010/wordprocessingGroup" xmlns:wpi="http://schemas.microsoft.com/office/word/2010/wordprocessingInk" xmlns:wne="http://schemas.microsoft.com/office/word/2006/wordml" xmlns:wps="http://schemas.microsoft.com/office/word/2010/wordprocessingShape" mc:Ignorable="w14 w15 w16se w16cid w16 w16cex w16sdtdh wp14">
+<w:endnotes xmlns:wpc="http://schemas.microsoft.com/office/word/2010/wordprocessingCanvas" xmlns:cx="http://schemas.microsoft.com/office/drawing/2014/chartex" xmlns:cx1="http://schemas.microsoft.com/office/drawing/2015/9/8/chartex" xmlns:cx2="http://schemas.microsoft.com/office/drawing/2015/10/21/chartex" xmlns:cx3="http://schemas.microsoft.com/office/drawing/2016/5/9/chartex" xmlns:cx4="http://schemas.microsoft.com/office/drawing/2016/5/10/chartex" xmlns:cx5="http://schemas.microsoft.com/office/drawing/2016/5/11/chartex" xmlns:cx6="http://schemas.microsoft.com/office/drawing/2016/5/12/chartex" xmlns:cx7="http://schemas.microsoft.com/office/drawing/2016/5/13/chartex" xmlns:cx8="http://schemas.microsoft.com/office/drawing/2016/5/14/chartex" xmlns:mc="http://schemas.openxmlformats.org/markup-compatibility/2006" xmlns:aink="http://schemas.microsoft.com/office/drawing/2016/ink" xmlns:am3d="http://schemas.microsoft.com/office/drawing/2017/model3d" xmlns:o="urn:schemas-microsoft-com:office:office" xmlns:oel="http://schemas.microsoft.com/office/2019/extlst" xmlns:r="http://schemas.openxmlformats.org/officeDocument/2006/relationships" xmlns:m="http://schemas.openxmlformats.org/officeDocument/2006/math" xmlns:v="urn:schemas-microsoft-com:vml" xmlns:wp14="http://schemas.microsoft.com/office/word/2010/wordprocessingDrawing" xmlns:wp="http://schemas.openxmlformats.org/drawingml/2006/wordprocessingDrawing" xmlns:w10="urn:schemas-microsoft-com:office:word" xmlns:w="http://schemas.openxmlformats.org/wordprocessingml/2006/main" xmlns:w14="http://schemas.microsoft.com/office/word/2010/wordml" xmlns:w15="http://schemas.microsoft.com/office/word/2012/wordml" xmlns:w16cex="http://schemas.microsoft.com/office/word/2018/wordml/cex" xmlns:w16cid="http://schemas.microsoft.com/office/word/2016/wordml/cid" xmlns:w16="http://schemas.microsoft.com/office/word/2018/wordml" xmlns:w16du="http://schemas.microsoft.com/office/word/2023/wordml/word16du" xmlns:w16sdtdh="http://schemas.microsoft.com/office/word/2020/wordml/sdtdatahash" xmlns:w16sdtfl="http://schemas.microsoft.com/office/word/2024/wordml/sdtformatlock" xmlns:w16se="http://schemas.microsoft.com/office/word/2015/wordml/symex" xmlns:wpg="http://schemas.microsoft.com/office/word/2010/wordprocessingGroup" xmlns:wpi="http://schemas.microsoft.com/office/word/2010/wordprocessingInk" xmlns:wne="http://schemas.microsoft.com/office/word/2006/wordml" xmlns:wps="http://schemas.microsoft.com/office/word/2010/wordprocessingShape" mc:Ignorable="w14 w15 w16se w16cid w16 w16cex w16sdtdh w16sdtfl w16du wp14">
   <w:endnote w:type="separator" w:id="-1">
     <w:p>
       <w:pPr>
@@ -7536,7 +8055,7 @@
 </file>
 
 <file path=word/footnotes.xml><?xml version="1.0" encoding="utf-8"?>
-<w:footnotes xmlns:wpc="http://schemas.microsoft.com/office/word/2010/wordprocessingCanvas" xmlns:cx="http://schemas.microsoft.com/office/drawing/2014/chartex" xmlns:cx1="http://schemas.microsoft.com/office/drawing/2015/9/8/chartex" xmlns:cx2="http://schemas.microsoft.com/office/drawing/2015/10/21/chartex" xmlns:cx3="http://schemas.microsoft.com/office/drawing/2016/5/9/chartex" xmlns:cx4="http://schemas.microsoft.com/office/drawing/2016/5/10/chartex" xmlns:cx5="http://schemas.microsoft.com/office/drawing/2016/5/11/chartex" xmlns:cx6="http://schemas.microsoft.com/office/drawing/2016/5/12/chartex" xmlns:cx7="http://schemas.microsoft.com/office/drawing/2016/5/13/chartex" xmlns:cx8="http://schemas.microsoft.com/office/drawing/2016/5/14/chartex" xmlns:mc="http://schemas.openxmlformats.org/markup-compatibility/2006" xmlns:aink="http://schemas.microsoft.com/office/drawing/2016/ink" xmlns:am3d="http://schemas.microsoft.com/office/drawing/2017/model3d" xmlns:o="urn:schemas-microsoft-com:office:office" xmlns:r="http://schemas.openxmlformats.org/officeDocument/2006/relationships" xmlns:m="http://schemas.openxmlformats.org/officeDocument/2006/math" xmlns:v="urn:schemas-microsoft-com:vml" xmlns:wp14="http://schemas.microsoft.com/office/word/2010/wordprocessingDrawing" xmlns:wp="http://schemas.openxmlformats.org/drawingml/2006/wordprocessingDrawing" xmlns:w10="urn:schemas-microsoft-com:office:word" xmlns:w="http://schemas.openxmlformats.org/wordprocessingml/2006/main" xmlns:w14="http://schemas.microsoft.com/office/word/2010/wordml" xmlns:w15="http://schemas.microsoft.com/office/word/2012/wordml" xmlns:w16cex="http://schemas.microsoft.com/office/word/2018/wordml/cex" xmlns:w16cid="http://schemas.microsoft.com/office/word/2016/wordml/cid" xmlns:w16="http://schemas.microsoft.com/office/word/2018/wordml" xmlns:w16sdtdh="http://schemas.microsoft.com/office/word/2020/wordml/sdtdatahash" xmlns:w16se="http://schemas.microsoft.com/office/word/2015/wordml/symex" xmlns:wpg="http://schemas.microsoft.com/office/word/2010/wordprocessingGroup" xmlns:wpi="http://schemas.microsoft.com/office/word/2010/wordprocessingInk" xmlns:wne="http://schemas.microsoft.com/office/word/2006/wordml" xmlns:wps="http://schemas.microsoft.com/office/word/2010/wordprocessingShape" mc:Ignorable="w14 w15 w16se w16cid w16 w16cex w16sdtdh wp14">
+<w:footnotes xmlns:wpc="http://schemas.microsoft.com/office/word/2010/wordprocessingCanvas" xmlns:cx="http://schemas.microsoft.com/office/drawing/2014/chartex" xmlns:cx1="http://schemas.microsoft.com/office/drawing/2015/9/8/chartex" xmlns:cx2="http://schemas.microsoft.com/office/drawing/2015/10/21/chartex" xmlns:cx3="http://schemas.microsoft.com/office/drawing/2016/5/9/chartex" xmlns:cx4="http://schemas.microsoft.com/office/drawing/2016/5/10/chartex" xmlns:cx5="http://schemas.microsoft.com/office/drawing/2016/5/11/chartex" xmlns:cx6="http://schemas.microsoft.com/office/drawing/2016/5/12/chartex" xmlns:cx7="http://schemas.microsoft.com/office/drawing/2016/5/13/chartex" xmlns:cx8="http://schemas.microsoft.com/office/drawing/2016/5/14/chartex" xmlns:mc="http://schemas.openxmlformats.org/markup-compatibility/2006" xmlns:aink="http://schemas.microsoft.com/office/drawing/2016/ink" xmlns:am3d="http://schemas.microsoft.com/office/drawing/2017/model3d" xmlns:o="urn:schemas-microsoft-com:office:office" xmlns:oel="http://schemas.microsoft.com/office/2019/extlst" xmlns:r="http://schemas.openxmlformats.org/officeDocument/2006/relationships" xmlns:m="http://schemas.openxmlformats.org/officeDocument/2006/math" xmlns:v="urn:schemas-microsoft-com:vml" xmlns:wp14="http://schemas.microsoft.com/office/word/2010/wordprocessingDrawing" xmlns:wp="http://schemas.openxmlformats.org/drawingml/2006/wordprocessingDrawing" xmlns:w10="urn:schemas-microsoft-com:office:word" xmlns:w="http://schemas.openxmlformats.org/wordprocessingml/2006/main" xmlns:w14="http://schemas.microsoft.com/office/word/2010/wordml" xmlns:w15="http://schemas.microsoft.com/office/word/2012/wordml" xmlns:w16cex="http://schemas.microsoft.com/office/word/2018/wordml/cex" xmlns:w16cid="http://schemas.microsoft.com/office/word/2016/wordml/cid" xmlns:w16="http://schemas.microsoft.com/office/word/2018/wordml" xmlns:w16du="http://schemas.microsoft.com/office/word/2023/wordml/word16du" xmlns:w16sdtdh="http://schemas.microsoft.com/office/word/2020/wordml/sdtdatahash" xmlns:w16sdtfl="http://schemas.microsoft.com/office/word/2024/wordml/sdtformatlock" xmlns:w16se="http://schemas.microsoft.com/office/word/2015/wordml/symex" xmlns:wpg="http://schemas.microsoft.com/office/word/2010/wordprocessingGroup" xmlns:wpi="http://schemas.microsoft.com/office/word/2010/wordprocessingInk" xmlns:wne="http://schemas.microsoft.com/office/word/2006/wordml" xmlns:wps="http://schemas.microsoft.com/office/word/2010/wordprocessingShape" mc:Ignorable="w14 w15 w16se w16cid w16 w16cex w16sdtdh w16sdtfl w16du wp14">
   <w:footnote w:type="separator" w:id="-1">
     <w:p>
       <w:pPr>
@@ -7561,7 +8080,7 @@
 </file>
 
 <file path=word/styles.xml><?xml version="1.0" encoding="utf-8"?>
-<w:styles xmlns:mc="http://schemas.openxmlformats.org/markup-compatibility/2006" xmlns:r="http://schemas.openxmlformats.org/officeDocument/2006/relationships" xmlns:w="http://schemas.openxmlformats.org/wordprocessingml/2006/main" xmlns:w14="http://schemas.microsoft.com/office/word/2010/wordml" xmlns:w15="http://schemas.microsoft.com/office/word/2012/wordml" xmlns:w16cex="http://schemas.microsoft.com/office/word/2018/wordml/cex" xmlns:w16cid="http://schemas.microsoft.com/office/word/2016/wordml/cid" xmlns:w16="http://schemas.microsoft.com/office/word/2018/wordml" xmlns:w16sdtdh="http://schemas.microsoft.com/office/word/2020/wordml/sdtdatahash" xmlns:w16se="http://schemas.microsoft.com/office/word/2015/wordml/symex" mc:Ignorable="w14 w15 w16se w16cid w16 w16cex w16sdtdh">
+<w:styles xmlns:mc="http://schemas.openxmlformats.org/markup-compatibility/2006" xmlns:r="http://schemas.openxmlformats.org/officeDocument/2006/relationships" xmlns:w="http://schemas.openxmlformats.org/wordprocessingml/2006/main" xmlns:w14="http://schemas.microsoft.com/office/word/2010/wordml" xmlns:w15="http://schemas.microsoft.com/office/word/2012/wordml" xmlns:w16cex="http://schemas.microsoft.com/office/word/2018/wordml/cex" xmlns:w16cid="http://schemas.microsoft.com/office/word/2016/wordml/cid" xmlns:w16="http://schemas.microsoft.com/office/word/2018/wordml" xmlns:w16du="http://schemas.microsoft.com/office/word/2023/wordml/word16du" xmlns:w16sdtdh="http://schemas.microsoft.com/office/word/2020/wordml/sdtdatahash" xmlns:w16sdtfl="http://schemas.microsoft.com/office/word/2024/wordml/sdtformatlock" xmlns:w16se="http://schemas.microsoft.com/office/word/2015/wordml/symex" mc:Ignorable="w14 w15 w16se w16cid w16 w16cex w16sdtdh w16sdtfl w16du">
   <w:docDefaults>
     <w:rPrDefault>
       <w:rPr>
@@ -8005,7 +8524,6 @@
   <w:style w:type="character" w:default="1" w:styleId="DefaultParagraphFont">
     <w:name w:val="Default Paragraph Font"/>
     <w:uiPriority w:val="1"/>
-    <w:semiHidden/>
     <w:unhideWhenUsed/>
   </w:style>
   <w:style w:type="table" w:default="1" w:styleId="TableNormal">
@@ -8280,7 +8798,7 @@
 </file>
 
 <file path=word/glossary/document.xml><?xml version="1.0" encoding="utf-8"?>
-<w:glossaryDocument xmlns:wpc="http://schemas.microsoft.com/office/word/2010/wordprocessingCanvas" xmlns:cx="http://schemas.microsoft.com/office/drawing/2014/chartex" xmlns:cx1="http://schemas.microsoft.com/office/drawing/2015/9/8/chartex" xmlns:cx2="http://schemas.microsoft.com/office/drawing/2015/10/21/chartex" xmlns:cx3="http://schemas.microsoft.com/office/drawing/2016/5/9/chartex" xmlns:cx4="http://schemas.microsoft.com/office/drawing/2016/5/10/chartex" xmlns:cx5="http://schemas.microsoft.com/office/drawing/2016/5/11/chartex" xmlns:cx6="http://schemas.microsoft.com/office/drawing/2016/5/12/chartex" xmlns:cx7="http://schemas.microsoft.com/office/drawing/2016/5/13/chartex" xmlns:cx8="http://schemas.microsoft.com/office/drawing/2016/5/14/chartex" xmlns:mc="http://schemas.openxmlformats.org/markup-compatibility/2006" xmlns:aink="http://schemas.microsoft.com/office/drawing/2016/ink" xmlns:am3d="http://schemas.microsoft.com/office/drawing/2017/model3d" xmlns:o="urn:schemas-microsoft-com:office:office" xmlns:r="http://schemas.openxmlformats.org/officeDocument/2006/relationships" xmlns:m="http://schemas.openxmlformats.org/officeDocument/2006/math" xmlns:v="urn:schemas-microsoft-com:vml" xmlns:wp14="http://schemas.microsoft.com/office/word/2010/wordprocessingDrawing" xmlns:wp="http://schemas.openxmlformats.org/drawingml/2006/wordprocessingDrawing" xmlns:w10="urn:schemas-microsoft-com:office:word" xmlns:w="http://schemas.openxmlformats.org/wordprocessingml/2006/main" xmlns:w14="http://schemas.microsoft.com/office/word/2010/wordml" xmlns:w15="http://schemas.microsoft.com/office/word/2012/wordml" xmlns:w16cex="http://schemas.microsoft.com/office/word/2018/wordml/cex" xmlns:w16cid="http://schemas.microsoft.com/office/word/2016/wordml/cid" xmlns:w16="http://schemas.microsoft.com/office/word/2018/wordml" xmlns:w16sdtdh="http://schemas.microsoft.com/office/word/2020/wordml/sdtdatahash" xmlns:w16se="http://schemas.microsoft.com/office/word/2015/wordml/symex" xmlns:wpg="http://schemas.microsoft.com/office/word/2010/wordprocessingGroup" xmlns:wpi="http://schemas.microsoft.com/office/word/2010/wordprocessingInk" xmlns:wne="http://schemas.microsoft.com/office/word/2006/wordml" xmlns:wps="http://schemas.microsoft.com/office/word/2010/wordprocessingShape" mc:Ignorable="w14 w15 w16se w16cid w16 w16cex w16sdtdh wp14">
+<w:glossaryDocument xmlns:wpc="http://schemas.microsoft.com/office/word/2010/wordprocessingCanvas" xmlns:cx="http://schemas.microsoft.com/office/drawing/2014/chartex" xmlns:cx1="http://schemas.microsoft.com/office/drawing/2015/9/8/chartex" xmlns:cx2="http://schemas.microsoft.com/office/drawing/2015/10/21/chartex" xmlns:cx3="http://schemas.microsoft.com/office/drawing/2016/5/9/chartex" xmlns:cx4="http://schemas.microsoft.com/office/drawing/2016/5/10/chartex" xmlns:cx5="http://schemas.microsoft.com/office/drawing/2016/5/11/chartex" xmlns:cx6="http://schemas.microsoft.com/office/drawing/2016/5/12/chartex" xmlns:cx7="http://schemas.microsoft.com/office/drawing/2016/5/13/chartex" xmlns:cx8="http://schemas.microsoft.com/office/drawing/2016/5/14/chartex" xmlns:mc="http://schemas.openxmlformats.org/markup-compatibility/2006" xmlns:aink="http://schemas.microsoft.com/office/drawing/2016/ink" xmlns:am3d="http://schemas.microsoft.com/office/drawing/2017/model3d" xmlns:o="urn:schemas-microsoft-com:office:office" xmlns:oel="http://schemas.microsoft.com/office/2019/extlst" xmlns:r="http://schemas.openxmlformats.org/officeDocument/2006/relationships" xmlns:m="http://schemas.openxmlformats.org/officeDocument/2006/math" xmlns:v="urn:schemas-microsoft-com:vml" xmlns:wp14="http://schemas.microsoft.com/office/word/2010/wordprocessingDrawing" xmlns:wp="http://schemas.openxmlformats.org/drawingml/2006/wordprocessingDrawing" xmlns:w10="urn:schemas-microsoft-com:office:word" xmlns:w="http://schemas.openxmlformats.org/wordprocessingml/2006/main" xmlns:w14="http://schemas.microsoft.com/office/word/2010/wordml" xmlns:w15="http://schemas.microsoft.com/office/word/2012/wordml" xmlns:w16cex="http://schemas.microsoft.com/office/word/2018/wordml/cex" xmlns:w16cid="http://schemas.microsoft.com/office/word/2016/wordml/cid" xmlns:w16="http://schemas.microsoft.com/office/word/2018/wordml" xmlns:w16du="http://schemas.microsoft.com/office/word/2023/wordml/word16du" xmlns:w16sdtdh="http://schemas.microsoft.com/office/word/2020/wordml/sdtdatahash" xmlns:w16sdtfl="http://schemas.microsoft.com/office/word/2024/wordml/sdtformatlock" xmlns:w16se="http://schemas.microsoft.com/office/word/2015/wordml/symex" xmlns:wpg="http://schemas.microsoft.com/office/word/2010/wordprocessingGroup" xmlns:wpi="http://schemas.microsoft.com/office/word/2010/wordprocessingInk" xmlns:wne="http://schemas.microsoft.com/office/word/2006/wordml" xmlns:wps="http://schemas.microsoft.com/office/word/2010/wordprocessingShape" mc:Ignorable="w14 w15 w16se w16cid w16 w16cex w16sdtdh w16sdtfl w16du wp14">
   <w:docParts>
     <w:docPart>
       <w:docPartPr>
@@ -8306,7 +8824,7 @@
             <w:rPr>
               <w:rFonts w:asciiTheme="majorHAnsi" w:eastAsiaTheme="majorEastAsia" w:hAnsiTheme="majorHAnsi" w:cstheme="majorBidi"/>
               <w:caps/>
-              <w:color w:val="4472C4" w:themeColor="accent1"/>
+              <w:color w:val="156082" w:themeColor="accent1"/>
               <w:sz w:val="80"/>
               <w:szCs w:val="80"/>
             </w:rPr>
@@ -8337,7 +8855,7 @@
           </w:pPr>
           <w:r>
             <w:rPr>
-              <w:color w:val="4472C4" w:themeColor="accent1"/>
+              <w:color w:val="156082" w:themeColor="accent1"/>
               <w:sz w:val="28"/>
               <w:szCs w:val="28"/>
             </w:rPr>
@@ -8351,7 +8869,7 @@
 </file>
 
 <file path=word/glossary/fontTable.xml><?xml version="1.0" encoding="utf-8"?>
-<w:fonts xmlns:mc="http://schemas.openxmlformats.org/markup-compatibility/2006" xmlns:r="http://schemas.openxmlformats.org/officeDocument/2006/relationships" xmlns:w="http://schemas.openxmlformats.org/wordprocessingml/2006/main" xmlns:w14="http://schemas.microsoft.com/office/word/2010/wordml" xmlns:w15="http://schemas.microsoft.com/office/word/2012/wordml" xmlns:w16cex="http://schemas.microsoft.com/office/word/2018/wordml/cex" xmlns:w16cid="http://schemas.microsoft.com/office/word/2016/wordml/cid" xmlns:w16="http://schemas.microsoft.com/office/word/2018/wordml" xmlns:w16sdtdh="http://schemas.microsoft.com/office/word/2020/wordml/sdtdatahash" xmlns:w16se="http://schemas.microsoft.com/office/word/2015/wordml/symex" mc:Ignorable="w14 w15 w16se w16cid w16 w16cex w16sdtdh">
+<w:fonts xmlns:mc="http://schemas.openxmlformats.org/markup-compatibility/2006" xmlns:r="http://schemas.openxmlformats.org/officeDocument/2006/relationships" xmlns:w="http://schemas.openxmlformats.org/wordprocessingml/2006/main" xmlns:w14="http://schemas.microsoft.com/office/word/2010/wordml" xmlns:w15="http://schemas.microsoft.com/office/word/2012/wordml" xmlns:w16cex="http://schemas.microsoft.com/office/word/2018/wordml/cex" xmlns:w16cid="http://schemas.microsoft.com/office/word/2016/wordml/cid" xmlns:w16="http://schemas.microsoft.com/office/word/2018/wordml" xmlns:w16du="http://schemas.microsoft.com/office/word/2023/wordml/word16du" xmlns:w16sdtdh="http://schemas.microsoft.com/office/word/2020/wordml/sdtdatahash" xmlns:w16sdtfl="http://schemas.microsoft.com/office/word/2024/wordml/sdtformatlock" xmlns:w16se="http://schemas.microsoft.com/office/word/2015/wordml/symex" mc:Ignorable="w14 w15 w16se w16cid w16 w16cex w16sdtdh w16sdtfl w16du">
   <w:font w:name="Calibri">
     <w:panose1 w:val="020F0502020204030204"/>
     <w:charset w:val="00"/>
@@ -8380,11 +8898,23 @@
     <w:pitch w:val="variable"/>
     <w:sig w:usb0="E0002EFF" w:usb1="C000785B" w:usb2="00000009" w:usb3="00000000" w:csb0="000001FF" w:csb1="00000000"/>
   </w:font>
+  <w:font w:name="Aptos">
+    <w:charset w:val="00"/>
+    <w:family w:val="swiss"/>
+    <w:pitch w:val="variable"/>
+    <w:sig w:usb0="20000287" w:usb1="00000003" w:usb2="00000000" w:usb3="00000000" w:csb0="0000019F" w:csb1="00000000"/>
+  </w:font>
+  <w:font w:name="Aptos Display">
+    <w:charset w:val="00"/>
+    <w:family w:val="swiss"/>
+    <w:pitch w:val="variable"/>
+    <w:sig w:usb0="20000287" w:usb1="00000003" w:usb2="00000000" w:usb3="00000000" w:csb0="0000019F" w:csb1="00000000"/>
+  </w:font>
 </w:fonts>
 </file>
 
 <file path=word/glossary/settings.xml><?xml version="1.0" encoding="utf-8"?>
-<w:settings xmlns:mc="http://schemas.openxmlformats.org/markup-compatibility/2006" xmlns:o="urn:schemas-microsoft-com:office:office" xmlns:r="http://schemas.openxmlformats.org/officeDocument/2006/relationships" xmlns:m="http://schemas.openxmlformats.org/officeDocument/2006/math" xmlns:v="urn:schemas-microsoft-com:vml" xmlns:w10="urn:schemas-microsoft-com:office:word" xmlns:w="http://schemas.openxmlformats.org/wordprocessingml/2006/main" xmlns:w14="http://schemas.microsoft.com/office/word/2010/wordml" xmlns:w15="http://schemas.microsoft.com/office/word/2012/wordml" xmlns:w16cex="http://schemas.microsoft.com/office/word/2018/wordml/cex" xmlns:w16cid="http://schemas.microsoft.com/office/word/2016/wordml/cid" xmlns:w16="http://schemas.microsoft.com/office/word/2018/wordml" xmlns:w16sdtdh="http://schemas.microsoft.com/office/word/2020/wordml/sdtdatahash" xmlns:w16se="http://schemas.microsoft.com/office/word/2015/wordml/symex" xmlns:sl="http://schemas.openxmlformats.org/schemaLibrary/2006/main" mc:Ignorable="w14 w15 w16se w16cid w16 w16cex w16sdtdh">
+<w:settings xmlns:mc="http://schemas.openxmlformats.org/markup-compatibility/2006" xmlns:o="urn:schemas-microsoft-com:office:office" xmlns:r="http://schemas.openxmlformats.org/officeDocument/2006/relationships" xmlns:m="http://schemas.openxmlformats.org/officeDocument/2006/math" xmlns:v="urn:schemas-microsoft-com:vml" xmlns:w10="urn:schemas-microsoft-com:office:word" xmlns:w="http://schemas.openxmlformats.org/wordprocessingml/2006/main" xmlns:w14="http://schemas.microsoft.com/office/word/2010/wordml" xmlns:w15="http://schemas.microsoft.com/office/word/2012/wordml" xmlns:w16cex="http://schemas.microsoft.com/office/word/2018/wordml/cex" xmlns:w16cid="http://schemas.microsoft.com/office/word/2016/wordml/cid" xmlns:w16="http://schemas.microsoft.com/office/word/2018/wordml" xmlns:w16du="http://schemas.microsoft.com/office/word/2023/wordml/word16du" xmlns:w16sdtdh="http://schemas.microsoft.com/office/word/2020/wordml/sdtdatahash" xmlns:w16sdtfl="http://schemas.microsoft.com/office/word/2024/wordml/sdtformatlock" xmlns:w16se="http://schemas.microsoft.com/office/word/2015/wordml/symex" xmlns:sl="http://schemas.openxmlformats.org/schemaLibrary/2006/main" mc:Ignorable="w14 w15 w16se w16cid w16 w16cex w16sdtdh w16sdtfl w16du">
   <w:view w:val="normal"/>
   <w:defaultTabStop w:val="720"/>
   <w:characterSpacingControl w:val="doNotCompress"/>
@@ -8400,6 +8930,8 @@
   <w:rsids>
     <w:rsidRoot w:val="00033BC2"/>
     <w:rsid w:val="00033BC2"/>
+    <w:rsid w:val="000D0299"/>
+    <w:rsid w:val="00303619"/>
     <w:rsid w:val="00436BE1"/>
     <w:rsid w:val="00475F2D"/>
     <w:rsid w:val="00516727"/>
@@ -8430,7 +8962,7 @@
 </file>
 
 <file path=word/glossary/styles.xml><?xml version="1.0" encoding="utf-8"?>
-<w:styles xmlns:mc="http://schemas.openxmlformats.org/markup-compatibility/2006" xmlns:r="http://schemas.openxmlformats.org/officeDocument/2006/relationships" xmlns:w="http://schemas.openxmlformats.org/wordprocessingml/2006/main" xmlns:w14="http://schemas.microsoft.com/office/word/2010/wordml" xmlns:w15="http://schemas.microsoft.com/office/word/2012/wordml" xmlns:w16cex="http://schemas.microsoft.com/office/word/2018/wordml/cex" xmlns:w16cid="http://schemas.microsoft.com/office/word/2016/wordml/cid" xmlns:w16="http://schemas.microsoft.com/office/word/2018/wordml" xmlns:w16sdtdh="http://schemas.microsoft.com/office/word/2020/wordml/sdtdatahash" xmlns:w16se="http://schemas.microsoft.com/office/word/2015/wordml/symex" mc:Ignorable="w14 w15 w16se w16cid w16 w16cex w16sdtdh">
+<w:styles xmlns:mc="http://schemas.openxmlformats.org/markup-compatibility/2006" xmlns:r="http://schemas.openxmlformats.org/officeDocument/2006/relationships" xmlns:w="http://schemas.openxmlformats.org/wordprocessingml/2006/main" xmlns:w14="http://schemas.microsoft.com/office/word/2010/wordml" xmlns:w15="http://schemas.microsoft.com/office/word/2012/wordml" xmlns:w16cex="http://schemas.microsoft.com/office/word/2018/wordml/cex" xmlns:w16cid="http://schemas.microsoft.com/office/word/2016/wordml/cid" xmlns:w16="http://schemas.microsoft.com/office/word/2018/wordml" xmlns:w16du="http://schemas.microsoft.com/office/word/2023/wordml/word16du" xmlns:w16sdtdh="http://schemas.microsoft.com/office/word/2020/wordml/sdtdatahash" xmlns:w16sdtfl="http://schemas.microsoft.com/office/word/2024/wordml/sdtformatlock" xmlns:w16se="http://schemas.microsoft.com/office/word/2015/wordml/symex" mc:Ignorable="w14 w15 w16se w16cid w16 w16cex w16sdtdh w16sdtfl w16du">
   <w:docDefaults>
     <w:rPrDefault>
       <w:rPr>
@@ -8867,7 +9399,7 @@
 </file>
 
 <file path=word/glossary/webSettings.xml><?xml version="1.0" encoding="utf-8"?>
-<w:webSettings xmlns:mc="http://schemas.openxmlformats.org/markup-compatibility/2006" xmlns:r="http://schemas.openxmlformats.org/officeDocument/2006/relationships" xmlns:w="http://schemas.openxmlformats.org/wordprocessingml/2006/main" xmlns:w14="http://schemas.microsoft.com/office/word/2010/wordml" xmlns:w15="http://schemas.microsoft.com/office/word/2012/wordml" xmlns:w16cex="http://schemas.microsoft.com/office/word/2018/wordml/cex" xmlns:w16cid="http://schemas.microsoft.com/office/word/2016/wordml/cid" xmlns:w16="http://schemas.microsoft.com/office/word/2018/wordml" xmlns:w16sdtdh="http://schemas.microsoft.com/office/word/2020/wordml/sdtdatahash" xmlns:w16se="http://schemas.microsoft.com/office/word/2015/wordml/symex" mc:Ignorable="w14 w15 w16se w16cid w16 w16cex w16sdtdh">
+<w:webSettings xmlns:mc="http://schemas.openxmlformats.org/markup-compatibility/2006" xmlns:r="http://schemas.openxmlformats.org/officeDocument/2006/relationships" xmlns:w="http://schemas.openxmlformats.org/wordprocessingml/2006/main" xmlns:w14="http://schemas.microsoft.com/office/word/2010/wordml" xmlns:w15="http://schemas.microsoft.com/office/word/2012/wordml" xmlns:w16cex="http://schemas.microsoft.com/office/word/2018/wordml/cex" xmlns:w16cid="http://schemas.microsoft.com/office/word/2016/wordml/cid" xmlns:w16="http://schemas.microsoft.com/office/word/2018/wordml" xmlns:w16du="http://schemas.microsoft.com/office/word/2023/wordml/word16du" xmlns:w16sdtdh="http://schemas.microsoft.com/office/word/2020/wordml/sdtdatahash" xmlns:w16sdtfl="http://schemas.microsoft.com/office/word/2024/wordml/sdtformatlock" xmlns:w16se="http://schemas.microsoft.com/office/word/2015/wordml/symex" mc:Ignorable="w14 w15 w16se w16cid w16 w16cex w16sdtdh w16sdtfl w16du">
   <w:optimizeForBrowser/>
   <w:allowPNG/>
 </w:webSettings>

</xml_diff>